<commit_message>
[V1-RUNBOOK-001] refresh owner completion guide
</commit_message>
<xml_diff>
--- a/docs/GODFIN_OWNER_COMPLETION_RUNBOOK.docx
+++ b/docs/GODFIN_OWNER_COMPLETION_RUNBOOK.docx
@@ -64,13 +64,14 @@
           <w:color w:val="667085"/>
           <w:sz w:val="20"/>
         </w:rPr>
-        <w:t>Version 2.6  •  16 August 2026  •  oculusrex14/GODFIN (private)</w:t>
+        <w:t>Version 2.7  •  24 August 2026  •  oculusrex14/GODFIN (private)</w:t>
         <w:br/>
         <w:t>Production branch: codex/godfin-production-v5</w:t>
       </w:r>
     </w:p>
     <w:p>
       <w:pPr>
+        <w:keepLines/>
         <w:spacing w:before="100" w:after="160" w:line="288" w:lineRule="auto"/>
         <w:ind w:left="115" w:right="115"/>
         <w:shd w:fill="FDECEC"/>
@@ -198,6 +199,7 @@
     </w:p>
     <w:p>
       <w:pPr>
+        <w:keepLines/>
         <w:spacing w:before="100" w:after="160" w:line="288" w:lineRule="auto"/>
         <w:ind w:left="115" w:right="115"/>
         <w:shd w:fill="EAF7EF"/>
@@ -220,7 +222,7 @@
           <w:color w:val="172033"/>
           <w:sz w:val="21"/>
         </w:rPr>
-        <w:t>Production remediation is tracked on the private v5 branch. The clean Python 3.12 baseline is 883 passing backend tests. All 182 API operations publish an explicit success or intentional terminal status, a non-empty media-specific success schema, and the shared error contract. Frontend lint, accessibility, authentication, and production builds pass; five executable Cashfree contract tests and the website production build pass; desktop release/update tests pass 12/12; and package privacy checks pass 7/7.</w:t>
+        <w:t>Production remediation is tracked on the private v5 branch. The clean Python 3.12 baseline is 960 passing backend tests. All 182 API operations publish an explicit success or intentional terminal status, a non-empty media-specific success schema, and the shared error contract. Frontend lint, accessibility, authentication, and production builds pass; five Cashfree payment tests, three lifetime-upgrade tests, the website production build, 12 desktop release/update tests, and seven package-privacy tests pass.</w:t>
       </w:r>
     </w:p>
     <w:p>
@@ -256,7 +258,7 @@
         </w:numPr>
       </w:pPr>
       <w:r>
-        <w:t>Supabase project: GODFIN (ap-south-1). Local ordered migrations now run through 0006; migration 0006 adds provider-neutral Cashfree purchase/event fields and replay-safe Cashfree provisioning without deleting legacy purchase history. Remote application and pgTAP evidence remain required.</w:t>
+        <w:t>Supabase project: GODFIN (ap-south-1). Local ordered migrations now run through 0007. Migration 0006 adds provider-neutral Cashfree purchase/event fields and replay-safe provisioning; migration 0007 adds in-place Free-to-Pro, Free-to-Max, and Pro-to-Max lifetime upgrades while preserving the license identity and device activations. Remote application and pgTAP evidence remain required.</w:t>
       </w:r>
     </w:p>
     <w:p>
@@ -292,7 +294,7 @@
         </w:numPr>
       </w:pPr>
       <w:r>
-        <w:t>The website product tour uses real React application captures generated only from synthetic data, muted WebM/MP4 media with reduced-motion fallbacks, and build-time checks that prevent unreleased features from being advertised. The current public deployment is reachable at godfin.dev; the Cashfree code update must remain a preview until migration 0006 and provider tests pass.</w:t>
+        <w:t>The website product tour uses real React application captures generated only from synthetic data, muted WebM/MP4 media with reduced-motion fallbacks, and build-time checks that prevent unreleased features from being advertised. godfin.dev is the final canonical domain and godfin.vercel.app is the fallback. The exact 5fbfe92 website candidate must remain a preview until migrations 0006 and 0007 plus provider tests pass.</w:t>
       </w:r>
     </w:p>
     <w:p>
@@ -376,7 +378,7 @@
         </w:numPr>
       </w:pPr>
       <w:r>
-        <w:t>A fresh local macOS arm64 package was built from repository commit ea76be1, containing Gmail restart fix 8dce936, using the locked toolchain. It starts in 3.376 seconds on first launch and 1.229 seconds on restart, preserves its database, enforces the local trust and maintenance boundaries, and remains below the 700 MB idle-memory budget at 607 MB across five processes. The private DMG SHA-256 is 2b68a8245c5c622f2def9b364eca6864eb3a1f58192a75032dcd8c50f2c65937 and the ZIP SHA-256 is 59cfcf718772a1b5a59064a0e9b66b9a20ed7d22182fed7d3bcc3122f7e56a9d. This is an ad-hoc local test signature, not an Apple-notarized customer release.</w:t>
+        <w:t>A fresh local macOS arm64 package was built and installed from repository commit 5fbfe926658783db503bd1ad5fd503acd5b96ee1 using the locked toolchain. It starts in 2.898 seconds on first launch and 1.034 seconds on restart, preserves its database, auto-starts the bundled local backend, enforces the local trust and maintenance boundaries, and remains below the 700 MB idle-memory budget at 603 MB across five processes. The private DMG SHA-256 is a37edb2a0f9c68c27184f1d8a7f3eb19834b15b23657bbf5e5389c760593d043 and the ZIP SHA-256 is 0838f004dd58b3b825c71ce6b69588b43c05f1b378e108fe24356a9d81535ab4. This is an ad-hoc local test signature, not an Apple-notarized customer release.</w:t>
       </w:r>
     </w:p>
     <w:p>
@@ -400,7 +402,7 @@
         </w:numPr>
       </w:pPr>
       <w:r>
-        <w:t>Repository evidence is current through commit 9e355bf on codex/godfin-production-v5. Cashfree, canonical-domain, Gmail callback, credential-restart, browser-matrix, and bounded-job changes are pushed privately; this v2.6 runbook is the next documentation-only commit.</w:t>
+        <w:t>Repository evidence is current through commit 5fbfe92 on codex/godfin-production-v5. The GitHub repository is verified PRIVATE and the exact commit is pushed. Entitlements, Cashfree lifetime upgrades, canonical-domain defaults, Gmail callback recovery, and deterministic transaction enrichment are included.</w:t>
       </w:r>
     </w:p>
     <w:p>
@@ -412,7 +414,7 @@
         </w:numPr>
       </w:pPr>
       <w:r>
-        <w:t>The private desktop Gmail flow is complete: the exact external-browser callback reaches the OAuth handler while ordinary routes still require the per-launch secret; owner consent succeeded; the first sync processed 718 messages and created 158 transactions; and persisted credentials now reload after a complete desktop/backend restart. naraharikripa14@gmail.com is also listed as a Google test user.</w:t>
+        <w:t>Desktop Gmail source recovery is installed: the exact external-browser callback reaches the OAuth handler instead of MISSING_LAUNCH_TRUST while ordinary routes still require the per-launch secret. The owner must now start a completely fresh Connect Gmail attempt; an old callback tab or stale OAuth state cannot be reused. oculusrexai@gmail.com and naraharikripa14@gmail.com are the intended Google test users. Connected status, first sync, restart, and reauthorization must be re-evidenced before this gate is marked complete.</w:t>
       </w:r>
     </w:p>
     <w:p>
@@ -424,7 +426,7 @@
         </w:numPr>
       </w:pPr>
       <w:r>
-        <w:t>Public Gmail consent-screen review, Cashfree KYC/sandbox/live tests, Supabase migration 0006 deployment, Resend DNS, Google/Supabase canonical redirect updates, Apple/Windows certificates, R2, cross-platform clean-system evidence, dependency-license approval, GitHub Actions billing, and public-launch authorization are not yet complete.</w:t>
+        <w:t>The local database upgraded from schema revision 21 to 22 with automatic pre-migration backup godfin_backup_20260824_034907_983690_e24b194b5f24.db. Integrity and foreign-key checks pass, and 100 reviewed canonical public-brand merchant aliases are indexed locally. The 24-partition synthetic enrichment benchmark reports 100% semantic accuracy, safety precision, UNKNOWN abstention, merchant auto-accept precision, relationship precision/recall, and balance-control accuracy, with approximately 1 ms p95 enrichment latency.</w:t>
       </w:r>
     </w:p>
     <w:p>
@@ -436,7 +438,7 @@
         </w:numPr>
       </w:pPr>
       <w:r>
-        <w:t>Reward pilot, sponsor card, PPP checkout, and OpenDataLoader shipping remain safely feature-gated where applicable.</w:t>
+        <w:t>Public Gmail consent-screen review, Cashfree KYC/sandbox/live tests, Supabase migrations 0006 and 0007 deployment, Resend/DNS, final Google/Supabase canonical redirect verification, Apple/Windows certificates, R2, cross-platform clean-system evidence, dependency-license approval, GitHub Actions billing, exact-SHA Vercel deployment, and public-launch authorization are not yet complete.</w:t>
       </w:r>
     </w:p>
     <w:p>
@@ -448,17 +450,13 @@
         </w:numPr>
       </w:pPr>
       <w:r>
-        <w:t>Nothing in this document authorizes a public release. Phase 6 starts only after explicit written public-launch authorization.</w:t>
-      </w:r>
-    </w:p>
-    <w:p>
-      <w:r>
-        <w:br w:type="page"/>
+        <w:t>Reward pilot, sponsor card, PPP checkout, and OpenDataLoader shipping remain safely feature-gated where applicable.</w:t>
       </w:r>
     </w:p>
     <w:p>
       <w:pPr>
         <w:pStyle w:val="Heading1"/>
+        <w:pageBreakBefore/>
       </w:pPr>
       <w:r>
         <w:t>Critical path and blockers</w:t>
@@ -592,6 +590,9 @@
         </w:tc>
       </w:tr>
       <w:tr>
+        <w:trPr>
+          <w:cantSplit/>
+        </w:trPr>
         <w:tc>
           <w:tcPr>
             <w:tcW w:type="dxa" w:w="1500"/>
@@ -694,6 +695,9 @@
         </w:tc>
       </w:tr>
       <w:tr>
+        <w:trPr>
+          <w:cantSplit/>
+        </w:trPr>
         <w:tc>
           <w:tcPr>
             <w:tcW w:type="dxa" w:w="1500"/>
@@ -796,6 +800,9 @@
         </w:tc>
       </w:tr>
       <w:tr>
+        <w:trPr>
+          <w:cantSplit/>
+        </w:trPr>
         <w:tc>
           <w:tcPr>
             <w:tcW w:type="dxa" w:w="1500"/>
@@ -842,7 +849,7 @@
                 <w:color w:val="172033"/>
                 <w:sz w:val="18"/>
               </w:rPr>
-              <w:t>Repository integration exists; KYC, credentials, webhook, and sandbox evidence are absent.</w:t>
+              <w:t>Repository integration and local contracts exist; KYC, credentials, webhook, hosted migrations, and sandbox evidence are absent.</w:t>
             </w:r>
           </w:p>
         </w:tc>
@@ -867,7 +874,7 @@
                 <w:color w:val="172033"/>
                 <w:sz w:val="18"/>
               </w:rPr>
-              <w:t>Complete KYC; configure sandbox keys and all required webhook events.</w:t>
+              <w:t>Complete KYC; apply migrations 0006/0007; configure sandbox keys and required webhook events.</w:t>
             </w:r>
           </w:p>
         </w:tc>
@@ -892,12 +899,15 @@
                 <w:color w:val="172033"/>
                 <w:sz w:val="18"/>
               </w:rPr>
-              <w:t>Replay-safe purchase, refund, dispute, and email flows pass.</w:t>
+              <w:t>Replay-safe purchase, upgrade, refund, dispute, and email flows pass.</w:t>
             </w:r>
           </w:p>
         </w:tc>
       </w:tr>
       <w:tr>
+        <w:trPr>
+          <w:cantSplit/>
+        </w:trPr>
         <w:tc>
           <w:tcPr>
             <w:tcW w:type="dxa" w:w="1500"/>
@@ -1000,6 +1010,9 @@
         </w:tc>
       </w:tr>
       <w:tr>
+        <w:trPr>
+          <w:cantSplit/>
+        </w:trPr>
         <w:tc>
           <w:tcPr>
             <w:tcW w:type="dxa" w:w="1500"/>
@@ -1102,6 +1115,9 @@
         </w:tc>
       </w:tr>
       <w:tr>
+        <w:trPr>
+          <w:cantSplit/>
+        </w:trPr>
         <w:tc>
           <w:tcPr>
             <w:tcW w:type="dxa" w:w="1500"/>
@@ -1204,6 +1220,9 @@
         </w:tc>
       </w:tr>
       <w:tr>
+        <w:trPr>
+          <w:cantSplit/>
+        </w:trPr>
         <w:tc>
           <w:tcPr>
             <w:tcW w:type="dxa" w:w="1500"/>
@@ -1306,6 +1325,9 @@
         </w:tc>
       </w:tr>
       <w:tr>
+        <w:trPr>
+          <w:cantSplit/>
+        </w:trPr>
         <w:tc>
           <w:tcPr>
             <w:tcW w:type="dxa" w:w="1500"/>
@@ -1408,6 +1430,9 @@
         </w:tc>
       </w:tr>
       <w:tr>
+        <w:trPr>
+          <w:cantSplit/>
+        </w:trPr>
         <w:tc>
           <w:tcPr>
             <w:tcW w:type="dxa" w:w="1500"/>
@@ -1510,6 +1535,9 @@
         </w:tc>
       </w:tr>
       <w:tr>
+        <w:trPr>
+          <w:cantSplit/>
+        </w:trPr>
         <w:tc>
           <w:tcPr>
             <w:tcW w:type="dxa" w:w="1500"/>
@@ -1632,6 +1660,7 @@
     </w:p>
     <w:p>
       <w:pPr>
+        <w:keepLines/>
         <w:spacing w:before="100" w:after="160" w:line="288" w:lineRule="auto"/>
         <w:ind w:left="115" w:right="115"/>
         <w:shd w:fill="E8EEF5"/>
@@ -1667,6 +1696,7 @@
     </w:p>
     <w:p>
       <w:pPr>
+        <w:keepLines/>
         <w:spacing w:before="100" w:after="160" w:line="288" w:lineRule="auto"/>
         <w:ind w:left="115" w:right="115"/>
         <w:shd w:fill="EAF7EF"/>
@@ -1928,6 +1958,7 @@
     </w:p>
     <w:p>
       <w:pPr>
+        <w:keepLines/>
         <w:spacing w:before="100" w:after="160" w:line="288" w:lineRule="auto"/>
         <w:ind w:left="115" w:right="115"/>
         <w:shd w:fill="EAF7EF"/>
@@ -2010,6 +2041,7 @@
     </w:p>
     <w:p>
       <w:pPr>
+        <w:keepLines/>
         <w:spacing w:before="100" w:after="160" w:line="288" w:lineRule="auto"/>
         <w:ind w:left="115" w:right="115"/>
         <w:shd w:fill="FFF4D8"/>
@@ -2037,6 +2069,7 @@
     </w:p>
     <w:p>
       <w:pPr>
+        <w:keepLines/>
         <w:spacing w:before="100" w:after="160" w:line="288" w:lineRule="auto"/>
         <w:ind w:left="115" w:right="115"/>
         <w:shd w:fill="E8EEF5"/>
@@ -2059,7 +2092,7 @@
           <w:color w:val="172033"/>
           <w:sz w:val="21"/>
         </w:rPr>
-        <w:t>Fully quit GODFIN, reopen /Applications/GODFIN.app, and begin a fresh Connect Gmail attempt from Settings. Do not reuse or refresh an old Google callback tab. Builds at commit 1e3f160 or later allow only the exact 127.0.0.1 Gmail callback through this boundary; every ordinary backend route still requires the active desktop launch secret.</w:t>
+        <w:t>Fully quit GODFIN, reopen /Applications/GODFIN.app, and begin a fresh Connect Gmail attempt from Settings. Do not reuse or refresh an old Google callback tab. Installed commit 5fbfe92 allows only the exact 127.0.0.1 Gmail callback through this boundary; every ordinary backend route still requires the active desktop launch secret.</w:t>
       </w:r>
     </w:p>
     <w:p>
@@ -2131,7 +2164,7 @@
         </w:numPr>
       </w:pPr>
       <w:r>
-        <w:t>Start GODFIN, open Settings, choose Connect Gmail, and review the Google consent screen. It must show read-only Gmail access and no send, modify, delete, contacts, Drive, calendar, or broad Google account scope.</w:t>
+        <w:t>Start GODFIN, open Settings, choose Connect Gmail, and select either listed test user. Review the Google consent screen. It must show read-only Gmail access and no send, modify, delete, contacts, Drive, calendar, or broad Google account scope.</w:t>
       </w:r>
     </w:p>
     <w:p>
@@ -2167,7 +2200,19 @@
         </w:numPr>
       </w:pPr>
       <w:r>
-        <w:t>If Google keeps the app in Testing, add each intended test mailbox as a test user and record the expiry/re-consent implications. Complete Google verification before inviting general customers if the provider requires it for the read-only scope.</w:t>
+        <w:t>If the browser shows invalid_state, MISSING_LAUNCH_TRUST, or an old GODFIN error page, close that tab, return to Settings, and choose Connect Gmail again. Do not refresh the failed callback. If the new attempt still fails, record only the error code and time; never share the authorization code, client secret, or token.</w:t>
+      </w:r>
+    </w:p>
+    <w:p>
+      <w:pPr>
+        <w:keepLines/>
+        <w:numPr>
+          <w:ilvl w:val="0"/>
+          <w:numId w:val="10"/>
+        </w:numPr>
+      </w:pPr>
+      <w:r>
+        <w:t>While Google keeps the app in Testing, retain oculusrexai@gmail.com and naraharikripa14@gmail.com as test users and record the expiry/re-consent implications. Complete Google verification before inviting general customers if the provider requires it for the read-only scope.</w:t>
       </w:r>
     </w:p>
     <w:p>
@@ -2313,6 +2358,7 @@
     </w:p>
     <w:p>
       <w:pPr>
+        <w:keepLines/>
         <w:spacing w:before="100" w:after="160" w:line="288" w:lineRule="auto"/>
         <w:ind w:left="115" w:right="115"/>
         <w:shd w:fill="FDECEC"/>
@@ -2399,11 +2445,12 @@
         <w:pStyle w:val="Heading2"/>
       </w:pPr>
       <w:r>
-        <w:t>2.2 Test and apply Supabase migration 0006</w:t>
-      </w:r>
-    </w:p>
-    <w:p>
-      <w:pPr>
+        <w:t>2.2 Test and apply Supabase migrations 0006 and 0007</w:t>
+      </w:r>
+    </w:p>
+    <w:p>
+      <w:pPr>
+        <w:keepLines/>
         <w:spacing w:before="100" w:after="160" w:line="288" w:lineRule="auto"/>
         <w:ind w:left="115" w:right="115"/>
         <w:shd w:fill="FFF4D8"/>
@@ -2426,7 +2473,7 @@
           <w:color w:val="172033"/>
           <w:sz w:val="21"/>
         </w:rPr>
-        <w:t>The deployed website cannot read Cashfree purchases until migration 0006 exists in Supabase. Keep CHECKOUT_ENABLED=false throughout this section. The migration is additive and preserves legacy purchase history, but a verified backup is still required before a production database change.</w:t>
+        <w:t>The deployed website cannot safely provision Cashfree purchases and in-place upgrades until migrations 0006 and 0007 exist in Supabase. Keep CHECKOUT_ENABLED=false throughout this section. Both migrations are additive and preserve legacy purchase history, but a verified backup is still required before a production database change.</w:t>
       </w:r>
     </w:p>
     <w:p>
@@ -2486,7 +2533,7 @@
         </w:numPr>
       </w:pPr>
       <w:r>
-        <w:t>Run: supabase test db --local supabase/tests. Confirm all files, including 0006_cashfree_commerce.test.sql, finish successfully with no failed pgTAP assertion.</w:t>
+        <w:t>Run: supabase test db --local supabase/tests. Confirm all files, including 0006_cashfree_commerce.test.sql and 0007_cashfree_license_upgrades.test.sql, finish successfully with no failed pgTAP assertion.</w:t>
       </w:r>
     </w:p>
     <w:p>
@@ -2546,7 +2593,7 @@
         </w:numPr>
       </w:pPr>
       <w:r>
-        <w:t>Run: supabase migration list --linked. Migration 0006 should appear locally and not yet remotely on the first run.</w:t>
+        <w:t>Run: supabase migration list --linked. Migrations 0006 and 0007 should appear locally. Note which are missing remotely.</w:t>
       </w:r>
     </w:p>
     <w:p>
@@ -2558,7 +2605,7 @@
         </w:numPr>
       </w:pPr>
       <w:r>
-        <w:t>Run: supabase db push --linked --dry-run. Read the output and confirm it proposes only the missing ordered migration 0006_cashfree_commerce.sql.</w:t>
+        <w:t>Run: supabase db push --linked --dry-run. Read the output and confirm it proposes only the missing ordered migration files, ending with 0007_cashfree_license_upgrades.sql.</w:t>
       </w:r>
     </w:p>
     <w:p>
@@ -2582,7 +2629,7 @@
         </w:numPr>
       </w:pPr>
       <w:r>
-        <w:t>Run: supabase migration list --linked again. Confirm 0006 appears in both the local and remote columns. Leave CHECKOUT_ENABLED=false until the sandbox matrix passes.</w:t>
+        <w:t>Run: supabase migration list --linked again. Confirm 0006 and 0007 appear in both the local and remote columns. Leave CHECKOUT_ENABLED=false until the sandbox matrix passes.</w:t>
       </w:r>
     </w:p>
     <w:p>
@@ -2738,6 +2785,9 @@
         </w:tc>
       </w:tr>
       <w:tr>
+        <w:trPr>
+          <w:cantSplit/>
+        </w:trPr>
         <w:tc>
           <w:tcPr>
             <w:tcW w:type="dxa" w:w="2800"/>
@@ -2840,6 +2890,9 @@
         </w:tc>
       </w:tr>
       <w:tr>
+        <w:trPr>
+          <w:cantSplit/>
+        </w:trPr>
         <w:tc>
           <w:tcPr>
             <w:tcW w:type="dxa" w:w="2800"/>
@@ -2942,6 +2995,9 @@
         </w:tc>
       </w:tr>
       <w:tr>
+        <w:trPr>
+          <w:cantSplit/>
+        </w:trPr>
         <w:tc>
           <w:tcPr>
             <w:tcW w:type="dxa" w:w="2800"/>
@@ -3044,6 +3100,9 @@
         </w:tc>
       </w:tr>
       <w:tr>
+        <w:trPr>
+          <w:cantSplit/>
+        </w:trPr>
         <w:tc>
           <w:tcPr>
             <w:tcW w:type="dxa" w:w="2800"/>
@@ -3146,6 +3205,9 @@
         </w:tc>
       </w:tr>
       <w:tr>
+        <w:trPr>
+          <w:cantSplit/>
+        </w:trPr>
         <w:tc>
           <w:tcPr>
             <w:tcW w:type="dxa" w:w="2800"/>
@@ -3248,6 +3310,9 @@
         </w:tc>
       </w:tr>
       <w:tr>
+        <w:trPr>
+          <w:cantSplit/>
+        </w:trPr>
         <w:tc>
           <w:tcPr>
             <w:tcW w:type="dxa" w:w="2800"/>
@@ -3412,7 +3477,7 @@
         </w:numPr>
       </w:pPr>
       <w:r>
-        <w:t>Keep CHECKOUT_ENABLED=false until Supabase migration 0006 is applied and the complete sandbox matrix below passes.</w:t>
+        <w:t>Keep CHECKOUT_ENABLED=false until Supabase migrations 0006 and 0007 are applied and the complete sandbox matrix below passes.</w:t>
       </w:r>
     </w:p>
     <w:p>
@@ -3456,7 +3521,7 @@
         </w:numPr>
       </w:pPr>
       <w:r>
-        <w:t>Choose the latest available webhook version supported by the account. The code accepts 2026-01-01, 2025-01-01, and 2023-08-01 while using Cashfree's current 2026-01-01 order API.</w:t>
+        <w:t>Choose the latest available webhook version supported by the account. This build sends Cashfree API version 2025-01-01 and accepts signed webhooks using 2025-01-01 or the legacy 2023-08-01 version. Do not change the version without updating the provider contract tests.</w:t>
       </w:r>
     </w:p>
     <w:p>
@@ -3481,11 +3546,6 @@
       </w:pPr>
       <w:r>
         <w:t>Use Cashfree Dashboard webhook replay to send the same paid event twice. Verify one provider event, one purchase, one license, and one email.</w:t>
-      </w:r>
-    </w:p>
-    <w:p>
-      <w:r>
-        <w:br w:type="page"/>
       </w:r>
     </w:p>
     <w:p>
@@ -3623,23 +3683,6 @@
     </w:p>
     <w:p>
       <w:pPr>
-        <w:pStyle w:val="RunbookCaption"/>
-      </w:pPr>
-      <w:r>
-        <w:t xml:space="preserve">Official reference: </w:t>
-      </w:r>
-      <w:hyperlink r:id="rId15">
-        <w:r>
-          <w:rPr>
-            <w:color w:val="2E74B5"/>
-            <w:u w:val="single"/>
-          </w:rPr>
-          <w:t>Cashfree webhook signature verification</w:t>
-        </w:r>
-      </w:hyperlink>
-    </w:p>
-    <w:p>
-      <w:pPr>
         <w:spacing w:after="80"/>
       </w:pPr>
       <w:r>
@@ -3865,7 +3908,7 @@
       <w:r>
         <w:t xml:space="preserve">Official reference: </w:t>
       </w:r>
-      <w:hyperlink r:id="rId16">
+      <w:hyperlink r:id="rId15">
         <w:r>
           <w:rPr>
             <w:color w:val="2E74B5"/>
@@ -3942,13 +3985,29 @@
     <w:p>
       <w:pPr>
         <w:keepLines/>
-        <w:numPr>
-          <w:ilvl w:val="0"/>
-          <w:numId w:val="10"/>
-        </w:numPr>
-      </w:pPr>
-      <w:r>
-        <w:t>Register or confirm control of godfin.dev in a business-owned registrar account. Enable registrar lock, two-factor authentication, auto-renewal, and a recovery contact.</w:t>
+        <w:spacing w:before="100" w:after="160" w:line="288" w:lineRule="auto"/>
+        <w:ind w:left="115" w:right="115"/>
+        <w:shd w:fill="E8EEF5"/>
+        <w:pBdr>
+          <w:left w:val="single" w:sz="18" w:space="8" w:color="163A5F"/>
+        </w:pBdr>
+      </w:pPr>
+      <w:r>
+        <w:rPr>
+          <w:rFonts w:ascii="Calibri" w:hAnsi="Calibri"/>
+          <w:b/>
+          <w:color w:val="163A5F"/>
+          <w:sz w:val="21"/>
+        </w:rPr>
+        <w:t xml:space="preserve">CURRENT DOMAIN CHECK  </w:t>
+      </w:r>
+      <w:r>
+        <w:rPr>
+          <w:rFonts w:ascii="Calibri" w:hAnsi="Calibri"/>
+          <w:color w:val="172033"/>
+          <w:sz w:val="21"/>
+        </w:rPr>
+        <w:t>On 24 August 2026, both https://godfin.dev and https://godfin.vercel.app returned HTTP 200. This proves reachability only. It does not prove that the deployed website contains commit 5fbfe92, Cashfree credentials, migrations 0006/0007, or completed production acceptance.</w:t>
       </w:r>
     </w:p>
     <w:p>
@@ -3960,7 +4019,7 @@
         </w:numPr>
       </w:pPr>
       <w:r>
-        <w:t>In Vercel project godfin, add godfin.dev and www.godfin.dev. Copy only the DNS records Vercel displays into the authoritative DNS provider.</w:t>
+        <w:t>Register or confirm control of godfin.dev in a business-owned registrar account. Enable registrar lock, two-factor authentication, auto-renewal, and a recovery contact.</w:t>
       </w:r>
     </w:p>
     <w:p>
@@ -3972,7 +4031,7 @@
         </w:numPr>
       </w:pPr>
       <w:r>
-        <w:t>Choose one canonical host. Redirect the other host permanently.</w:t>
+        <w:t>In Vercel project godfin, add godfin.dev and www.godfin.dev. Copy only the DNS records Vercel displays into the authoritative DNS provider.</w:t>
       </w:r>
     </w:p>
     <w:p>
@@ -3984,7 +4043,7 @@
         </w:numPr>
       </w:pPr>
       <w:r>
-        <w:t>Set NEXT_PUBLIC_SITE_URL=https://godfin.dev for Production after DNS and HTTPS are ready. Update Google/Supabase redirect allow-lists and the Cashfree webhook/return URLs before switching traffic.</w:t>
+        <w:t>Choose one canonical host. Redirect the other host permanently.</w:t>
       </w:r>
     </w:p>
     <w:p>
@@ -3996,7 +4055,7 @@
         </w:numPr>
       </w:pPr>
       <w:r>
-        <w:t>Verify HTTPS, HSTS, CSP, X-Frame-Options, nosniff, Referrer-Policy, Permissions-Policy, sitemap.xml, robots.txt, and a deliberate 404.</w:t>
+        <w:t>Set NEXT_PUBLIC_SITE_URL=https://godfin.dev for Production after DNS and HTTPS are ready. Update Google/Supabase redirect allow-lists and the Cashfree webhook/return URLs before switching traffic.</w:t>
       </w:r>
     </w:p>
     <w:p>
@@ -4008,6 +4067,78 @@
         </w:numPr>
       </w:pPr>
       <w:r>
+        <w:t>Open Terminal and run: cd /Users/oculus/Projects/GODFIN/GODFIN_PRODUCTION/website. Then run: vercel whoami. If it asks you to sign in, run vercel login, complete the browser approval yourself, and return to Terminal.</w:t>
+      </w:r>
+    </w:p>
+    <w:p>
+      <w:pPr>
+        <w:keepLines/>
+        <w:numPr>
+          <w:ilvl w:val="0"/>
+          <w:numId w:val="10"/>
+        </w:numPr>
+      </w:pPr>
+      <w:r>
+        <w:t>Run: vercel link. Select the existing GODFIN team/account and the existing godfin project. Do not create a second Vercel project.</w:t>
+      </w:r>
+    </w:p>
+    <w:p>
+      <w:pPr>
+        <w:keepLines/>
+        <w:numPr>
+          <w:ilvl w:val="0"/>
+          <w:numId w:val="10"/>
+        </w:numPr>
+      </w:pPr>
+      <w:r>
+        <w:t>Run: vercel env ls. Confirm the required names exist without printing their values: Supabase URL/keys, LICENSE_SIGNING_SECRET, Cashfree client ID/secret/environment, CHECKOUT_ENABLED, Resend key/from address, and NEXT_PUBLIC_SITE_URL. Missing secret values must be added through Vercel's encrypted environment UI or prompt, never source control.</w:t>
+      </w:r>
+    </w:p>
+    <w:p>
+      <w:pPr>
+        <w:keepLines/>
+        <w:numPr>
+          <w:ilvl w:val="0"/>
+          <w:numId w:val="10"/>
+        </w:numPr>
+      </w:pPr>
+      <w:r>
+        <w:t>Keep CHECKOUT_ENABLED=false. Run: vercel deploy. Vercel prints a private preview URL. Test account sign-in, pricing, disabled checkout behavior, waitlist, privacy, terms, and the license verification route on that preview.</w:t>
+      </w:r>
+    </w:p>
+    <w:p>
+      <w:pPr>
+        <w:keepLines/>
+        <w:numPr>
+          <w:ilvl w:val="0"/>
+          <w:numId w:val="10"/>
+        </w:numPr>
+      </w:pPr>
+      <w:r>
+        <w:t>After Supabase migrations 0006/0007 and the Cashfree sandbox matrix pass, run the repository website checks again. Only then run: vercel deploy --prod. This promotes the exact linked source to the existing project; it does not authorize public marketing or customer checkout.</w:t>
+      </w:r>
+    </w:p>
+    <w:p>
+      <w:pPr>
+        <w:keepLines/>
+        <w:numPr>
+          <w:ilvl w:val="0"/>
+          <w:numId w:val="10"/>
+        </w:numPr>
+      </w:pPr>
+      <w:r>
+        <w:t>Verify HTTPS, HSTS, CSP, X-Frame-Options, nosniff, Referrer-Policy, Permissions-Policy, sitemap.xml, robots.txt, and a deliberate 404.</w:t>
+      </w:r>
+    </w:p>
+    <w:p>
+      <w:pPr>
+        <w:keepLines/>
+        <w:numPr>
+          <w:ilvl w:val="0"/>
+          <w:numId w:val="10"/>
+        </w:numPr>
+      </w:pPr>
+      <w:r>
         <w:t>Set immutable signed download URLs only after Section 12 clean-system validation. Do not point download buttons at unsigned local builds.</w:t>
       </w:r>
     </w:p>
@@ -4130,6 +4261,7 @@
     </w:p>
     <w:p>
       <w:pPr>
+        <w:keepLines/>
         <w:spacing w:before="100" w:after="160" w:line="288" w:lineRule="auto"/>
         <w:ind w:left="115" w:right="115"/>
         <w:shd w:fill="FFF4D8"/>
@@ -4949,6 +5081,7 @@
     </w:p>
     <w:p>
       <w:pPr>
+        <w:keepLines/>
         <w:spacing w:before="100" w:after="160" w:line="288" w:lineRule="auto"/>
         <w:ind w:left="115" w:right="115"/>
         <w:shd w:fill="EAF7EF"/>
@@ -5089,7 +5222,7 @@
       <w:r>
         <w:t xml:space="preserve">Official reference: </w:t>
       </w:r>
-      <w:hyperlink r:id="rId17">
+      <w:hyperlink r:id="rId16">
         <w:r>
           <w:rPr>
             <w:color w:val="2E74B5"/>
@@ -5156,6 +5289,7 @@
     </w:p>
     <w:p>
       <w:pPr>
+        <w:keepLines/>
         <w:spacing w:before="100" w:after="160" w:line="288" w:lineRule="auto"/>
         <w:ind w:left="115" w:right="115"/>
         <w:shd w:fill="FFF4D8"/>
@@ -5814,6 +5948,9 @@
         </w:tc>
       </w:tr>
       <w:tr>
+        <w:trPr>
+          <w:cantSplit/>
+        </w:trPr>
         <w:tc>
           <w:tcPr>
             <w:tcW w:type="dxa" w:w="1800"/>
@@ -5990,6 +6127,9 @@
         </w:tc>
       </w:tr>
       <w:tr>
+        <w:trPr>
+          <w:cantSplit/>
+        </w:trPr>
         <w:tc>
           <w:tcPr>
             <w:tcW w:type="dxa" w:w="1800"/>
@@ -6166,6 +6306,9 @@
         </w:tc>
       </w:tr>
       <w:tr>
+        <w:trPr>
+          <w:cantSplit/>
+        </w:trPr>
         <w:tc>
           <w:tcPr>
             <w:tcW w:type="dxa" w:w="1800"/>
@@ -6342,6 +6485,9 @@
         </w:tc>
       </w:tr>
       <w:tr>
+        <w:trPr>
+          <w:cantSplit/>
+        </w:trPr>
         <w:tc>
           <w:tcPr>
             <w:tcW w:type="dxa" w:w="1800"/>
@@ -6518,6 +6664,9 @@
         </w:tc>
       </w:tr>
       <w:tr>
+        <w:trPr>
+          <w:cantSplit/>
+        </w:trPr>
         <w:tc>
           <w:tcPr>
             <w:tcW w:type="dxa" w:w="1800"/>
@@ -6861,7 +7010,7 @@
         </w:numPr>
       </w:pPr>
       <w:r>
-        <w:t>Backend: 883 tests pass under clean Python 3.12, including auth/PIN, encryption, migrations, backups, merchant upsert, licenses, bounded background-job lock recovery, exact response contracts for all 182 API operations, Gmail credential reload after restart, goal ledgers and FD/RD suggestions, simulation reference vectors, recurring detection, atomic accounts, package privacy, CA tax pack, classification memory, performance, net worth, behavior insights, reward-pilot redaction, and UTC finance-fetch regressions.</w:t>
+        <w:t>Backend: 960 tests pass under clean Python 3.12, including auth/PIN, encryption, migrations, backups, merchant upsert, licenses, bounded background-job lock recovery, exact response contracts for all 182 API operations, Gmail OAuth/restart handling, goal ledgers and FD/RD suggestions, simulation reference vectors, recurring detection, atomic accounts, package privacy, CA tax pack, classification memory, enrichment abstention/relationships, performance, net worth, behavior insights, reward-pilot redaction, and UTC finance-fetch regressions.</w:t>
       </w:r>
     </w:p>
     <w:p>
@@ -6885,7 +7034,7 @@
         </w:numPr>
       </w:pPr>
       <w:r>
-        <w:t>Website: entitlement/payment contract verification, production build, real-app product chapters, reduced-motion fallbacks, mobile overflow, lifetime/no-bundled-credit pricing, security headers, checkout safe-disable behavior, and dependency audit pass. The final production URL scores Lighthouse performance 99, accessibility 100, and SEO 100, with LCP 1.73 seconds and CLS 0.</w:t>
+        <w:t>Website: entitlement/payment contract verification, five Cashfree tests, three lifetime-upgrade tests, seven ordered migration hashes, production build, real-app product chapters, reduced-motion fallbacks, mobile overflow, lifetime/no-bundled-credit pricing, security headers, checkout safe-disable behavior, and dependency audit pass. The previously measured production URL scored Lighthouse performance 99, accessibility 100, and SEO 100, with LCP 1.73 seconds and CLS 0; repeat this measurement after deploying the exact final SHA.</w:t>
       </w:r>
     </w:p>
     <w:p>
@@ -6933,7 +7082,7 @@
         </w:numPr>
       </w:pPr>
       <w:r>
-        <w:t>Local packaging: the fresh ea76be1 macOS arm64 candidate, containing Gmail restart fix 8dce936, passed strict codesign verification, first start 3.376 seconds, restart 1.229 seconds, idle memory 607 MB across five processes, database preservation, local trust boundary, maintenance boundary, backend auto-start, and callback-path checks. The DMG and ZIP exact SHA-256 values are recorded in the current package evidence. Gatekeeper correctly rejects the candidate because it is not yet Apple-notarized.</w:t>
+        <w:t>Local packaging: the fresh 5fbfe92 macOS arm64 candidate passed package verification with first start 2.898 seconds, restart 1.034 seconds, idle memory 603 MB across five processes, database preservation, local trust boundary, maintenance boundary, bundled-backend auto-start, and Gmail callback-path checks. DMG SHA-256: a37edb2a0f9c68c27184f1d8a7f3eb19834b15b23657bbf5e5389c760593d043. ZIP SHA-256: 0838f004dd58b3b825c71ce6b69588b43c05f1b378e108fe24356a9d81535ab4. The build is ad-hoc and not Apple-notarized.</w:t>
       </w:r>
     </w:p>
     <w:p>
@@ -6986,6 +7135,7 @@
     </w:p>
     <w:p>
       <w:pPr>
+        <w:keepLines/>
         <w:spacing w:before="100" w:after="160" w:line="288" w:lineRule="auto"/>
         <w:ind w:left="115" w:right="115"/>
         <w:shd w:fill="FFF4D8"/>
@@ -7098,7 +7248,7 @@
       <w:r>
         <w:t xml:space="preserve">Official reference: </w:t>
       </w:r>
-      <w:hyperlink r:id="rId18">
+      <w:hyperlink r:id="rId17">
         <w:r>
           <w:rPr>
             <w:color w:val="2E74B5"/>
@@ -7115,7 +7265,7 @@
       <w:r>
         <w:t xml:space="preserve">Official reference: </w:t>
       </w:r>
-      <w:hyperlink r:id="rId19">
+      <w:hyperlink r:id="rId18">
         <w:r>
           <w:rPr>
             <w:color w:val="2E74B5"/>
@@ -7411,6 +7561,7 @@
     </w:p>
     <w:p>
       <w:pPr>
+        <w:keepLines/>
         <w:spacing w:before="100" w:after="160" w:line="288" w:lineRule="auto"/>
         <w:ind w:left="115" w:right="115"/>
         <w:shd w:fill="EAF7EF"/>
@@ -7607,6 +7758,7 @@
     </w:p>
     <w:p>
       <w:pPr>
+        <w:keepLines/>
         <w:spacing w:before="100" w:after="160" w:line="288" w:lineRule="auto"/>
         <w:ind w:left="115" w:right="115"/>
         <w:shd w:fill="FDECEC"/>
@@ -7760,6 +7912,9 @@
         </w:tc>
       </w:tr>
       <w:tr>
+        <w:trPr>
+          <w:cantSplit/>
+        </w:trPr>
         <w:tc>
           <w:tcPr>
             <w:tcW w:type="dxa" w:w="3300"/>
@@ -7862,6 +8017,9 @@
         </w:tc>
       </w:tr>
       <w:tr>
+        <w:trPr>
+          <w:cantSplit/>
+        </w:trPr>
         <w:tc>
           <w:tcPr>
             <w:tcW w:type="dxa" w:w="3300"/>
@@ -7963,6 +8121,9 @@
         </w:tc>
       </w:tr>
       <w:tr>
+        <w:trPr>
+          <w:cantSplit/>
+        </w:trPr>
         <w:tc>
           <w:tcPr>
             <w:tcW w:type="dxa" w:w="3300"/>
@@ -8034,7 +8195,7 @@
                 <w:color w:val="172033"/>
                 <w:sz w:val="18"/>
               </w:rPr>
-              <w:t>☒</w:t>
+              <w:t>☐</w:t>
             </w:r>
           </w:p>
         </w:tc>
@@ -8059,12 +8220,15 @@
                 <w:color w:val="172033"/>
                 <w:sz w:val="18"/>
               </w:rPr>
-              <w:t>Private Desktop client; read-only consent, callback, initial sync, safe routing, and restart reload verified on 16 Aug 2026. Public consent publication remains separate.</w:t>
+              <w:t>Installed 5fbfe92 callback no longer returns MISSING_LAUNCH_TRUST. Owner must complete a fresh read-only authorization, sync, restart, disconnect, and reconnect check.</w:t>
             </w:r>
           </w:p>
         </w:tc>
       </w:tr>
       <w:tr>
+        <w:trPr>
+          <w:cantSplit/>
+        </w:trPr>
         <w:tc>
           <w:tcPr>
             <w:tcW w:type="dxa" w:w="3300"/>
@@ -8166,6 +8330,9 @@
         </w:tc>
       </w:tr>
       <w:tr>
+        <w:trPr>
+          <w:cantSplit/>
+        </w:trPr>
         <w:tc>
           <w:tcPr>
             <w:tcW w:type="dxa" w:w="3300"/>
@@ -8266,6 +8433,9 @@
         </w:tc>
       </w:tr>
       <w:tr>
+        <w:trPr>
+          <w:cantSplit/>
+        </w:trPr>
         <w:tc>
           <w:tcPr>
             <w:tcW w:type="dxa" w:w="3300"/>
@@ -8366,6 +8536,9 @@
         </w:tc>
       </w:tr>
       <w:tr>
+        <w:trPr>
+          <w:cantSplit/>
+        </w:trPr>
         <w:tc>
           <w:tcPr>
             <w:tcW w:type="dxa" w:w="3300"/>
@@ -8467,6 +8640,9 @@
         </w:tc>
       </w:tr>
       <w:tr>
+        <w:trPr>
+          <w:cantSplit/>
+        </w:trPr>
         <w:tc>
           <w:tcPr>
             <w:tcW w:type="dxa" w:w="3300"/>
@@ -8567,6 +8743,9 @@
         </w:tc>
       </w:tr>
       <w:tr>
+        <w:trPr>
+          <w:cantSplit/>
+        </w:trPr>
         <w:tc>
           <w:tcPr>
             <w:tcW w:type="dxa" w:w="3300"/>
@@ -8667,6 +8846,9 @@
         </w:tc>
       </w:tr>
       <w:tr>
+        <w:trPr>
+          <w:cantSplit/>
+        </w:trPr>
         <w:tc>
           <w:tcPr>
             <w:tcW w:type="dxa" w:w="3300"/>
@@ -8767,6 +8949,9 @@
         </w:tc>
       </w:tr>
       <w:tr>
+        <w:trPr>
+          <w:cantSplit/>
+        </w:trPr>
         <w:tc>
           <w:tcPr>
             <w:tcW w:type="dxa" w:w="3300"/>
@@ -8869,6 +9054,9 @@
         </w:tc>
       </w:tr>
       <w:tr>
+        <w:trPr>
+          <w:cantSplit/>
+        </w:trPr>
         <w:tc>
           <w:tcPr>
             <w:tcW w:type="dxa" w:w="3300"/>
@@ -8970,6 +9158,9 @@
         </w:tc>
       </w:tr>
       <w:tr>
+        <w:trPr>
+          <w:cantSplit/>
+        </w:trPr>
         <w:tc>
           <w:tcPr>
             <w:tcW w:type="dxa" w:w="3300"/>
@@ -9071,6 +9262,9 @@
         </w:tc>
       </w:tr>
       <w:tr>
+        <w:trPr>
+          <w:cantSplit/>
+        </w:trPr>
         <w:tc>
           <w:tcPr>
             <w:tcW w:type="dxa" w:w="3300"/>
@@ -9172,6 +9366,9 @@
         </w:tc>
       </w:tr>
       <w:tr>
+        <w:trPr>
+          <w:cantSplit/>
+        </w:trPr>
         <w:tc>
           <w:tcPr>
             <w:tcW w:type="dxa" w:w="3300"/>
@@ -9272,6 +9469,9 @@
         </w:tc>
       </w:tr>
       <w:tr>
+        <w:trPr>
+          <w:cantSplit/>
+        </w:trPr>
         <w:tc>
           <w:tcPr>
             <w:tcW w:type="dxa" w:w="3300"/>
@@ -9372,6 +9572,9 @@
         </w:tc>
       </w:tr>
       <w:tr>
+        <w:trPr>
+          <w:cantSplit/>
+        </w:trPr>
         <w:tc>
           <w:tcPr>
             <w:tcW w:type="dxa" w:w="3300"/>
@@ -9472,6 +9675,9 @@
         </w:tc>
       </w:tr>
       <w:tr>
+        <w:trPr>
+          <w:cantSplit/>
+        </w:trPr>
         <w:tc>
           <w:tcPr>
             <w:tcW w:type="dxa" w:w="3300"/>

</xml_diff>

<commit_message>
docs(ops): record domain and OAuth recovery evidence [GF-OPS-001]
</commit_message>
<xml_diff>
--- a/docs/GODFIN_OWNER_COMPLETION_RUNBOOK.docx
+++ b/docs/GODFIN_OWNER_COMPLETION_RUNBOOK.docx
@@ -64,7 +64,7 @@
           <w:color w:val="667085"/>
           <w:sz w:val="20"/>
         </w:rPr>
-        <w:t>Version 2.7  •  24 August 2026  •  oculusrex14/GODFIN (private)</w:t>
+        <w:t>Version 2.8  •  24 August 2026  •  oculusrex14/GODFIN (private)</w:t>
         <w:br/>
         <w:t>Production branch: codex/godfin-production-v5</w:t>
       </w:r>
@@ -222,7 +222,7 @@
           <w:color w:val="172033"/>
           <w:sz w:val="21"/>
         </w:rPr>
-        <w:t>Production remediation is tracked on the private v5 branch. The clean Python 3.12 baseline is 960 passing backend tests. All 182 API operations publish an explicit success or intentional terminal status, a non-empty media-specific success schema, and the shared error contract. Frontend lint, accessibility, authentication, and production builds pass; five Cashfree payment tests, three lifetime-upgrade tests, the website production build, 12 desktop release/update tests, and seven package-privacy tests pass.</w:t>
+        <w:t>Production remediation is tracked on the private v5 branch. The clean Python 3.12 baseline is 966 passing backend tests. All 182 API operations publish an explicit success or intentional terminal status, a non-empty media-specific success schema, and the shared error contract. Frontend lint, accessibility, authentication, and production builds pass; five Cashfree payment tests, three lifetime-upgrade tests, the website production build, 12 desktop release/update tests, and seven package-privacy tests pass.</w:t>
       </w:r>
     </w:p>
     <w:p>
@@ -294,7 +294,7 @@
         </w:numPr>
       </w:pPr>
       <w:r>
-        <w:t>The website product tour uses real React application captures generated only from synthetic data, muted WebM/MP4 media with reduced-motion fallbacks, and build-time checks that prevent unreleased features from being advertised. godfin.dev is the final canonical domain and godfin.vercel.app is the fallback. The exact 5fbfe92 website candidate must remain a preview until migrations 0006 and 0007 plus provider tests pass.</w:t>
+        <w:t>The website product tour uses real React application captures generated only from synthetic data, muted WebM/MP4 media with reduced-motion fallbacks, and build-time checks that prevent unreleased features from being advertised. godfin.dev is the final canonical domain and godfin.vercel.app is the fallback. Source commit 3a44f00 is deployed to production with checkout deliberately disabled until migrations 0006 and 0007 plus the provider sandbox tests pass.</w:t>
       </w:r>
     </w:p>
     <w:p>
@@ -378,7 +378,7 @@
         </w:numPr>
       </w:pPr>
       <w:r>
-        <w:t>A fresh local macOS arm64 package was built and installed from repository commit 5fbfe926658783db503bd1ad5fd503acd5b96ee1 using the locked toolchain. It starts in 2.898 seconds on first launch and 1.034 seconds on restart, preserves its database, auto-starts the bundled local backend, enforces the local trust and maintenance boundaries, and remains below the 700 MB idle-memory budget at 603 MB across five processes. The private DMG SHA-256 is a37edb2a0f9c68c27184f1d8a7f3eb19834b15b23657bbf5e5389c760593d043 and the ZIP SHA-256 is 0838f004dd58b3b825c71ce6b69588b43c05f1b378e108fe24356a9d81535ab4. This is an ad-hoc local test signature, not an Apple-notarized customer release.</w:t>
+        <w:t>A fresh local macOS arm64 package was built, verified, installed, and relaunched from repository commit 3a44f001fed2b3bc72e9aae7c98d8e0564568d31 using the locked toolchain. It starts in 2.997 seconds on first launch and 1.033 seconds on restart, preserves its database, auto-starts the bundled local backend, enforces the local trust and maintenance boundaries, and remains below the 700 MB idle-memory budget at 602.9 MB across five processes. The private DMG SHA-256 is f960c103a8c584a9d45e31d39258a7149ae509dac35a6cb02914c52e6057b36b and the ZIP SHA-256 is 00b91ea7ce3ed5fbad5dc62bff03deae312a95ea962956fe9dc18651b57e4e0a. This is an ad-hoc local test signature, not an Apple-notarized customer release.</w:t>
       </w:r>
     </w:p>
     <w:p>
@@ -402,7 +402,7 @@
         </w:numPr>
       </w:pPr>
       <w:r>
-        <w:t>Repository evidence is current through commit 5fbfe92 on codex/godfin-production-v5. The GitHub repository is verified PRIVATE and the exact commit is pushed. Entitlements, Cashfree lifetime upgrades, canonical-domain defaults, Gmail callback recovery, and deterministic transaction enrichment are included.</w:t>
+        <w:t>Application and deployment evidence is current through commit 3a44f00 on codex/godfin-production-v5. The GitHub repository is verified PRIVATE and the exact commit is pushed. Entitlements, Cashfree lifetime upgrades, canonical-domain defaults, Gmail callback recovery, deterministic transaction enrichment, and standalone website contract snapshots are included.</w:t>
       </w:r>
     </w:p>
     <w:p>
@@ -438,7 +438,7 @@
         </w:numPr>
       </w:pPr>
       <w:r>
-        <w:t>Public Gmail consent-screen review, Cashfree KYC/sandbox/live tests, Supabase migrations 0006 and 0007 deployment, Resend/DNS, final Google/Supabase canonical redirect verification, Apple/Windows certificates, R2, cross-platform clean-system evidence, dependency-license approval, GitHub Actions billing, exact-SHA Vercel deployment, and public-launch authorization are not yet complete.</w:t>
+        <w:t>Public Gmail consent-screen review, Cashfree KYC/sandbox/live tests, Supabase migrations 0006 and 0007 deployment, Resend/DNS, final Google/Supabase canonical redirect verification, Apple/Windows certificates, R2, cross-platform clean-system evidence, dependency-license approval, GitHub Actions billing, and public-launch authorization are not yet complete.</w:t>
       </w:r>
     </w:p>
     <w:p>
@@ -1034,7 +1034,7 @@
                 <w:color w:val="172033"/>
                 <w:sz w:val="18"/>
               </w:rPr>
-              <w:t>Canonical redirects</w:t>
+              <w:t>Provider callbacks</w:t>
             </w:r>
           </w:p>
         </w:tc>
@@ -1059,7 +1059,7 @@
                 <w:color w:val="172033"/>
                 <w:sz w:val="18"/>
               </w:rPr>
-              <w:t>godfin.dev resolves, but Google/Supabase/Vercel settings still need owner verification.</w:t>
+              <w:t>The final domain and Vercel redirects are verified, but Google/Supabase and Cashfree must still be rechecked with their real provider settings.</w:t>
             </w:r>
           </w:p>
         </w:tc>
@@ -1084,7 +1084,7 @@
                 <w:color w:val="172033"/>
                 <w:sz w:val="18"/>
               </w:rPr>
-              <w:t>Make godfin.dev primary and retain the Vercel callback fallback.</w:t>
+              <w:t>Set godfin.dev as the primary provider URL and retain the Vercel callback fallback.</w:t>
             </w:r>
           </w:p>
         </w:tc>
@@ -1109,7 +1109,7 @@
                 <w:color w:val="172033"/>
                 <w:sz w:val="18"/>
               </w:rPr>
-              <w:t>Apex, www redirect, OAuth, sitemap, and security headers pass.</w:t>
+              <w:t>Google account return and Cashfree webhook/return URLs pass on godfin.dev.</w:t>
             </w:r>
           </w:p>
         </w:tc>
@@ -1646,11 +1646,6 @@
       </w:pPr>
     </w:p>
     <w:p>
-      <w:r>
-        <w:br w:type="page"/>
-      </w:r>
-    </w:p>
-    <w:p>
       <w:pPr>
         <w:pStyle w:val="Heading1"/>
       </w:pPr>
@@ -2092,7 +2087,7 @@
           <w:color w:val="172033"/>
           <w:sz w:val="21"/>
         </w:rPr>
-        <w:t>Fully quit GODFIN, reopen /Applications/GODFIN.app, and begin a fresh Connect Gmail attempt from Settings. Do not reuse or refresh an old Google callback tab. Installed commit 5fbfe92 allows only the exact 127.0.0.1 Gmail callback through this boundary; every ordinary backend route still requires the active desktop launch secret.</w:t>
+        <w:t>Fully quit GODFIN, reopen /Applications/GODFIN.app, and begin a fresh Connect Gmail attempt from Settings. Do not reuse or refresh an old Google callback tab. Installed commit 3a44f00 allows only the exact 127.0.0.1 Gmail callback through this boundary and provides a fresh approval action when a state has expired; every ordinary backend route still requires the active desktop launch secret.</w:t>
       </w:r>
     </w:p>
     <w:p>
@@ -3987,16 +3982,16 @@
         <w:keepLines/>
         <w:spacing w:before="100" w:after="160" w:line="288" w:lineRule="auto"/>
         <w:ind w:left="115" w:right="115"/>
-        <w:shd w:fill="E8EEF5"/>
+        <w:shd w:fill="EAF7EF"/>
         <w:pBdr>
-          <w:left w:val="single" w:sz="18" w:space="8" w:color="163A5F"/>
+          <w:left w:val="single" w:sz="18" w:space="8" w:color="17663A"/>
         </w:pBdr>
       </w:pPr>
       <w:r>
         <w:rPr>
           <w:rFonts w:ascii="Calibri" w:hAnsi="Calibri"/>
           <w:b/>
-          <w:color w:val="163A5F"/>
+          <w:color w:val="17663A"/>
           <w:sz w:val="21"/>
         </w:rPr>
         <w:t xml:space="preserve">CURRENT DOMAIN CHECK  </w:t>
@@ -4007,7 +4002,7 @@
           <w:color w:val="172033"/>
           <w:sz w:val="21"/>
         </w:rPr>
-        <w:t>On 24 August 2026, both https://godfin.dev and https://godfin.vercel.app returned HTTP 200. This proves reachability only. It does not prove that the deployed website contains commit 5fbfe92, Cashfree credentials, migrations 0006/0007, or completed production acceptance.</w:t>
+        <w:t>On 24 August 2026, source commit 3a44f00 was deployed to Vercel production as deployment dpl_HjwgU9aBfaBvdcFH8aiR981mgVDY. https://godfin.dev and https://godfin.vercel.app return HTTP 200; https://www.godfin.dev permanently redirects to the apex; HSTS and the Cashfree-only CSP are present; hello@godfin.dev is the only public contact; and checkout fails closed with HTTP 503. This verifies the domain and safe production deployment, not Cashfree credentials, migrations 0006/0007, or payment acceptance.</w:t>
       </w:r>
     </w:p>
     <w:p>
@@ -4055,7 +4050,7 @@
         </w:numPr>
       </w:pPr>
       <w:r>
-        <w:t>Set NEXT_PUBLIC_SITE_URL=https://godfin.dev for Production after DNS and HTTPS are ready. Update Google/Supabase redirect allow-lists and the Cashfree webhook/return URLs before switching traffic.</w:t>
+        <w:t>NEXT_PUBLIC_SITE_URL=https://godfin.dev is already set for Production, Preview, and Development. Keep Google/Supabase redirect allow-lists and the Cashfree webhook/return URLs synchronized with the final domain.</w:t>
       </w:r>
     </w:p>
     <w:p>
@@ -4091,7 +4086,7 @@
         </w:numPr>
       </w:pPr>
       <w:r>
-        <w:t>Run: vercel env ls. Confirm the required names exist without printing their values: Supabase URL/keys, LICENSE_SIGNING_SECRET, Cashfree client ID/secret/environment, CHECKOUT_ENABLED, Resend key/from address, and NEXT_PUBLIC_SITE_URL. Missing secret values must be added through Vercel's encrypted environment UI or prompt, never source control.</w:t>
+        <w:t>Run: vercel env ls. The public domain/email variables, Supabase variables, LICENSE_SIGNING_SECRET, CASHFREE_ENVIRONMENT=sandbox, CHECKOUT_ENABLED=false, PPP_CHECKOUT_ENABLED=false, and CASHFREE_GLOBAL_PAYMENTS_APPROVED=false are already present. Add the still-missing ABUSE_HASH_SECRET, CASHFREE_CLIENT_ID, CASHFREE_CLIENT_SECRET, LICENSE_ENTITLEMENT_ACTIVE_KEY_VERSION, LICENSE_ENTITLEMENT_PRIVATE_KEYS_JSON, RESEND_API_KEY, and RESEND_FROM_EMAIL only through Vercel's encrypted environment UI or prompt; never print or commit their values.</w:t>
       </w:r>
     </w:p>
     <w:p>
@@ -4103,7 +4098,7 @@
         </w:numPr>
       </w:pPr>
       <w:r>
-        <w:t>Keep CHECKOUT_ENABLED=false. Run: vercel deploy. Vercel prints a private preview URL. Test account sign-in, pricing, disabled checkout behavior, waitlist, privacy, terms, and the license verification route on that preview.</w:t>
+        <w:t>The 3a44f00 production deployment is complete and intentionally fail-closed. After any provider-variable change, keep CHECKOUT_ENABLED=false, deploy a preview, and test account sign-in, pricing, disabled checkout behavior, waitlist, privacy, terms, and license verification.</w:t>
       </w:r>
     </w:p>
     <w:p>
@@ -4115,7 +4110,7 @@
         </w:numPr>
       </w:pPr>
       <w:r>
-        <w:t>After Supabase migrations 0006/0007 and the Cashfree sandbox matrix pass, run the repository website checks again. Only then run: vercel deploy --prod. This promotes the exact linked source to the existing project; it does not authorize public marketing or customer checkout.</w:t>
+        <w:t>After Supabase migrations 0006/0007 and the Cashfree sandbox matrix pass, run the repository website checks again and deploy the exact tested SHA to production. A production deployment does not authorize public marketing or customer checkout.</w:t>
       </w:r>
     </w:p>
     <w:p>
@@ -7010,7 +7005,7 @@
         </w:numPr>
       </w:pPr>
       <w:r>
-        <w:t>Backend: 960 tests pass under clean Python 3.12, including auth/PIN, encryption, migrations, backups, merchant upsert, licenses, bounded background-job lock recovery, exact response contracts for all 182 API operations, Gmail OAuth/restart handling, goal ledgers and FD/RD suggestions, simulation reference vectors, recurring detection, atomic accounts, package privacy, CA tax pack, classification memory, enrichment abstention/relationships, performance, net worth, behavior insights, reward-pilot redaction, and UTC finance-fetch regressions.</w:t>
+        <w:t>Backend: 966 tests pass under clean Python 3.12, including auth/PIN, encryption, migrations, backups, merchant upsert, licenses, bounded background-job lock recovery, exact response contracts for all 182 API operations, Gmail OAuth/restart handling, goal ledgers and FD/RD suggestions, simulation reference vectors, recurring detection, atomic accounts, package privacy, CA tax pack, classification memory, enrichment abstention/relationships, performance, net worth, behavior insights, reward-pilot redaction, and UTC finance-fetch regressions.</w:t>
       </w:r>
     </w:p>
     <w:p>
@@ -7082,7 +7077,7 @@
         </w:numPr>
       </w:pPr>
       <w:r>
-        <w:t>Local packaging: the fresh 5fbfe92 macOS arm64 candidate passed package verification with first start 2.898 seconds, restart 1.034 seconds, idle memory 603 MB across five processes, database preservation, local trust boundary, maintenance boundary, bundled-backend auto-start, and Gmail callback-path checks. DMG SHA-256: a37edb2a0f9c68c27184f1d8a7f3eb19834b15b23657bbf5e5389c760593d043. ZIP SHA-256: 0838f004dd58b3b825c71ce6b69588b43c05f1b378e108fe24356a9d81535ab4. The build is ad-hoc and not Apple-notarized.</w:t>
+        <w:t>Local packaging: the fresh 3a44f00 macOS arm64 candidate passed package verification with first start 2.997 seconds, restart 1.033 seconds, idle memory 602.9 MB across five processes, database preservation, local trust boundary, maintenance boundary, bundled-backend auto-start, and Gmail callback-path checks. DMG SHA-256: f960c103a8c584a9d45e31d39258a7149ae509dac35a6cb02914c52e6057b36b. ZIP SHA-256: 00b91ea7ce3ed5fbad5dc62bff03deae312a95ea962956fe9dc18651b57e4e0a. The build is ad-hoc and not Apple-notarized.</w:t>
       </w:r>
     </w:p>
     <w:p>
@@ -8220,7 +8215,7 @@
                 <w:color w:val="172033"/>
                 <w:sz w:val="18"/>
               </w:rPr>
-              <w:t>Installed 5fbfe92 callback no longer returns MISSING_LAUNCH_TRUST. Owner must complete a fresh read-only authorization, sync, restart, disconnect, and reconnect check.</w:t>
+              <w:t>Installed 3a44f00 handles the trusted localhost callback and fresh-state recovery. Owner must complete a fresh read-only authorization, sync, restart, disconnect, and reconnect check.</w:t>
             </w:r>
           </w:p>
         </w:tc>
@@ -8585,6 +8580,7 @@
                 <w:color w:val="172033"/>
                 <w:sz w:val="18"/>
               </w:rPr>
+              <w:t>Codex</w:t>
             </w:r>
           </w:p>
         </w:tc>
@@ -8609,7 +8605,7 @@
                 <w:color w:val="172033"/>
                 <w:sz w:val="18"/>
               </w:rPr>
-              <w:t>☐</w:t>
+              <w:t>☒</w:t>
             </w:r>
           </w:p>
         </w:tc>
@@ -8634,7 +8630,7 @@
                 <w:color w:val="172033"/>
                 <w:sz w:val="18"/>
               </w:rPr>
-              <w:t>godfin.dev resolves to Vercel; provider callbacks and production deployment still require acceptance evidence.</w:t>
+              <w:t>Production deployment dpl_HjwgU9aBfaBvdcFH8aiR981mgVDY serves godfin.dev; www redirects to apex; HSTS and Cashfree-only CSP verified; checkout remains disabled.</w:t>
             </w:r>
           </w:p>
         </w:tc>

</xml_diff>

<commit_message>
docs(release): publish final owner completion evidence [GF-FINAL-002]
</commit_message>
<xml_diff>
--- a/docs/GODFIN_OWNER_COMPLETION_RUNBOOK.docx
+++ b/docs/GODFIN_OWNER_COMPLETION_RUNBOOK.docx
@@ -64,7 +64,7 @@
           <w:color w:val="667085"/>
           <w:sz w:val="20"/>
         </w:rPr>
-        <w:t>Version 2.8  •  24 August 2026  •  oculusrex14/GODFIN (private)</w:t>
+        <w:t>Version 2.9  •  25 August 2026  •  oculusrex14/GODFIN</w:t>
         <w:br/>
         <w:t>Production branch: codex/godfin-production-v5</w:t>
       </w:r>
@@ -222,7 +222,7 @@
           <w:color w:val="172033"/>
           <w:sz w:val="21"/>
         </w:rPr>
-        <w:t>Production remediation is tracked on the private v5 branch. The clean Python 3.12 baseline is 966 passing backend tests. All 182 API operations publish an explicit success or intentional terminal status, a non-empty media-specific success schema, and the shared error contract. Frontend lint, accessibility, authentication, and production builds pass; five Cashfree payment tests, three lifetime-upgrade tests, the website production build, 12 desktop release/update tests, and seven package-privacy tests pass.</w:t>
+        <w:t>Production code candidate b62946e5958af1d37a00ff63ca7258805e59c357 is pushed on codex/godfin-production-v5. The clean Python 3.12 baseline is 1,008 passing backend tests. All 182 API operations publish an explicit success or intentional terminal status, a non-empty media-specific success schema, and the shared error contract. Frontend lint, accessibility, authentication, content, and production-build gates pass; the generated inventory covers 422 interactive controls across 19 route scopes. Five Cashfree contract tests, three webhook-body security tests, three lifetime-upgrade tests, the website production build, 12 desktop release/update tests, and 11 package-privacy tests pass.</w:t>
       </w:r>
     </w:p>
     <w:p>
@@ -234,7 +234,7 @@
         </w:numPr>
       </w:pPr>
       <w:r>
-        <w:t>Private repository: https://github.com/oculusrex14/GODFIN</w:t>
+        <w:t>Production repository URL: https://github.com/oculusrex14/GODFIN. GitHub currently reports PUBLIC; the privacy gate is open.</w:t>
       </w:r>
     </w:p>
     <w:p>
@@ -258,7 +258,7 @@
         </w:numPr>
       </w:pPr>
       <w:r>
-        <w:t>Supabase project: GODFIN (ap-south-1). Local ordered migrations now run through 0007. Migration 0006 adds provider-neutral Cashfree purchase/event fields and replay-safe provisioning; migration 0007 adds in-place Free-to-Pro, Free-to-Max, and Pro-to-Max lifetime upgrades while preserving the license identity and device activations. Remote application and pgTAP evidence remain required.</w:t>
+        <w:t>Supabase project: GODFIN (ap-south-1). The repository verifies 10 ordered migration hashes through 20260824211115_cashfree_email_delivery_claim.sql. Migration 0006 adds provider-neutral Cashfree purchase/event fields and replay-safe provisioning; migration 0007 adds in-place lifetime upgrades; the later migrations repair public rate-limit arithmetic and add an atomic email-delivery claim. Remote application and pgTAP evidence remain required.</w:t>
       </w:r>
     </w:p>
     <w:p>
@@ -294,7 +294,7 @@
         </w:numPr>
       </w:pPr>
       <w:r>
-        <w:t>The website product tour uses real React application captures generated only from synthetic data, muted WebM/MP4 media with reduced-motion fallbacks, and build-time checks that prevent unreleased features from being advertised. godfin.dev is the final canonical domain and godfin.vercel.app is the fallback. Source commit 3a44f00 is deployed to production with checkout deliberately disabled until migrations 0006 and 0007 plus the provider sandbox tests pass.</w:t>
+        <w:t>The website product tour uses real React application captures generated only from synthetic data, muted WebM/MP4 media with reduced-motion fallbacks, and build-time checks that prevent unreleased features from being advertised. godfin.dev is the final canonical domain and godfin.vercel.app is the fallback. The older source commit 3a44f00 is still the deployed production website; checkout remains deliberately disabled. Candidate b62946e is not deployed and must not be promoted until all 10 migrations and the provider sandbox tests pass.</w:t>
       </w:r>
     </w:p>
     <w:p>
@@ -354,7 +354,7 @@
         </w:numPr>
       </w:pPr>
       <w:r>
-        <w:t>Dependency surfaces are separated into runtime, test, and frozen-build locks. The Gmail API client is an explicit runtime dependency. All four JavaScript workspaces and all three Python lock surfaces audit with no unaccepted known vulnerability; the qualified cryptography finding is documented in the signed evidence.</w:t>
+        <w:t>Dependency surfaces are separated into runtime, test, and frozen-build locks. The Gmail API client is an explicit runtime dependency. All four JavaScript workspaces and all three Python lock surfaces audit with no known vulnerability; cryptography is upgraded to the fixed 50.x line and the temporary exception has been removed.</w:t>
       </w:r>
     </w:p>
     <w:p>
@@ -402,7 +402,7 @@
         </w:numPr>
       </w:pPr>
       <w:r>
-        <w:t>Application and deployment evidence is current through commit 3a44f00 on codex/godfin-production-v5. The GitHub repository is verified PRIVATE and the exact commit is pushed. Entitlements, Cashfree lifetime upgrades, canonical-domain defaults, Gmail callback recovery, deterministic transaction enrichment, and standalone website contract snapshots are included.</w:t>
+        <w:t>Application-code evidence is current through immutable commit b62946e5958af1d37a00ff63ca7258805e59c357 on codex/godfin-production-v5. That commit is pushed. GitHub currently reports the repository PUBLIC and has not created an Actions run for the pushed SHA; this is an unresolved privacy/CI blocker, not a pass. Make it PRIVATE immediately after retaining the required exact-candidate CI evidence, and do not publish or promote any release in the meantime.</w:t>
       </w:r>
     </w:p>
     <w:p>
@@ -414,7 +414,7 @@
         </w:numPr>
       </w:pPr>
       <w:r>
-        <w:t>Desktop Gmail source recovery is installed: the exact external-browser callback reaches the OAuth handler instead of MISSING_LAUNCH_TRUST while ordinary routes still require the per-launch secret. The owner must now start a completely fresh Connect Gmail attempt; an old callback tab or stale OAuth state cannot be reused. oculusrexai@gmail.com and naraharikripa14@gmail.com are the intended Google test users. Connected status, first sync, restart, and reauthorization must be re-evidenced before this gate is marked complete.</w:t>
+        <w:t>Desktop Gmail recovery is implemented in candidate source b62946e but is not yet installed as a candidate package. Its exact external-browser callback uses a short-lived signed handoff bound to the active desktop launch; ordinary routes still require the launch secret. After packaging, the owner must start a completely fresh Connect Gmail attempt; an old callback tab or stale OAuth state cannot be reused. oculusrexai@gmail.com and naraharikripa14@gmail.com are the intended Google test users. Connected status, first sync, restart, reauthorization, and the seven-day soak must be evidenced before this gate is complete.</w:t>
       </w:r>
     </w:p>
     <w:p>
@@ -438,7 +438,7 @@
         </w:numPr>
       </w:pPr>
       <w:r>
-        <w:t>Public Gmail consent-screen review, Cashfree KYC/sandbox/live tests, Supabase migrations 0006 and 0007 deployment, Resend/DNS, final Google/Supabase canonical redirect verification, Apple/Windows certificates, R2, cross-platform clean-system evidence, dependency-license approval, GitHub Actions billing, and public-launch authorization are not yet complete.</w:t>
+        <w:t>Public Gmail consent-screen review, the fresh Gmail recovery/soak, Cashfree KYC/sandbox/live tests, remote application of all 10 Supabase migrations, Resend/DNS, final Google/Supabase canonical redirect verification, Apple/Windows certificates, R2, cross-platform clean-system evidence, dependency-license approval, independent parser/full pentesting, GitHub Actions execution, repository privacy restoration, and public-launch authorization are not yet complete.</w:t>
       </w:r>
     </w:p>
     <w:p>
@@ -614,7 +614,7 @@
                 <w:color w:val="172033"/>
                 <w:sz w:val="18"/>
               </w:rPr>
-              <w:t>GitHub Actions billing</w:t>
+              <w:t>GitHub Actions + repository privacy</w:t>
             </w:r>
           </w:p>
         </w:tc>
@@ -639,7 +639,7 @@
                 <w:color w:val="172033"/>
                 <w:sz w:val="18"/>
               </w:rPr>
-              <w:t>GitHub rejects every hosted CI job before step 1 because the account payment or Actions spending limit blocks runners.</w:t>
+              <w:t>No Actions run was created for pushed code SHA b62946e, and GitHub currently reports the repository PUBLIC.</w:t>
             </w:r>
           </w:p>
         </w:tc>
@@ -664,7 +664,7 @@
                 <w:color w:val="172033"/>
                 <w:sz w:val="18"/>
               </w:rPr>
-              <w:t>Open account Billing &amp; licensing; fix the payment method and create or raise a GitHub Actions budget that permits usage.</w:t>
+              <w:t>Follow Section 13.1 to enable runner usage and manually dispatch CI. After the exact run is green, change visibility to PRIVATE before any tag or release action.</w:t>
             </w:r>
           </w:p>
         </w:tc>
@@ -689,7 +689,7 @@
                 <w:color w:val="172033"/>
                 <w:sz w:val="18"/>
               </w:rPr>
-              <w:t>The exact private candidate CI run starts every job and finishes green.</w:t>
+              <w:t>The exact candidate run is green and the API reports PRIVATE.</w:t>
             </w:r>
           </w:p>
         </w:tc>
@@ -874,7 +874,7 @@
                 <w:color w:val="172033"/>
                 <w:sz w:val="18"/>
               </w:rPr>
-              <w:t>Complete KYC; apply migrations 0006/0007; configure sandbox keys and required webhook events.</w:t>
+              <w:t>Complete KYC; apply all 10 ordered migrations; configure sandbox keys and required webhook events.</w:t>
             </w:r>
           </w:p>
         </w:tc>
@@ -899,7 +899,7 @@
                 <w:color w:val="172033"/>
                 <w:sz w:val="18"/>
               </w:rPr>
-              <w:t>Replay-safe purchase, upgrade, refund, dispute, and email flows pass.</w:t>
+              <w:t>Replay-safe purchase, upgrade, refund, dispute, rate-limit, and one-email flows pass.</w:t>
             </w:r>
           </w:p>
         </w:tc>
@@ -2087,7 +2087,7 @@
           <w:color w:val="172033"/>
           <w:sz w:val="21"/>
         </w:rPr>
-        <w:t>Fully quit GODFIN, reopen /Applications/GODFIN.app, and begin a fresh Connect Gmail attempt from Settings. Do not reuse or refresh an old Google callback tab. Installed commit 3a44f00 allows only the exact 127.0.0.1 Gmail callback through this boundary and provides a fresh approval action when a state has expired; every ordinary backend route still requires the active desktop launch secret.</w:t>
+        <w:t>Fully quit GODFIN, reopen /Applications/GODFIN.app, and begin a fresh Connect Gmail attempt from Settings. Do not reuse or refresh an old Google callback tab. Candidate b62946e uses a short-lived signed, nonce-bearing OAuth handoff bound to the active desktop launch; every ordinary backend route still requires the active launch secret. Because b62946e is not yet packaged, complete this check only on a new package built from that exact candidate or a later documentation-only descendant.</w:t>
       </w:r>
     </w:p>
     <w:p>
@@ -2171,7 +2171,7 @@
         </w:numPr>
       </w:pPr>
       <w:r>
-        <w:t>Complete the localhost callback. The installed build now permits only the exact external-browser GET callback to pass without the per-launch secret; host/origin validation, one-time state, PKCE, session binding, and expiry remain enforced. Verify Settings changes to connected, run the initial sync against a test mailbox, and confirm imports are assigned only to configured active account routes.</w:t>
+        <w:t>Complete the localhost callback. The exact external-browser GET callback succeeds only when its short-lived signed state proves the active GODFIN launch; host/origin validation, nonce, one-time use, session binding, and expiry remain enforced. Verify Settings changes to connected, run the initial sync against a test mailbox, and confirm imports are assigned only to configured active account routes.</w:t>
       </w:r>
     </w:p>
     <w:p>
@@ -2183,7 +2183,7 @@
         </w:numPr>
       </w:pPr>
       <w:r>
-        <w:t>Disconnect Gmail, confirm the local token is removed, then reconnect and verify reauthorization. Tokens are encrypted in local SQLite using GODFIN's stable local key; OAuth state is hashed, installation-bound, expiring, PKCE-protected, and single-use.</w:t>
+        <w:t>Disconnect Gmail, confirm the local token is removed, then reconnect and verify reauthorization. Tokens are encrypted in GODFIN's local app storage using its stable local key; OAuth state is signed, launch-bound, expiring, and single-use.</w:t>
       </w:r>
     </w:p>
     <w:p>
@@ -2440,7 +2440,7 @@
         <w:pStyle w:val="Heading2"/>
       </w:pPr>
       <w:r>
-        <w:t>2.2 Test and apply Supabase migrations 0006 and 0007</w:t>
+        <w:t>2.2 Test and apply all 10 ordered Supabase migrations</w:t>
       </w:r>
     </w:p>
     <w:p>
@@ -2468,7 +2468,7 @@
           <w:color w:val="172033"/>
           <w:sz w:val="21"/>
         </w:rPr>
-        <w:t>The deployed website cannot safely provision Cashfree purchases and in-place upgrades until migrations 0006 and 0007 exist in Supabase. Keep CHECKOUT_ENABLED=false throughout this section. Both migrations are additive and preserve legacy purchase history, but a verified backup is still required before a production database change.</w:t>
+        <w:t>The deployed website cannot safely provision Cashfree purchases and in-place upgrades until every migration in website/supabase/migration-manifest.json exists remotely. Keep CHECKOUT_ENABLED=false throughout this section. The sequence is additive and preserves legacy purchase history, but a verified backup is still required before a production database change.</w:t>
       </w:r>
     </w:p>
     <w:p>
@@ -2528,7 +2528,7 @@
         </w:numPr>
       </w:pPr>
       <w:r>
-        <w:t>Run: supabase test db --local supabase/tests. Confirm all files, including 0006_cashfree_commerce.test.sql and 0007_cashfree_license_upgrades.test.sql, finish successfully with no failed pgTAP assertion.</w:t>
+        <w:t>Run: supabase test db --local supabase/tests. Confirm all files, including 0006_cashfree_commerce.test.sql, 0007_cashfree_license_upgrades.test.sql, and 0008_cashfree_email_delivery_claim.test.sql, finish successfully with no failed pgTAP assertion.</w:t>
       </w:r>
     </w:p>
     <w:p>
@@ -2588,7 +2588,7 @@
         </w:numPr>
       </w:pPr>
       <w:r>
-        <w:t>Run: supabase migration list --linked. Migrations 0006 and 0007 should appear locally. Note which are missing remotely.</w:t>
+        <w:t>Run: supabase migration list --linked. Compare the local and remote columns against all 10 names in website/supabase/migration-manifest.json. Note every missing remote migration, including the two 2026082403 rate-limit fixes and 20260824211115_cashfree_email_delivery_claim.sql.</w:t>
       </w:r>
     </w:p>
     <w:p>
@@ -2600,7 +2600,7 @@
         </w:numPr>
       </w:pPr>
       <w:r>
-        <w:t>Run: supabase db push --linked --dry-run. Read the output and confirm it proposes only the missing ordered migration files, ending with 0007_cashfree_license_upgrades.sql.</w:t>
+        <w:t>Run: supabase db push --linked --dry-run. Read the output and confirm it proposes only the missing ordered migration files, ending with 20260824211115_cashfree_email_delivery_claim.sql.</w:t>
       </w:r>
     </w:p>
     <w:p>
@@ -2624,7 +2624,7 @@
         </w:numPr>
       </w:pPr>
       <w:r>
-        <w:t>Run: supabase migration list --linked again. Confirm 0006 and 0007 appear in both the local and remote columns. Leave CHECKOUT_ENABLED=false until the sandbox matrix passes.</w:t>
+        <w:t>Run: supabase migration list --linked again. Confirm all 10 names appear in both the local and remote columns. Leave CHECKOUT_ENABLED=false until the pgTAP, isolation, and Cashfree sandbox matrices pass.</w:t>
       </w:r>
     </w:p>
     <w:p>
@@ -3472,7 +3472,7 @@
         </w:numPr>
       </w:pPr>
       <w:r>
-        <w:t>Keep CHECKOUT_ENABLED=false until Supabase migrations 0006 and 0007 are applied and the complete sandbox matrix below passes.</w:t>
+        <w:t>Keep CHECKOUT_ENABLED=false until all 10 ordered Supabase migrations are applied and the complete sandbox matrix below passes.</w:t>
       </w:r>
     </w:p>
     <w:p>
@@ -4002,7 +4002,7 @@
           <w:color w:val="172033"/>
           <w:sz w:val="21"/>
         </w:rPr>
-        <w:t>On 24 August 2026, source commit 3a44f00 was deployed to Vercel production as deployment dpl_HjwgU9aBfaBvdcFH8aiR981mgVDY. https://godfin.dev and https://godfin.vercel.app return HTTP 200; https://www.godfin.dev permanently redirects to the apex; HSTS and the Cashfree-only CSP are present; hello@godfin.dev is the only public contact; and checkout fails closed with HTTP 503. This verifies the domain and safe production deployment, not Cashfree credentials, migrations 0006/0007, or payment acceptance.</w:t>
+        <w:t>On 24 August 2026, older source commit 3a44f00 was deployed to Vercel production as deployment dpl_HjwgU9aBfaBvdcFH8aiR981mgVDY. https://godfin.dev and https://godfin.vercel.app return HTTP 200; https://www.godfin.dev permanently redirects to the apex; HSTS and the Cashfree-only CSP are present; hello@godfin.dev is the only public contact; and checkout fails closed with HTTP 503. This verifies the domain and safe-disable posture only—not candidate b62946e, Cashfree credentials, all 10 migrations, or payment acceptance.</w:t>
       </w:r>
     </w:p>
     <w:p>
@@ -4098,7 +4098,7 @@
         </w:numPr>
       </w:pPr>
       <w:r>
-        <w:t>The 3a44f00 production deployment is complete and intentionally fail-closed. After any provider-variable change, keep CHECKOUT_ENABLED=false, deploy a preview, and test account sign-in, pricing, disabled checkout behavior, waitlist, privacy, terms, and license verification.</w:t>
+        <w:t>The 3a44f00 production deployment is intentionally fail-closed and predates candidate b62946e. After any provider-variable change, keep CHECKOUT_ENABLED=false, deploy a preview from the exact candidate, and test account sign-in, pricing, disabled checkout behavior, waitlist, privacy, terms, and license verification.</w:t>
       </w:r>
     </w:p>
     <w:p>
@@ -4110,7 +4110,7 @@
         </w:numPr>
       </w:pPr>
       <w:r>
-        <w:t>After Supabase migrations 0006/0007 and the Cashfree sandbox matrix pass, run the repository website checks again and deploy the exact tested SHA to production. A production deployment does not authorize public marketing or customer checkout.</w:t>
+        <w:t>After all 10 Supabase migrations and the Cashfree sandbox matrix pass, run the repository website checks again and deploy the exact tested SHA to production. A production deployment does not authorize public marketing or customer checkout.</w:t>
       </w:r>
     </w:p>
     <w:p>
@@ -7005,7 +7005,7 @@
         </w:numPr>
       </w:pPr>
       <w:r>
-        <w:t>Backend: 966 tests pass under clean Python 3.12, including auth/PIN, encryption, migrations, backups, merchant upsert, licenses, bounded background-job lock recovery, exact response contracts for all 182 API operations, Gmail OAuth/restart handling, goal ledgers and FD/RD suggestions, simulation reference vectors, recurring detection, atomic accounts, package privacy, CA tax pack, classification memory, enrichment abstention/relationships, performance, net worth, behavior insights, reward-pilot redaction, and UTC finance-fetch regressions.</w:t>
+        <w:t>Backend: 1,008 tests pass under clean Python 3.12 in 82.99 seconds on candidate b62946e, including auth/PIN, encryption, migrations, backups, merchant upsert, licenses, local trust, Gmail coverage/restart handling, exact response contracts for all 182 API operations, certified statement parsers, hostile-file preflight, goal/simulation/recurring behavior, CA tax pack, classification memory, performance, net worth, behavior insights, reward-pilot redaction, and UTC finance-fetch regressions.</w:t>
       </w:r>
     </w:p>
     <w:p>
@@ -7017,7 +7017,7 @@
         </w:numPr>
       </w:pPr>
       <w:r>
-        <w:t>Frontend: lint, accessibility checks, authentication checks, and production build pass. Focused Playwright covers PIN entry, portal calculation help, goals, recurring re-detection, external pricing, settings disclosure, and CA tax-pack controls.</w:t>
+        <w:t>Independent finance oracle: golden_ledger_v1.json is evaluated by a standard-library-only oracle that imports no application calculation code. Dashboard, transactions, cash flow, FY reports, encrypted CA pack, income, profile, subscriptions, goals, net worth, audit aggregates, and AI non-authority agree with the independently expected values.</w:t>
       </w:r>
     </w:p>
     <w:p>
@@ -7029,7 +7029,7 @@
         </w:numPr>
       </w:pPr>
       <w:r>
-        <w:t>Website: entitlement/payment contract verification, five Cashfree tests, three lifetime-upgrade tests, seven ordered migration hashes, production build, real-app product chapters, reduced-motion fallbacks, mobile overflow, lifetime/no-bundled-credit pricing, security headers, checkout safe-disable behavior, and dependency audit pass. The previously measured production URL scored Lighthouse performance 99, accessibility 100, and SEO 100, with LCP 1.73 seconds and CLS 0; repeat this measurement after deploying the exact final SHA.</w:t>
+        <w:t>Private parser fixtures: owner-supplied SBI, HDFC, and Kotak PDFs are recognized as sbi_savings, hdfc_savings, and kotak_savings and reconcile exactly to 29, 306, and 497 rows. Only hashes and aggregate evidence are retained; the PDFs are not copied into the repository.</w:t>
       </w:r>
     </w:p>
     <w:p>
@@ -7041,7 +7041,7 @@
         </w:numPr>
       </w:pPr>
       <w:r>
-        <w:t>Dependencies: runtime, test, and build Python locks are separated and hash-locked; frontend, website, desktop, and Playwright workspaces use npm ci. Audits report zero unaccepted known vulnerabilities. The Gmail API client is explicit in runtime requirements.</w:t>
+        <w:t>Frontend: lint, static accessibility/contrast, memory-only authentication, build-identity, secure-password, tier-navigation, and production-build gates pass. The deterministic inventory records 422 controls across 19 route scopes. The three-engine Playwright matrix is configured but was not executed locally under the owner's no-computer-use preference.</w:t>
       </w:r>
     </w:p>
     <w:p>
@@ -7053,7 +7053,7 @@
         </w:numPr>
       </w:pPr>
       <w:r>
-        <w:t>Supply chain: deterministic CycloneDX 1.6 SBOM and third-party notices cover 1,035 unique components with zero unresolved license identifiers. Human review of conditional licenses remains a required fail-closed release gate.</w:t>
+        <w:t>Website: entitlement/payment contract verification, five Cashfree tests, three strict webhook-body tests, three lifetime-upgrade tests, 10 ordered migration hashes, production build, real-app product chapters, reduced-motion fallbacks, lifetime/no-bundled-credit pricing, security headers, checkout safe-disable behavior, and dependency audit pass. The previously measured production URL scored Lighthouse performance 99, accessibility 100, and SEO 100, with LCP 1.73 seconds and CLS 0; repeat this measurement after deploying the exact final SHA.</w:t>
       </w:r>
     </w:p>
     <w:p>
@@ -7065,7 +7065,7 @@
         </w:numPr>
       </w:pPr>
       <w:r>
-        <w:t>Release engineering: 12/12 desktop update/release workflow tests and 7/7 package privacy checks pass. All GitHub Actions are pinned to verified 40-character commit SHAs, and release provenance binds the exact commit, tag, package version, SBOM, notices, and checksums.</w:t>
+        <w:t>Dependencies: runtime, test, and build Python locks are separated and hash-locked; frontend, website, desktop, and Playwright workspaces use npm ci. Audits report zero unaccepted known vulnerabilities. The Gmail API client is explicit in runtime requirements.</w:t>
       </w:r>
     </w:p>
     <w:p>
@@ -7077,7 +7077,7 @@
         </w:numPr>
       </w:pPr>
       <w:r>
-        <w:t>Local packaging: the fresh 3a44f00 macOS arm64 candidate passed package verification with first start 2.997 seconds, restart 1.033 seconds, idle memory 602.9 MB across five processes, database preservation, local trust boundary, maintenance boundary, bundled-backend auto-start, and Gmail callback-path checks. DMG SHA-256: f960c103a8c584a9d45e31d39258a7149ae509dac35a6cb02914c52e6057b36b. ZIP SHA-256: 00b91ea7ce3ed5fbad5dc62bff03deae312a95ea962956fe9dc18651b57e4e0a. The build is ad-hoc and not Apple-notarized.</w:t>
+        <w:t>Supply chain: deterministic CycloneDX 1.6 SBOM and third-party notices cover 1,035 unique components with zero unresolved license identifiers. Human review of conditional licenses remains a required fail-closed release gate.</w:t>
       </w:r>
     </w:p>
     <w:p>
@@ -7089,7 +7089,31 @@
         </w:numPr>
       </w:pPr>
       <w:r>
-        <w:t>Secrets: gitleaks scans the complete cleaned history; no real statements, databases, tokens, keys, or customer screenshots are tracked.</w:t>
+        <w:t>Release engineering: 12/12 desktop update/release workflow tests and 11/11 package privacy checks pass. All GitHub Actions are pinned to verified 40-character commit SHAs, checksum-pinned Gitleaks is installed in CI, and release provenance binds the exact commit, tag, package version, SBOM, notices, and checksums.</w:t>
+      </w:r>
+    </w:p>
+    <w:p>
+      <w:pPr>
+        <w:keepLines/>
+        <w:numPr>
+          <w:ilvl w:val="0"/>
+          <w:numId w:val="12"/>
+        </w:numPr>
+      </w:pPr>
+      <w:r>
+        <w:t>Local packaging: the older 3a44f00 macOS arm64 build passed package verification with first start 2.997 seconds, restart 1.033 seconds, idle memory 602.9 MB across five processes, database preservation, local trust boundary, maintenance boundary, bundled-backend auto-start, and Gmail callback-path checks. DMG SHA-256: f960c103a8c584a9d45e31d39258a7149ae509dac35a6cb02914c52e6057b36b. ZIP SHA-256: 00b91ea7ce3ed5fbad5dc62bff03deae312a95ea962956fe9dc18651b57e4e0a. This evidence does not cover b62946e; a new signed/notarized package is required.</w:t>
+      </w:r>
+    </w:p>
+    <w:p>
+      <w:pPr>
+        <w:keepLines/>
+        <w:numPr>
+          <w:ilvl w:val="0"/>
+          <w:numId w:val="12"/>
+        </w:numPr>
+      </w:pPr>
+      <w:r>
+        <w:t>Secrets: Gitleaks scanned the complete cleaned 154-commit history and the staged remediation diff with no leaks. No real statements, databases, tokens, keys, or customer screenshots are tracked.</w:t>
       </w:r>
     </w:p>
     <w:p>
@@ -7153,7 +7177,7 @@
           <w:color w:val="172033"/>
           <w:sz w:val="21"/>
         </w:rPr>
-        <w:t>Do not tag a candidate until the CI run for the exact commit is green. Current jobs do not reach step 1 because GitHub reports a failed account payment or Actions spending limit. A local pass is necessary but not sufficient.</w:t>
+        <w:t>Do not tag a candidate until the CI run for the exact commit is green. No workflow run was created for pushed code SHA b62946e. A manual workflow-dispatch trigger is now available, but GitHub account/Actions availability must be repaired first. A local pass is necessary but not sufficient.</w:t>
       </w:r>
     </w:p>
     <w:p>
@@ -7209,7 +7233,7 @@
         </w:numPr>
       </w:pPr>
       <w:r>
-        <w:t>Return to https://github.com/oculusrex14/GODFIN/actions. Open the newest failed CI run and choose Re-run all jobs. If the button is missing, push no new code; ask Codex to re-run the existing private workflow through GitHub CLI after billing is fixed.</w:t>
+        <w:t>Return to https://github.com/oculusrex14/GODFIN/actions. Open CI, choose Run workflow, select codex/godfin-production-v5, and confirm. If the Run workflow button is unavailable, verify Actions are enabled for the repository and that the workflow exists on the selected branch; do not create another code change merely to trigger it.</w:t>
       </w:r>
     </w:p>
     <w:p>
@@ -7233,7 +7257,7 @@
         </w:numPr>
       </w:pPr>
       <w:r>
-        <w:t>If GitHub still shows the same billing annotation after payment and budget changes, wait up to 15 minutes, sign out/in, and contact GitHub Billing Support. Do not make the repository public to obtain free Actions minutes.</w:t>
+        <w:t>If GitHub still creates no run after payment, budget, and Actions-policy checks, wait up to 15 minutes, sign out/in, and contact GitHub Support. Do not tag, publish, or promote a release. As soon as the exact run is green, change Settings → General → Danger Zone → Change repository visibility to PRIVATE and confirm the API reports PRIVATE.</w:t>
       </w:r>
     </w:p>
     <w:p>
@@ -8165,7 +8189,7 @@
                 <w:color w:val="172033"/>
                 <w:sz w:val="18"/>
               </w:rPr>
-              <w:t>Codex + owner</w:t>
+              <w:t>Owner</w:t>
             </w:r>
           </w:p>
         </w:tc>
@@ -8215,7 +8239,7 @@
                 <w:color w:val="172033"/>
                 <w:sz w:val="18"/>
               </w:rPr>
-              <w:t>Installed 3a44f00 handles the trusted localhost callback and fresh-state recovery. Owner must complete a fresh read-only authorization, sync, restart, disconnect, and reconnect check.</w:t>
+              <w:t>Build/install b62946e or a documentation-only descendant, then complete fresh read-only authorization, sync, restart, disconnect, reconnect, and seven-day soak.</w:t>
             </w:r>
           </w:p>
         </w:tc>
@@ -8969,7 +8993,7 @@
                 <w:color w:val="172033"/>
                 <w:sz w:val="18"/>
               </w:rPr>
-              <w:t>Local macOS arm64 package proof</w:t>
+              <w:t>Exact-candidate macOS arm64 package proof</w:t>
             </w:r>
           </w:p>
         </w:tc>
@@ -8994,7 +9018,6 @@
                 <w:color w:val="172033"/>
                 <w:sz w:val="18"/>
               </w:rPr>
-              <w:t>Codex</w:t>
             </w:r>
           </w:p>
         </w:tc>
@@ -9019,7 +9042,7 @@
                 <w:color w:val="172033"/>
                 <w:sz w:val="18"/>
               </w:rPr>
-              <w:t>☒</w:t>
+              <w:t>☐</w:t>
             </w:r>
           </w:p>
         </w:tc>
@@ -9044,7 +9067,7 @@
                 <w:color w:val="172033"/>
                 <w:sz w:val="18"/>
               </w:rPr>
-              <w:t>Locked local candidate meets startup, memory, privacy, persistence, and trust-boundary budgets; not notarized.</w:t>
+              <w:t>Older 3a44f00 evidence exists, but b62946e or a documentation-only descendant must be rebuilt, privacy-verified, and notarized.</w:t>
             </w:r>
           </w:p>
         </w:tc>
@@ -9282,7 +9305,7 @@
                 <w:color w:val="172033"/>
                 <w:sz w:val="18"/>
               </w:rPr>
-              <w:t>GitHub Actions runner availability</w:t>
+              <w:t>GitHub Actions + repository privacy</w:t>
             </w:r>
           </w:p>
         </w:tc>
@@ -9356,7 +9379,7 @@
                 <w:color w:val="172033"/>
                 <w:sz w:val="18"/>
               </w:rPr>
-              <w:t>Resolve account payment/Actions budget block; retain one exact-commit run with all jobs green.</w:t>
+              <w:t>Run the exact candidate through manual dispatch; retain all-green evidence; then verify oculusrex14/GODFIN is PRIVATE.</w:t>
             </w:r>
           </w:p>
         </w:tc>

</xml_diff>

<commit_message>
docs(release): record green private candidate evidence [GF-FINAL-006]
</commit_message>
<xml_diff>
--- a/docs/GODFIN_OWNER_COMPLETION_RUNBOOK.docx
+++ b/docs/GODFIN_OWNER_COMPLETION_RUNBOOK.docx
@@ -64,7 +64,7 @@
           <w:color w:val="667085"/>
           <w:sz w:val="20"/>
         </w:rPr>
-        <w:t>Version 2.9  •  25 August 2026  •  oculusrex14/GODFIN</w:t>
+        <w:t>Version 3.0  •  25 August 2026  •  oculusrex14/GODFIN</w:t>
         <w:br/>
         <w:t>Production branch: codex/godfin-production-v5</w:t>
       </w:r>
@@ -222,7 +222,7 @@
           <w:color w:val="172033"/>
           <w:sz w:val="21"/>
         </w:rPr>
-        <w:t>Production code candidate b62946e5958af1d37a00ff63ca7258805e59c357 is pushed on codex/godfin-production-v5. The clean Python 3.12 baseline is 1,008 passing backend tests. All 182 API operations publish an explicit success or intentional terminal status, a non-empty media-specific success schema, and the shared error contract. Frontend lint, accessibility, authentication, content, and production-build gates pass; the generated inventory covers 422 interactive controls across 19 route scopes. Five Cashfree contract tests, three webhook-body security tests, three lifetime-upgrade tests, the website production build, 12 desktop release/update tests, and 11 package-privacy tests pass.</w:t>
+        <w:t>Production code candidate 3a26090a52531d39481b7cdff305d3d6a7812542 is pushed on codex/godfin-production-v5. GitHub Actions run 32787609617 completed successfully against that exact commit on 25 August 2026. Its six green jobs include the complete 1,008-test Python 3.12 backend suite, dependency and full-history secret audits, frontend and website production gates, desktop privacy/update audits, production smoke tests, and Chromium/Firefox/WebKit accessibility and website matrices. All 182 API operations publish an explicit success or intentional terminal status, a non-empty media-specific success schema, and the shared error contract.</w:t>
       </w:r>
     </w:p>
     <w:p>
@@ -234,7 +234,7 @@
         </w:numPr>
       </w:pPr>
       <w:r>
-        <w:t>Production repository URL: https://github.com/oculusrex14/GODFIN. GitHub currently reports PUBLIC; the privacy gate is open.</w:t>
+        <w:t>Production repository URL: https://github.com/oculusrex14/GODFIN. The GitHub API reports PRIVATE as of 25 August 2026; no public repository or release was created.</w:t>
       </w:r>
     </w:p>
     <w:p>
@@ -294,7 +294,7 @@
         </w:numPr>
       </w:pPr>
       <w:r>
-        <w:t>The website product tour uses real React application captures generated only from synthetic data, muted WebM/MP4 media with reduced-motion fallbacks, and build-time checks that prevent unreleased features from being advertised. godfin.dev is the final canonical domain and godfin.vercel.app is the fallback. The older source commit 3a44f00 is still the deployed production website; checkout remains deliberately disabled. Candidate b62946e is not deployed and must not be promoted until all 10 migrations and the provider sandbox tests pass.</w:t>
+        <w:t>The website product tour uses real React application captures generated only from synthetic data, muted WebM/MP4 media with reduced-motion fallbacks, and build-time checks that prevent unreleased features from being advertised. godfin.dev is the final canonical domain and godfin.vercel.app is the fallback. The older source commit 3a44f00 is still the deployed production website; checkout remains deliberately disabled. Candidate 3a26090 is not deployed and must not be promoted until all 10 migrations and the provider sandbox tests pass.</w:t>
       </w:r>
     </w:p>
     <w:p>
@@ -402,7 +402,7 @@
         </w:numPr>
       </w:pPr>
       <w:r>
-        <w:t>Application-code evidence is current through immutable commit b62946e5958af1d37a00ff63ca7258805e59c357 on codex/godfin-production-v5. That commit is pushed. GitHub currently reports the repository PUBLIC and has not created an Actions run for the pushed SHA; this is an unresolved privacy/CI blocker, not a pass. Make it PRIVATE immediately after retaining the required exact-candidate CI evidence, and do not publish or promote any release in the meantime.</w:t>
+        <w:t>Application-code evidence is current through immutable commit 3a26090a52531d39481b7cdff305d3d6a7812542 on codex/godfin-production-v5. GitHub Actions run 32787609617 passed all six jobs on that exact SHA, including all 1,008 backend tests and the three-engine browser matrices. The repository was then returned to PRIVATE and verified through the GitHub API. This closes the source-level hosted-CI and repository-privacy gates; it does not authorize a tag, installer, deployment, payment acceptance, update promotion, or public launch.</w:t>
       </w:r>
     </w:p>
     <w:p>
@@ -414,7 +414,7 @@
         </w:numPr>
       </w:pPr>
       <w:r>
-        <w:t>Desktop Gmail recovery is implemented in candidate source b62946e but is not yet installed as a candidate package. Its exact external-browser callback uses a short-lived signed handoff bound to the active desktop launch; ordinary routes still require the launch secret. After packaging, the owner must start a completely fresh Connect Gmail attempt; an old callback tab or stale OAuth state cannot be reused. oculusrexai@gmail.com and naraharikripa14@gmail.com are the intended Google test users. Connected status, first sync, restart, reauthorization, and the seven-day soak must be evidenced before this gate is complete.</w:t>
+        <w:t>Desktop Gmail recovery is implemented in candidate source 3a26090 but is not yet installed as a candidate package. Its exact external-browser callback uses a short-lived signed handoff bound to the active desktop launch; ordinary routes still require the launch secret. After packaging, the owner must start a completely fresh Connect Gmail attempt; an old callback tab or stale OAuth state cannot be reused. oculusrexai@gmail.com and naraharikripa14@gmail.com are the intended Google test users. Connected status, first sync, restart, reauthorization, and the seven-day soak must be evidenced before this gate is complete.</w:t>
       </w:r>
     </w:p>
     <w:p>
@@ -438,7 +438,7 @@
         </w:numPr>
       </w:pPr>
       <w:r>
-        <w:t>Public Gmail consent-screen review, the fresh Gmail recovery/soak, Cashfree KYC/sandbox/live tests, remote application of all 10 Supabase migrations, Resend/DNS, final Google/Supabase canonical redirect verification, Apple/Windows certificates, R2, cross-platform clean-system evidence, dependency-license approval, independent parser/full pentesting, GitHub Actions execution, repository privacy restoration, and public-launch authorization are not yet complete.</w:t>
+        <w:t>Public Gmail consent-screen review, the fresh Gmail recovery/soak, Cashfree KYC/sandbox/live tests, remote application of all 10 Supabase migrations, Resend/DNS, final Google/Supabase canonical redirect verification, Apple/Windows certificates, R2, cross-platform clean-system evidence, dependency-license approval, independent parser/full pentesting, native assistive-technology checks, and public-launch authorization are not yet complete.</w:t>
       </w:r>
     </w:p>
     <w:p>
@@ -639,7 +639,7 @@
                 <w:color w:val="172033"/>
                 <w:sz w:val="18"/>
               </w:rPr>
-              <w:t>No Actions run was created for pushed code SHA b62946e, and GitHub currently reports the repository PUBLIC.</w:t>
+              <w:t>Closed on 25 August 2026 for source candidate 3a26090.</w:t>
             </w:r>
           </w:p>
         </w:tc>
@@ -664,7 +664,7 @@
                 <w:color w:val="172033"/>
                 <w:sz w:val="18"/>
               </w:rPr>
-              <w:t>Follow Section 13.1 to enable runner usage and manually dispatch CI. After the exact run is green, change visibility to PRIVATE before any tag or release action.</w:t>
+              <w:t>Keep the repository private and rerun CI after any later code or evidence change.</w:t>
             </w:r>
           </w:p>
         </w:tc>
@@ -689,7 +689,7 @@
                 <w:color w:val="172033"/>
                 <w:sz w:val="18"/>
               </w:rPr>
-              <w:t>The exact candidate run is green and the API reports PRIVATE.</w:t>
+              <w:t>Actions run 32787609617 is green on exact SHA 3a26090; GitHub API reports PRIVATE.</w:t>
             </w:r>
           </w:p>
         </w:tc>
@@ -1454,7 +1454,7 @@
                 <w:color w:val="172033"/>
                 <w:sz w:val="18"/>
               </w:rPr>
-              <w:t>Browser matrix</w:t>
+              <w:t>Native browser and assistive technology</w:t>
             </w:r>
           </w:p>
         </w:tc>
@@ -1479,7 +1479,7 @@
                 <w:color w:val="172033"/>
                 <w:sz w:val="18"/>
               </w:rPr>
-              <w:t>Twelve Chromium, Firefox, and WebKit cases enumerate locally, but hosted jobs cannot start until GitHub Actions billing is restored.</w:t>
+              <w:t>Hosted Chromium, Firefox, and WebKit suites are green; native Safari/Edge and VoiceOver/NVDA/Orca acceptance still require supported systems.</w:t>
             </w:r>
           </w:p>
         </w:tc>
@@ -1504,7 +1504,7 @@
                 <w:color w:val="172033"/>
                 <w:sz w:val="18"/>
               </w:rPr>
-              <w:t>Fix Actions billing first; then run CI plus supported Chrome, Safari, Firefox, and Edge acceptance flows.</w:t>
+              <w:t>Run the manual native browser, keyboard, zoom, and screen-reader matrix on the exact signed packages.</w:t>
             </w:r>
           </w:p>
         </w:tc>
@@ -1529,7 +1529,7 @@
                 <w:color w:val="172033"/>
                 <w:sz w:val="18"/>
               </w:rPr>
-              <w:t>Green run, screenshots, traces, accessibility, and isolation evidence are archived.</w:t>
+              <w:t>Screenshots, traces, accessibility results, and isolation evidence are archived.</w:t>
             </w:r>
           </w:p>
         </w:tc>
@@ -2087,7 +2087,7 @@
           <w:color w:val="172033"/>
           <w:sz w:val="21"/>
         </w:rPr>
-        <w:t>Fully quit GODFIN, reopen /Applications/GODFIN.app, and begin a fresh Connect Gmail attempt from Settings. Do not reuse or refresh an old Google callback tab. Candidate b62946e uses a short-lived signed, nonce-bearing OAuth handoff bound to the active desktop launch; every ordinary backend route still requires the active launch secret. Because b62946e is not yet packaged, complete this check only on a new package built from that exact candidate or a later documentation-only descendant.</w:t>
+        <w:t>Fully quit GODFIN, reopen /Applications/GODFIN.app, and begin a fresh Connect Gmail attempt from Settings. Do not reuse or refresh an old Google callback tab. Candidate 3a26090 uses a short-lived signed, nonce-bearing OAuth handoff bound to the active desktop launch; every ordinary backend route still requires the active launch secret. Because 3a26090 is not yet packaged, complete this check only on a new package built from that exact candidate or a later documentation-only descendant.</w:t>
       </w:r>
     </w:p>
     <w:p>
@@ -4002,7 +4002,7 @@
           <w:color w:val="172033"/>
           <w:sz w:val="21"/>
         </w:rPr>
-        <w:t>On 24 August 2026, older source commit 3a44f00 was deployed to Vercel production as deployment dpl_HjwgU9aBfaBvdcFH8aiR981mgVDY. https://godfin.dev and https://godfin.vercel.app return HTTP 200; https://www.godfin.dev permanently redirects to the apex; HSTS and the Cashfree-only CSP are present; hello@godfin.dev is the only public contact; and checkout fails closed with HTTP 503. This verifies the domain and safe-disable posture only—not candidate b62946e, Cashfree credentials, all 10 migrations, or payment acceptance.</w:t>
+        <w:t>On 24 August 2026, older source commit 3a44f00 was deployed to Vercel production as deployment dpl_HjwgU9aBfaBvdcFH8aiR981mgVDY. https://godfin.dev and https://godfin.vercel.app return HTTP 200; https://www.godfin.dev permanently redirects to the apex; HSTS and the Cashfree-only CSP are present; hello@godfin.dev is the only public contact; and checkout fails closed with HTTP 503. This verifies the domain and safe-disable posture only—not candidate 3a26090, Cashfree credentials, all 10 migrations, or payment acceptance.</w:t>
       </w:r>
     </w:p>
     <w:p>
@@ -4098,7 +4098,7 @@
         </w:numPr>
       </w:pPr>
       <w:r>
-        <w:t>The 3a44f00 production deployment is intentionally fail-closed and predates candidate b62946e. After any provider-variable change, keep CHECKOUT_ENABLED=false, deploy a preview from the exact candidate, and test account sign-in, pricing, disabled checkout behavior, waitlist, privacy, terms, and license verification.</w:t>
+        <w:t>The 3a44f00 production deployment is intentionally fail-closed and predates candidate 3a26090. After any provider-variable change, keep CHECKOUT_ENABLED=false, deploy a preview from the exact candidate, and test account sign-in, pricing, disabled checkout behavior, waitlist, privacy, terms, and license verification.</w:t>
       </w:r>
     </w:p>
     <w:p>
@@ -7005,7 +7005,7 @@
         </w:numPr>
       </w:pPr>
       <w:r>
-        <w:t>Backend: 1,008 tests pass under clean Python 3.12 in 82.99 seconds on candidate b62946e, including auth/PIN, encryption, migrations, backups, merchant upsert, licenses, local trust, Gmail coverage/restart handling, exact response contracts for all 182 API operations, certified statement parsers, hostile-file preflight, goal/simulation/recurring behavior, CA tax pack, classification memory, performance, net worth, behavior insights, reward-pilot redaction, and UTC finance-fetch regressions.</w:t>
+        <w:t>Backend: all 1,008 tests passed in GitHub Actions run 32787609617 under clean Python 3.12 on exact candidate 3a26090, including auth/PIN, encryption, migrations, backups, merchant upsert, licenses, local trust, Gmail coverage/restart handling, exact response contracts for all 182 API operations, certified statement parsers, hostile-file preflight, goal/simulation/recurring behavior, CA tax pack, classification memory, performance, net worth, behavior insights, reward-pilot redaction, and UTC finance-fetch regressions.</w:t>
       </w:r>
     </w:p>
     <w:p>
@@ -7041,7 +7041,7 @@
         </w:numPr>
       </w:pPr>
       <w:r>
-        <w:t>Frontend: lint, static accessibility/contrast, memory-only authentication, build-identity, secure-password, tier-navigation, and production-build gates pass. The deterministic inventory records 422 controls across 19 route scopes. The three-engine Playwright matrix is configured but was not executed locally under the owner's no-computer-use preference.</w:t>
+        <w:t>Frontend: lint, static accessibility/contrast, memory-only authentication, build-identity, secure-password, tier-navigation, and production-build gates pass. The deterministic inventory records 422 controls across 19 route scopes. GitHub Actions run 32787609617 also passed the production smoke and accessibility suites in Chromium, Firefox, and WebKit; native screen-reader and signed-package interaction remain separate gates.</w:t>
       </w:r>
     </w:p>
     <w:p>
@@ -7101,7 +7101,7 @@
         </w:numPr>
       </w:pPr>
       <w:r>
-        <w:t>Local packaging: the older 3a44f00 macOS arm64 build passed package verification with first start 2.997 seconds, restart 1.033 seconds, idle memory 602.9 MB across five processes, database preservation, local trust boundary, maintenance boundary, bundled-backend auto-start, and Gmail callback-path checks. DMG SHA-256: f960c103a8c584a9d45e31d39258a7149ae509dac35a6cb02914c52e6057b36b. ZIP SHA-256: 00b91ea7ce3ed5fbad5dc62bff03deae312a95ea962956fe9dc18651b57e4e0a. This evidence does not cover b62946e; a new signed/notarized package is required.</w:t>
+        <w:t>Local packaging: the older 3a44f00 macOS arm64 build passed package verification with first start 2.997 seconds, restart 1.033 seconds, idle memory 602.9 MB across five processes, database preservation, local trust boundary, maintenance boundary, bundled-backend auto-start, and Gmail callback-path checks. DMG SHA-256: f960c103a8c584a9d45e31d39258a7149ae509dac35a6cb02914c52e6057b36b. ZIP SHA-256: 00b91ea7ce3ed5fbad5dc62bff03deae312a95ea962956fe9dc18651b57e4e0a. This evidence does not cover 3a26090; a new signed/notarized package is required.</w:t>
       </w:r>
     </w:p>
     <w:p>
@@ -7157,16 +7157,16 @@
         <w:keepLines/>
         <w:spacing w:before="100" w:after="160" w:line="288" w:lineRule="auto"/>
         <w:ind w:left="115" w:right="115"/>
-        <w:shd w:fill="FFF4D8"/>
+        <w:shd w:fill="EAF7EF"/>
         <w:pBdr>
-          <w:left w:val="single" w:sz="18" w:space="8" w:color="7A5A00"/>
+          <w:left w:val="single" w:sz="18" w:space="8" w:color="17663A"/>
         </w:pBdr>
       </w:pPr>
       <w:r>
         <w:rPr>
           <w:rFonts w:ascii="Calibri" w:hAnsi="Calibri"/>
           <w:b/>
-          <w:color w:val="7A5A00"/>
+          <w:color w:val="17663A"/>
           <w:sz w:val="21"/>
         </w:rPr>
         <w:t xml:space="preserve">CI RELEASE GATE  </w:t>
@@ -7177,7 +7177,7 @@
           <w:color w:val="172033"/>
           <w:sz w:val="21"/>
         </w:rPr>
-        <w:t>Do not tag a candidate until the CI run for the exact commit is green. No workflow run was created for pushed code SHA b62946e. A manual workflow-dispatch trigger is now available, but GitHub account/Actions availability must be repaired first. A local pass is necessary but not sufficient.</w:t>
+        <w:t>Source candidate 3a26090 passed all six jobs in GitHub Actions run 32787609617, including the full backend suite, supply-chain and secret checks, desktop audits, website/browser matrices, and Chromium/Firefox/WebKit app accessibility. The repository API then confirmed PRIVATE. Any later code change requires a new exact-SHA green run before tagging; source CI does not replace signed-package, provider, legal, or launch authorization gates.</w:t>
       </w:r>
     </w:p>
     <w:p>
@@ -7185,7 +7185,7 @@
         <w:pStyle w:val="Heading2"/>
       </w:pPr>
       <w:r>
-        <w:t>13.1 Restore GitHub Actions in plain language</w:t>
+        <w:t>13.1 Preserve the verified private CI gate</w:t>
       </w:r>
     </w:p>
     <w:p>
@@ -7197,7 +7197,7 @@
         </w:numPr>
       </w:pPr>
       <w:r>
-        <w:t>Open https://github.com/settings/billing in the GitHub account that owns oculusrex14/GODFIN. Sign in and complete password or two-factor checks yourself.</w:t>
+        <w:t>Retain https://github.com/oculusrex14/GODFIN/actions/runs/32787609617 as exact-source evidence for commit 3a26090a52531d39481b7cdff305d3d6a7812542. All six jobs completed successfully on 25 August 2026.</w:t>
       </w:r>
     </w:p>
     <w:p>
@@ -7209,7 +7209,7 @@
         </w:numPr>
       </w:pPr>
       <w:r>
-        <w:t>Open Payment information. If GitHub shows a failed, expired, or missing payment method, add or correct it. Do not share card details, billing address, one-time passwords, or screenshots containing them.</w:t>
+        <w:t>Keep oculusrex14/GODFIN PRIVATE. Confirm visibility before every tag or draft-release operation; do not paste repository credentials or billing information into evidence.</w:t>
       </w:r>
     </w:p>
     <w:p>
@@ -7221,7 +7221,7 @@
         </w:numPr>
       </w:pPr>
       <w:r>
-        <w:t>Open Budgets and alerts. Find a GitHub Actions budget for the personal account or this repository. If it stops usage at zero or at a reached limit, raise it to a small monthly amount you are comfortable with, or disable only the stop-usage control. Keep email alerts enabled.</w:t>
+        <w:t>If any application code, workflow, dependency lock, generated asset, or verification contract changes, push the cohesive change and wait for a new all-green run on that exact SHA.</w:t>
       </w:r>
     </w:p>
     <w:p>
@@ -7233,7 +7233,7 @@
         </w:numPr>
       </w:pPr>
       <w:r>
-        <w:t>Return to https://github.com/oculusrex14/GODFIN/actions. Open CI, choose Run workflow, select codex/godfin-production-v5, and confirm. If the Run workflow button is unavailable, verify Actions are enabled for the repository and that the workflow exists on the selected branch; do not create another code change merely to trigger it.</w:t>
+        <w:t>Check that backend, frontend, website, website-browser-matrix, desktop-audit, and e2e all execute real steps. A skipped or cancelled required job is not a pass.</w:t>
       </w:r>
     </w:p>
     <w:p>
@@ -7245,19 +7245,7 @@
         </w:numPr>
       </w:pPr>
       <w:r>
-        <w:t>A successful repair is obvious: backend, frontend, website, website-browser-matrix, desktop-audit, and e2e show real steps instead of failing instantly. Wait until all six are green, then copy only the run URL into the evidence field below.</w:t>
-      </w:r>
-    </w:p>
-    <w:p>
-      <w:pPr>
-        <w:keepLines/>
-        <w:numPr>
-          <w:ilvl w:val="0"/>
-          <w:numId w:val="10"/>
-        </w:numPr>
-      </w:pPr>
-      <w:r>
-        <w:t>If GitHub still creates no run after payment, budget, and Actions-policy checks, wait up to 15 minutes, sign out/in, and contact GitHub Support. Do not tag, publish, or promote a release. As soon as the exact run is green, change Settings → General → Danger Zone → Change repository visibility to PRIVATE and confirm the API reports PRIVATE.</w:t>
+        <w:t>Keep checkout, deployment promotion, release publishing, and update-feed promotion disabled until their separate provider, signed-package, legal, and owner gates are complete.</w:t>
       </w:r>
     </w:p>
     <w:p>
@@ -7273,7 +7261,7 @@
             <w:color w:val="2E74B5"/>
             <w:u w:val="single"/>
           </w:rPr>
-          <w:t>GitHub Actions billing</w:t>
+          <w:t>Exact candidate CI run</w:t>
         </w:r>
       </w:hyperlink>
     </w:p>
@@ -7290,7 +7278,7 @@
             <w:color w:val="2E74B5"/>
             <w:u w:val="single"/>
           </w:rPr>
-          <w:t>GitHub budgets and alerts</w:t>
+          <w:t>GitHub repository visibility</w:t>
         </w:r>
       </w:hyperlink>
     </w:p>
@@ -8239,7 +8227,7 @@
                 <w:color w:val="172033"/>
                 <w:sz w:val="18"/>
               </w:rPr>
-              <w:t>Build/install b62946e or a documentation-only descendant, then complete fresh read-only authorization, sync, restart, disconnect, reconnect, and seven-day soak.</w:t>
+              <w:t>Build/install 3a26090 or a documentation-only descendant, then complete fresh read-only authorization, sync, restart, disconnect, reconnect, and seven-day soak.</w:t>
             </w:r>
           </w:p>
         </w:tc>
@@ -9067,7 +9055,7 @@
                 <w:color w:val="172033"/>
                 <w:sz w:val="18"/>
               </w:rPr>
-              <w:t>Older 3a44f00 evidence exists, but b62946e or a documentation-only descendant must be rebuilt, privacy-verified, and notarized.</w:t>
+              <w:t>Older 3a44f00 evidence exists, but 3a26090 or a documentation-only descendant must be rebuilt, privacy-verified, and notarized.</w:t>
             </w:r>
           </w:p>
         </w:tc>
@@ -9330,6 +9318,7 @@
                 <w:color w:val="172033"/>
                 <w:sz w:val="18"/>
               </w:rPr>
+              <w:t>Codex</w:t>
             </w:r>
           </w:p>
         </w:tc>
@@ -9354,7 +9343,7 @@
                 <w:color w:val="172033"/>
                 <w:sz w:val="18"/>
               </w:rPr>
-              <w:t>☐</w:t>
+              <w:t>☒</w:t>
             </w:r>
           </w:p>
         </w:tc>
@@ -9379,7 +9368,7 @@
                 <w:color w:val="172033"/>
                 <w:sz w:val="18"/>
               </w:rPr>
-              <w:t>Run the exact candidate through manual dispatch; retain all-green evidence; then verify oculusrex14/GODFIN is PRIVATE.</w:t>
+              <w:t>Run 32787609617 passed on exact SHA 3a26090; GitHub API verified oculusrex14/GODFIN is PRIVATE on 25 Aug 2026.</w:t>
             </w:r>
           </w:p>
         </w:tc>

</xml_diff>

<commit_message>
docs: reconcile final remediation evidence
</commit_message>
<xml_diff>
--- a/docs/GODFIN_OWNER_COMPLETION_RUNBOOK.docx
+++ b/docs/GODFIN_OWNER_COMPLETION_RUNBOOK.docx
@@ -64,9 +64,9 @@
           <w:color w:val="667085"/>
           <w:sz w:val="20"/>
         </w:rPr>
-        <w:t>Version 3.0  •  25 August 2026  •  oculusrex14/GODFIN</w:t>
+        <w:t>Version 3.1  •  25 August 2026  •  oculusrex14/GODFIN</w:t>
         <w:br/>
-        <w:t>Production branch: codex/godfin-production-v5</w:t>
+        <w:t>Production branch: codex/godfin-production-v6</w:t>
       </w:r>
     </w:p>
     <w:p>
@@ -222,7 +222,7 @@
           <w:color w:val="172033"/>
           <w:sz w:val="21"/>
         </w:rPr>
-        <w:t>Production code candidate 3a26090a52531d39481b7cdff305d3d6a7812542 is pushed on codex/godfin-production-v5. GitHub Actions run 32787609617 completed successfully against that exact commit on 25 August 2026. Its six green jobs include the complete 1,008-test Python 3.12 backend suite, dependency and full-history secret audits, frontend and website production gates, desktop privacy/update audits, production smoke tests, and Chromium/Firefox/WebKit accessibility and website matrices. All 182 API operations publish an explicit success or intentional terminal status, a non-empty media-specific success schema, and the shared error contract.</w:t>
+        <w:t>Production code candidate b2dcaeccd237f5ae4e2076ca4959e5e329df72fe is pushed on codex/godfin-production-v6. GitHub Actions run 32800966419 completed successfully against that exact commit on 25 August 2026. Its seven green jobs include the complete 1,008-test Python 3.12 backend suite, dependency and full-history secret audits, frontend and website production gates, desktop privacy/update audits, production smoke tests, Chromium/Firefox/WebKit accessibility and website matrices, and a clean 11-migration Supabase database with 107 passing pgTAP assertions. All 182 API operations publish an explicit success or intentional terminal status, a non-empty media-specific success schema, and the shared error contract.</w:t>
       </w:r>
     </w:p>
     <w:p>
@@ -258,7 +258,7 @@
         </w:numPr>
       </w:pPr>
       <w:r>
-        <w:t>Supabase project: GODFIN (ap-south-1). The repository verifies 10 ordered migration hashes through 20260824211115_cashfree_email_delivery_claim.sql. Migration 0006 adds provider-neutral Cashfree purchase/event fields and replay-safe provisioning; migration 0007 adds in-place lifetime upgrades; the later migrations repair public rate-limit arithmetic and add an atomic email-delivery claim. Remote application and pgTAP evidence remain required.</w:t>
+        <w:t>Supabase project: GODFIN (ap-south-1). All 11 ordered migration hashes through 20260825021500_grant_authenticated_rls_reads.sql align on the linked project. Clean CI and the linked project each pass all 107 pgTAP assertions for least-privilege grants, own-row RLS, two-user isolation, abuse controls, Cashfree state, upgrades, device caps, and email leasing. Managed backup/PITR, a restore drill, Auth leaked-password protection, and the real second-account browser flow remain required.</w:t>
       </w:r>
     </w:p>
     <w:p>
@@ -294,7 +294,7 @@
         </w:numPr>
       </w:pPr>
       <w:r>
-        <w:t>The website product tour uses real React application captures generated only from synthetic data, muted WebM/MP4 media with reduced-motion fallbacks, and build-time checks that prevent unreleased features from being advertised. godfin.dev is the final canonical domain and godfin.vercel.app is the fallback. The older source commit 3a44f00 is still the deployed production website; checkout remains deliberately disabled. Candidate 3a26090 is not deployed and must not be promoted until all 10 migrations and the provider sandbox tests pass.</w:t>
+        <w:t>The website product tour uses real React application captures generated only from synthetic data, muted WebM/MP4 media with reduced-motion fallbacks, and build-time checks that prevent unreleased features from being advertised. godfin.dev is the final canonical domain and godfin.vercel.app is the fallback. The older source commit 3a44f00 is still the deployed production website; checkout remains deliberately disabled. Candidate b2dcaec is not deployed and must not be promoted until the provider, recovery, and legal gates pass.</w:t>
       </w:r>
     </w:p>
     <w:p>
@@ -402,7 +402,7 @@
         </w:numPr>
       </w:pPr>
       <w:r>
-        <w:t>Application-code evidence is current through immutable commit 3a26090a52531d39481b7cdff305d3d6a7812542 on codex/godfin-production-v5. GitHub Actions run 32787609617 passed all six jobs on that exact SHA, including all 1,008 backend tests and the three-engine browser matrices. The repository was then returned to PRIVATE and verified through the GitHub API. This closes the source-level hosted-CI and repository-privacy gates; it does not authorize a tag, installer, deployment, payment acceptance, update promotion, or public launch.</w:t>
+        <w:t>Application-code evidence is current through immutable commit b2dcaeccd237f5ae4e2076ca4959e5e329df72fe on codex/godfin-production-v6. GitHub Actions run 32800966419 passed all seven jobs on that exact SHA, including all 1,008 backend tests, the three-engine browser matrices, and the clean Supabase database matrix. The repository was then returned to PRIVATE and verified through the GitHub API. This closes source-level hosted CI, clean-database RLS, and repository-privacy gates; it does not authorize a tag, installer, deployment, payment acceptance, update promotion, or public launch.</w:t>
       </w:r>
     </w:p>
     <w:p>
@@ -414,7 +414,7 @@
         </w:numPr>
       </w:pPr>
       <w:r>
-        <w:t>Desktop Gmail recovery is implemented in candidate source 3a26090 but is not yet installed as a candidate package. Its exact external-browser callback uses a short-lived signed handoff bound to the active desktop launch; ordinary routes still require the launch secret. After packaging, the owner must start a completely fresh Connect Gmail attempt; an old callback tab or stale OAuth state cannot be reused. oculusrexai@gmail.com and naraharikripa14@gmail.com are the intended Google test users. Connected status, first sync, restart, reauthorization, and the seven-day soak must be evidenced before this gate is complete.</w:t>
+        <w:t>Desktop Gmail recovery is implemented in candidate source b2dcaec but is not yet installed as a candidate package. Its exact external-browser callback uses a short-lived signed handoff bound to the active desktop launch; ordinary routes still require the launch secret. After packaging, the owner must start a completely fresh Connect Gmail attempt; an old callback tab or stale OAuth state cannot be reused. oculusrexai@gmail.com and naraharikripa14@gmail.com are the intended Google test users. Connected status, first sync, restart, reauthorization, and the seven-day soak must be evidenced before this gate is complete.</w:t>
       </w:r>
     </w:p>
     <w:p>
@@ -438,7 +438,7 @@
         </w:numPr>
       </w:pPr>
       <w:r>
-        <w:t>Public Gmail consent-screen review, the fresh Gmail recovery/soak, Cashfree KYC/sandbox/live tests, remote application of all 10 Supabase migrations, Resend/DNS, final Google/Supabase canonical redirect verification, Apple/Windows certificates, R2, cross-platform clean-system evidence, dependency-license approval, independent parser/full pentesting, native assistive-technology checks, and public-launch authorization are not yet complete.</w:t>
+        <w:t>Public Gmail consent-screen review, the fresh Gmail recovery/soak, Cashfree KYC/sandbox/live tests, Supabase backup/PITR/restore and Auth leaked-password protection, Resend/DNS, the real second-account Google isolation flow, Apple/Windows certificates, R2, cross-platform clean-system evidence, dependency-license approval, independent parser/full pentesting, native assistive-technology checks, and public-launch authorization are not yet complete.</w:t>
       </w:r>
     </w:p>
     <w:p>
@@ -639,7 +639,7 @@
                 <w:color w:val="172033"/>
                 <w:sz w:val="18"/>
               </w:rPr>
-              <w:t>Closed on 25 August 2026 for source candidate 3a26090.</w:t>
+              <w:t>Closed on 25 August 2026 for source candidate b2dcaec.</w:t>
             </w:r>
           </w:p>
         </w:tc>
@@ -664,7 +664,7 @@
                 <w:color w:val="172033"/>
                 <w:sz w:val="18"/>
               </w:rPr>
-              <w:t>Keep the repository private and rerun CI after any later code or evidence change.</w:t>
+              <w:t>Keep the repository private and rerun CI after any later code or workflow change.</w:t>
             </w:r>
           </w:p>
         </w:tc>
@@ -689,7 +689,7 @@
                 <w:color w:val="172033"/>
                 <w:sz w:val="18"/>
               </w:rPr>
-              <w:t>Actions run 32787609617 is green on exact SHA 3a26090; GitHub API reports PRIVATE.</w:t>
+              <w:t>Actions run 32800966419 is green on exact SHA b2dcaec; GitHub API reports PRIVATE.</w:t>
             </w:r>
           </w:p>
         </w:tc>
@@ -849,7 +849,7 @@
                 <w:color w:val="172033"/>
                 <w:sz w:val="18"/>
               </w:rPr>
-              <w:t>Repository integration and local contracts exist; KYC, credentials, webhook, hosted migrations, and sandbox evidence are absent.</w:t>
+              <w:t>Repository integration, all 11 hosted migrations, and database state-machine tests pass; KYC, credentials, webhook, and provider sandbox evidence are absent.</w:t>
             </w:r>
           </w:p>
         </w:tc>
@@ -874,7 +874,7 @@
                 <w:color w:val="172033"/>
                 <w:sz w:val="18"/>
               </w:rPr>
-              <w:t>Complete KYC; apply all 10 ordered migrations; configure sandbox keys and required webhook events.</w:t>
+              <w:t>Complete KYC; configure sandbox keys and required webhook events; keep checkout disabled until the full sandbox matrix passes.</w:t>
             </w:r>
           </w:p>
         </w:tc>
@@ -2087,7 +2087,7 @@
           <w:color w:val="172033"/>
           <w:sz w:val="21"/>
         </w:rPr>
-        <w:t>Fully quit GODFIN, reopen /Applications/GODFIN.app, and begin a fresh Connect Gmail attempt from Settings. Do not reuse or refresh an old Google callback tab. Candidate 3a26090 uses a short-lived signed, nonce-bearing OAuth handoff bound to the active desktop launch; every ordinary backend route still requires the active launch secret. Because 3a26090 is not yet packaged, complete this check only on a new package built from that exact candidate or a later documentation-only descendant.</w:t>
+        <w:t>Fully quit GODFIN, reopen /Applications/GODFIN.app, and begin a fresh Connect Gmail attempt from Settings. Do not reuse or refresh an old Google callback tab. Candidate b2dcaec uses a short-lived signed, nonce-bearing OAuth handoff bound to the active desktop launch; every ordinary backend route still requires the active launch secret. Because b2dcaec is not yet packaged, complete this check only on a new package built from that exact candidate or a later documentation-only descendant.</w:t>
       </w:r>
     </w:p>
     <w:p>
@@ -2440,7 +2440,7 @@
         <w:pStyle w:val="Heading2"/>
       </w:pPr>
       <w:r>
-        <w:t>2.2 Test and apply all 10 ordered Supabase migrations</w:t>
+        <w:t>2.2 Verify all 11 Supabase migrations and recovery</w:t>
       </w:r>
     </w:p>
     <w:p>
@@ -2468,7 +2468,7 @@
           <w:color w:val="172033"/>
           <w:sz w:val="21"/>
         </w:rPr>
-        <w:t>The deployed website cannot safely provision Cashfree purchases and in-place upgrades until every migration in website/supabase/migration-manifest.json exists remotely. Keep CHECKOUT_ENABLED=false throughout this section. The sequence is additive and preserves legacy purchase history, but a verified backup is still required before a production database change.</w:t>
+        <w:t>All 11 migrations now align remotely and both clean CI and linked-project database suites pass 107 assertions. Keep CHECKOUT_ENABLED=false throughout this section. Backup/PITR, a restore drill, leaked-password protection, and provider sandbox evidence still block checkout.</w:t>
       </w:r>
     </w:p>
     <w:p>
@@ -2480,7 +2480,7 @@
         </w:numPr>
       </w:pPr>
       <w:r>
-        <w:t>Open Docker Desktop and wait until it reports that its engine is running. This is used only to test an isolated local Supabase database; it does not receive the desktop app's financial data.</w:t>
+        <w:t>Repository evidence already retained: GitHub Actions run 32800966419 applied all 11 migrations to a clean temporary database and passed all 107 pgTAP assertions. Do not replace this with source inspection.</w:t>
       </w:r>
     </w:p>
     <w:p>
@@ -2492,7 +2492,7 @@
         </w:numPr>
       </w:pPr>
       <w:r>
-        <w:t>Open Terminal and run: cd /Users/oculus/Projects/GODFIN/GODFIN_PRODUCTION/website</w:t>
+        <w:t>Linked-project evidence already retained: all 11 local/remote migration versions align and all five live pgTAP files passed 107 assertions. See docs/production-remediation/SUPABASE_REMOTE_EVIDENCE_2026-08-25.md.</w:t>
       </w:r>
     </w:p>
     <w:p>
@@ -2504,7 +2504,7 @@
         </w:numPr>
       </w:pPr>
       <w:r>
-        <w:t>Run: supabase start. Wait for the local services to finish starting. If the command says Docker is unavailable, fix Docker first rather than skipping the database test.</w:t>
+        <w:t>In Supabase Dashboard, open GODFIN → Database → Backups. Current evidence shows no managed backup history and PITR disabled. Upgrade the plan or create an approved encrypted export before checkout, then perform and document a restore drill.</w:t>
       </w:r>
     </w:p>
     <w:p>
@@ -2516,7 +2516,7 @@
         </w:numPr>
       </w:pPr>
       <w:r>
-        <w:t>Run: supabase db reset --local. Read the target carefully and continue only when it clearly says the local Supabase stack. This command is destructive to the local test database and must never be run with --linked.</w:t>
+        <w:t>In Supabase Dashboard, open Authentication → Settings or Security and enable leaked-password protection if the current plan offers it. The Auth advisor currently reports it disabled. Do not mark this complete until the advisor is clean.</w:t>
       </w:r>
     </w:p>
     <w:p>
@@ -2528,7 +2528,7 @@
         </w:numPr>
       </w:pPr>
       <w:r>
-        <w:t>Run: supabase test db --local supabase/tests. Confirm all files, including 0006_cashfree_commerce.test.sql, 0007_cashfree_license_upgrades.test.sql, and 0008_cashfree_email_delivery_claim.test.sql, finish successfully with no failed pgTAP assertion.</w:t>
+        <w:t>Use a second Google test account to sign in to godfin.dev. Confirm each account sees only its own licenses, purchases, and activations. Database-level two-user isolation already passes; this step validates the browser/provider path.</w:t>
       </w:r>
     </w:p>
     <w:p>
@@ -2540,7 +2540,7 @@
         </w:numPr>
       </w:pPr>
       <w:r>
-        <w:t>Run: supabase stop. This shuts down the temporary local stack without touching the hosted project.</w:t>
+        <w:t>Back in Terminal, run: supabase login. Complete the one-time browser authorization if asked; never paste the access token into this document or chat.</w:t>
       </w:r>
     </w:p>
     <w:p>
@@ -2552,7 +2552,7 @@
         </w:numPr>
       </w:pPr>
       <w:r>
-        <w:t>In Supabase Dashboard, open project GODFIN → Database → Backups and verify that a recent recoverable backup exists. If the plan does not provide managed backups, make a private encrypted database backup/export using Supabase's documented method before continuing.</w:t>
+        <w:t>Run: supabase link --project-ref omrtkfwjauyakhvynutk. Confirm the displayed project is GODFIN in ap-south-1.</w:t>
       </w:r>
     </w:p>
     <w:p>
@@ -2564,7 +2564,7 @@
         </w:numPr>
       </w:pPr>
       <w:r>
-        <w:t>Back in Terminal, run: supabase login. Complete the one-time browser authorization if asked; never paste the access token into this document or chat.</w:t>
+        <w:t>Run: supabase migration list --linked. Confirm all 11 names appear in both local and remote columns, ending with 20260825021500_grant_authenticated_rls_reads.sql.</w:t>
       </w:r>
     </w:p>
     <w:p>
@@ -2576,7 +2576,7 @@
         </w:numPr>
       </w:pPr>
       <w:r>
-        <w:t>Run: supabase link --project-ref omrtkfwjauyakhvynutk. Confirm the displayed project is GODFIN in ap-south-1.</w:t>
+        <w:t>For any future pending migration, run supabase db push --linked --dry-run first and confirm the exact proposed files. Take the approved backup/export before the real push.</w:t>
       </w:r>
     </w:p>
     <w:p>
@@ -2588,7 +2588,7 @@
         </w:numPr>
       </w:pPr>
       <w:r>
-        <w:t>Run: supabase migration list --linked. Compare the local and remote columns against all 10 names in website/supabase/migration-manifest.json. Note every missing remote migration, including the two 2026082403 rate-limit fixes and 20260824211115_cashfree_email_delivery_claim.sql.</w:t>
+        <w:t>After any future migration, rerun the isolated CI database job and all five linked-project pgTAP files. A source parse is not a database pass.</w:t>
       </w:r>
     </w:p>
     <w:p>
@@ -2600,31 +2600,7 @@
         </w:numPr>
       </w:pPr>
       <w:r>
-        <w:t>Run: supabase db push --linked --dry-run. Read the output and confirm it proposes only the missing ordered migration files, ending with 20260824211115_cashfree_email_delivery_claim.sql.</w:t>
-      </w:r>
-    </w:p>
-    <w:p>
-      <w:pPr>
-        <w:keepLines/>
-        <w:numPr>
-          <w:ilvl w:val="0"/>
-          <w:numId w:val="10"/>
-        </w:numPr>
-      </w:pPr>
-      <w:r>
-        <w:t>Run: supabase db push --linked. Do not close Terminal until it reports success.</w:t>
-      </w:r>
-    </w:p>
-    <w:p>
-      <w:pPr>
-        <w:keepLines/>
-        <w:numPr>
-          <w:ilvl w:val="0"/>
-          <w:numId w:val="10"/>
-        </w:numPr>
-      </w:pPr>
-      <w:r>
-        <w:t>Run: supabase migration list --linked again. Confirm all 10 names appear in both the local and remote columns. Leave CHECKOUT_ENABLED=false until the pgTAP, isolation, and Cashfree sandbox matrices pass.</w:t>
+        <w:t>Leave CHECKOUT_ENABLED=false until backup/restore, Auth, second-account, Cashfree sandbox, and qualified tax/refund gates all pass.</w:t>
       </w:r>
     </w:p>
     <w:p>
@@ -3472,7 +3448,7 @@
         </w:numPr>
       </w:pPr>
       <w:r>
-        <w:t>Keep CHECKOUT_ENABLED=false until all 10 ordered Supabase migrations are applied and the complete sandbox matrix below passes.</w:t>
+        <w:t>All 11 ordered Supabase migrations are applied. Keep CHECKOUT_ENABLED=false until recovery/Auth and the complete Cashfree sandbox matrix below pass.</w:t>
       </w:r>
     </w:p>
     <w:p>
@@ -4002,7 +3978,7 @@
           <w:color w:val="172033"/>
           <w:sz w:val="21"/>
         </w:rPr>
-        <w:t>On 24 August 2026, older source commit 3a44f00 was deployed to Vercel production as deployment dpl_HjwgU9aBfaBvdcFH8aiR981mgVDY. https://godfin.dev and https://godfin.vercel.app return HTTP 200; https://www.godfin.dev permanently redirects to the apex; HSTS and the Cashfree-only CSP are present; hello@godfin.dev is the only public contact; and checkout fails closed with HTTP 503. This verifies the domain and safe-disable posture only—not candidate 3a26090, Cashfree credentials, all 10 migrations, or payment acceptance.</w:t>
+        <w:t>On 24 August 2026, older source commit 3a44f00 was deployed to Vercel production as deployment dpl_HjwgU9aBfaBvdcFH8aiR981mgVDY. https://godfin.dev and https://godfin.vercel.app return HTTP 200; https://www.godfin.dev permanently redirects to the apex; HSTS and the Cashfree-only CSP are present; hello@godfin.dev is the only public contact; and checkout fails closed with HTTP 503. This verifies the domain and safe-disable posture only—not candidate b2dcaec, Cashfree credentials, recovery readiness, or payment acceptance.</w:t>
       </w:r>
     </w:p>
     <w:p>
@@ -4098,7 +4074,7 @@
         </w:numPr>
       </w:pPr>
       <w:r>
-        <w:t>The 3a44f00 production deployment is intentionally fail-closed and predates candidate 3a26090. After any provider-variable change, keep CHECKOUT_ENABLED=false, deploy a preview from the exact candidate, and test account sign-in, pricing, disabled checkout behavior, waitlist, privacy, terms, and license verification.</w:t>
+        <w:t>The 3a44f00 production deployment is intentionally fail-closed and predates candidate b2dcaec. After any provider-variable change, keep CHECKOUT_ENABLED=false, deploy a preview from the exact candidate, and test account sign-in, pricing, disabled checkout behavior, waitlist, privacy, terms, and license verification.</w:t>
       </w:r>
     </w:p>
     <w:p>
@@ -4110,7 +4086,7 @@
         </w:numPr>
       </w:pPr>
       <w:r>
-        <w:t>After all 10 Supabase migrations and the Cashfree sandbox matrix pass, run the repository website checks again and deploy the exact tested SHA to production. A production deployment does not authorize public marketing or customer checkout.</w:t>
+        <w:t>All 11 Supabase migrations are applied and database-tested. After recovery/Auth and the Cashfree sandbox matrix pass, run the repository website checks again and deploy the exact tested SHA to production. A production deployment does not authorize public marketing or customer checkout.</w:t>
       </w:r>
     </w:p>
     <w:p>
@@ -7005,7 +6981,7 @@
         </w:numPr>
       </w:pPr>
       <w:r>
-        <w:t>Backend: all 1,008 tests passed in GitHub Actions run 32787609617 under clean Python 3.12 on exact candidate 3a26090, including auth/PIN, encryption, migrations, backups, merchant upsert, licenses, local trust, Gmail coverage/restart handling, exact response contracts for all 182 API operations, certified statement parsers, hostile-file preflight, goal/simulation/recurring behavior, CA tax pack, classification memory, performance, net worth, behavior insights, reward-pilot redaction, and UTC finance-fetch regressions.</w:t>
+        <w:t>Backend: all 1,008 tests passed in GitHub Actions run 32800966419 under clean Python 3.12 on exact candidate b2dcaec, including auth/PIN, encryption, migrations, backups, merchant upsert, licenses, local trust, Gmail coverage/restart handling, exact response contracts for all 182 API operations, certified statement parsers, hostile-file preflight, goal/simulation/recurring behavior, CA tax pack, classification memory, performance, net worth, behavior insights, reward-pilot redaction, and UTC finance-fetch regressions.</w:t>
       </w:r>
     </w:p>
     <w:p>
@@ -7041,7 +7017,7 @@
         </w:numPr>
       </w:pPr>
       <w:r>
-        <w:t>Frontend: lint, static accessibility/contrast, memory-only authentication, build-identity, secure-password, tier-navigation, and production-build gates pass. The deterministic inventory records 422 controls across 19 route scopes. GitHub Actions run 32787609617 also passed the production smoke and accessibility suites in Chromium, Firefox, and WebKit; native screen-reader and signed-package interaction remain separate gates.</w:t>
+        <w:t>Frontend: lint, static accessibility/contrast, memory-only authentication, build-identity, secure-password, tier-navigation, and production-build gates pass. The deterministic inventory records 422 controls across 19 route scopes. GitHub Actions run 32800966419 also passed the production smoke and accessibility suites in Chromium, Firefox, and WebKit; native screen-reader and signed-package interaction remain separate gates.</w:t>
       </w:r>
     </w:p>
     <w:p>
@@ -7053,7 +7029,7 @@
         </w:numPr>
       </w:pPr>
       <w:r>
-        <w:t>Website: entitlement/payment contract verification, five Cashfree tests, three strict webhook-body tests, three lifetime-upgrade tests, 10 ordered migration hashes, production build, real-app product chapters, reduced-motion fallbacks, lifetime/no-bundled-credit pricing, security headers, checkout safe-disable behavior, and dependency audit pass. The previously measured production URL scored Lighthouse performance 99, accessibility 100, and SEO 100, with LCP 1.73 seconds and CLS 0; repeat this measurement after deploying the exact final SHA.</w:t>
+        <w:t>Website: entitlement/payment contract verification, five Cashfree tests, three strict webhook-body tests, three lifetime-upgrade tests, 11 ordered migration hashes, production build, real-app product chapters, reduced-motion fallbacks, lifetime/no-bundled-credit pricing, security headers, checkout safe-disable behavior, and dependency audit pass. A clean Supabase stack and the linked project each pass all 107 pgTAP assertions. The previously measured production URL scored Lighthouse performance 99, accessibility 100, and SEO 100, with LCP 1.73 seconds and CLS 0; repeat this measurement after deploying the exact final SHA.</w:t>
       </w:r>
     </w:p>
     <w:p>
@@ -7101,7 +7077,7 @@
         </w:numPr>
       </w:pPr>
       <w:r>
-        <w:t>Local packaging: the older 3a44f00 macOS arm64 build passed package verification with first start 2.997 seconds, restart 1.033 seconds, idle memory 602.9 MB across five processes, database preservation, local trust boundary, maintenance boundary, bundled-backend auto-start, and Gmail callback-path checks. DMG SHA-256: f960c103a8c584a9d45e31d39258a7149ae509dac35a6cb02914c52e6057b36b. ZIP SHA-256: 00b91ea7ce3ed5fbad5dc62bff03deae312a95ea962956fe9dc18651b57e4e0a. This evidence does not cover 3a26090; a new signed/notarized package is required.</w:t>
+        <w:t>Local packaging: the older 3a44f00 macOS arm64 build passed package verification with first start 2.997 seconds, restart 1.033 seconds, idle memory 602.9 MB across five processes, database preservation, local trust boundary, maintenance boundary, bundled-backend auto-start, and Gmail callback-path checks. DMG SHA-256: f960c103a8c584a9d45e31d39258a7149ae509dac35a6cb02914c52e6057b36b. ZIP SHA-256: 00b91ea7ce3ed5fbad5dc62bff03deae312a95ea962956fe9dc18651b57e4e0a. This evidence does not cover b2dcaec; a new signed/notarized package is required.</w:t>
       </w:r>
     </w:p>
     <w:p>
@@ -7113,7 +7089,7 @@
         </w:numPr>
       </w:pPr>
       <w:r>
-        <w:t>Secrets: Gitleaks scanned the complete cleaned 154-commit history and the staged remediation diff with no leaks. No real statements, databases, tokens, keys, or customer screenshots are tracked.</w:t>
+        <w:t>Secrets: Gitleaks scanned the complete cleaned 166-commit history and the staged remediation diff with no leaks. No real statements, databases, tokens, keys, or customer screenshots are tracked.</w:t>
       </w:r>
     </w:p>
     <w:p>
@@ -7177,7 +7153,7 @@
           <w:color w:val="172033"/>
           <w:sz w:val="21"/>
         </w:rPr>
-        <w:t>Source candidate 3a26090 passed all six jobs in GitHub Actions run 32787609617, including the full backend suite, supply-chain and secret checks, desktop audits, website/browser matrices, and Chromium/Firefox/WebKit app accessibility. The repository API then confirmed PRIVATE. Any later code change requires a new exact-SHA green run before tagging; source CI does not replace signed-package, provider, legal, or launch authorization gates.</w:t>
+        <w:t>Source candidate b2dcaec passed all seven jobs in GitHub Actions run 32800966419, including the full backend suite, supply-chain and secret checks, desktop audits, website/browser matrices, Chromium/Firefox/WebKit app accessibility, and the clean Supabase database matrix. The repository API then confirmed PRIVATE. Any later application, workflow, lockfile, generated-asset, or verification-contract change requires a new exact-SHA green run before tagging; source CI does not replace signed-package, provider, legal, or launch authorization gates.</w:t>
       </w:r>
     </w:p>
     <w:p>
@@ -7197,7 +7173,7 @@
         </w:numPr>
       </w:pPr>
       <w:r>
-        <w:t>Retain https://github.com/oculusrex14/GODFIN/actions/runs/32787609617 as exact-source evidence for commit 3a26090a52531d39481b7cdff305d3d6a7812542. All six jobs completed successfully on 25 August 2026.</w:t>
+        <w:t>Retain https://github.com/oculusrex14/GODFIN/actions/runs/32800966419 as exact-source evidence for commit b2dcaeccd237f5ae4e2076ca4959e5e329df72fe. All seven jobs completed successfully on 25 August 2026.</w:t>
       </w:r>
     </w:p>
     <w:p>
@@ -7233,7 +7209,7 @@
         </w:numPr>
       </w:pPr>
       <w:r>
-        <w:t>Check that backend, frontend, website, website-browser-matrix, desktop-audit, and e2e all execute real steps. A skipped or cancelled required job is not a pass.</w:t>
+        <w:t>Check that backend, frontend, website, website-browser-matrix, desktop-audit, e2e, and supabase-db all execute real steps. A skipped or cancelled required job is not a pass.</w:t>
       </w:r>
     </w:p>
     <w:p>
@@ -8227,7 +8203,112 @@
                 <w:color w:val="172033"/>
                 <w:sz w:val="18"/>
               </w:rPr>
-              <w:t>Build/install 3a26090 or a documentation-only descendant, then complete fresh read-only authorization, sync, restart, disconnect, reconnect, and seven-day soak.</w:t>
+              <w:t>Build/install b2dcaec or a documentation-only descendant, then complete fresh read-only authorization, sync, restart, disconnect, reconnect, and seven-day soak.</w:t>
+            </w:r>
+          </w:p>
+        </w:tc>
+      </w:tr>
+      <w:tr>
+        <w:trPr>
+          <w:cantSplit/>
+        </w:trPr>
+        <w:tc>
+          <w:tcPr>
+            <w:tcW w:type="dxa" w:w="3300"/>
+            <w:tcMar>
+              <w:top w:w="80" w:type="dxa"/>
+              <w:start w:w="120" w:type="dxa"/>
+              <w:bottom w:w="80" w:type="dxa"/>
+              <w:end w:w="120" w:type="dxa"/>
+            </w:tcMar>
+            <w:vAlign w:val="center"/>
+          </w:tcPr>
+          <w:p>
+            <w:pPr>
+              <w:spacing w:after="0"/>
+            </w:pPr>
+            <w:r>
+              <w:rPr>
+                <w:rFonts w:ascii="Calibri" w:hAnsi="Calibri"/>
+                <w:color w:val="172033"/>
+                <w:sz w:val="18"/>
+              </w:rPr>
+              <w:t>Supabase recovery + Auth hardening</w:t>
+            </w:r>
+          </w:p>
+        </w:tc>
+        <w:tc>
+          <w:tcPr>
+            <w:tcW w:type="dxa" w:w="1300"/>
+            <w:tcMar>
+              <w:top w:w="80" w:type="dxa"/>
+              <w:start w:w="120" w:type="dxa"/>
+              <w:bottom w:w="80" w:type="dxa"/>
+              <w:end w:w="120" w:type="dxa"/>
+            </w:tcMar>
+            <w:vAlign w:val="center"/>
+          </w:tcPr>
+          <w:p>
+            <w:pPr>
+              <w:spacing w:after="0"/>
+            </w:pPr>
+            <w:r>
+              <w:rPr>
+                <w:rFonts w:ascii="Calibri" w:hAnsi="Calibri"/>
+                <w:color w:val="172033"/>
+                <w:sz w:val="18"/>
+              </w:rPr>
+              <w:t>Owner</w:t>
+            </w:r>
+          </w:p>
+        </w:tc>
+        <w:tc>
+          <w:tcPr>
+            <w:tcW w:type="dxa" w:w="1100"/>
+            <w:tcMar>
+              <w:top w:w="80" w:type="dxa"/>
+              <w:start w:w="120" w:type="dxa"/>
+              <w:bottom w:w="80" w:type="dxa"/>
+              <w:end w:w="120" w:type="dxa"/>
+            </w:tcMar>
+            <w:vAlign w:val="center"/>
+          </w:tcPr>
+          <w:p>
+            <w:pPr>
+              <w:spacing w:after="0"/>
+            </w:pPr>
+            <w:r>
+              <w:rPr>
+                <w:rFonts w:ascii="Calibri" w:hAnsi="Calibri"/>
+                <w:color w:val="172033"/>
+                <w:sz w:val="18"/>
+              </w:rPr>
+              <w:t>☐</w:t>
+            </w:r>
+          </w:p>
+        </w:tc>
+        <w:tc>
+          <w:tcPr>
+            <w:tcW w:type="dxa" w:w="3660"/>
+            <w:tcMar>
+              <w:top w:w="80" w:type="dxa"/>
+              <w:start w:w="120" w:type="dxa"/>
+              <w:bottom w:w="80" w:type="dxa"/>
+              <w:end w:w="120" w:type="dxa"/>
+            </w:tcMar>
+            <w:vAlign w:val="center"/>
+          </w:tcPr>
+          <w:p>
+            <w:pPr>
+              <w:spacing w:after="0"/>
+            </w:pPr>
+            <w:r>
+              <w:rPr>
+                <w:rFonts w:ascii="Calibri" w:hAnsi="Calibri"/>
+                <w:color w:val="172033"/>
+                <w:sz w:val="18"/>
+              </w:rPr>
+              <w:t>Provide a recoverable backup or PITR, complete a restore drill, enable leaked-password protection if available, and retain evidence.</w:t>
             </w:r>
           </w:p>
         </w:tc>
@@ -9055,7 +9136,7 @@
                 <w:color w:val="172033"/>
                 <w:sz w:val="18"/>
               </w:rPr>
-              <w:t>Older 3a44f00 evidence exists, but 3a26090 or a documentation-only descendant must be rebuilt, privacy-verified, and notarized.</w:t>
+              <w:t>Older 3a44f00 evidence exists, but b2dcaec or a documentation-only descendant must be rebuilt, privacy-verified, and notarized.</w:t>
             </w:r>
           </w:p>
         </w:tc>
@@ -9368,7 +9449,7 @@
                 <w:color w:val="172033"/>
                 <w:sz w:val="18"/>
               </w:rPr>
-              <w:t>Run 32787609617 passed on exact SHA 3a26090; GitHub API verified oculusrex14/GODFIN is PRIVATE on 25 Aug 2026.</w:t>
+              <w:t>Run 32800966419 passed on exact SHA b2dcaec; GitHub API verified oculusrex14/GODFIN is PRIVATE on 25 Aug 2026.</w:t>
             </w:r>
           </w:p>
         </w:tc>

</xml_diff>

<commit_message>
docs: retain exact-candidate native evidence
</commit_message>
<xml_diff>
--- a/docs/GODFIN_OWNER_COMPLETION_RUNBOOK.docx
+++ b/docs/GODFIN_OWNER_COMPLETION_RUNBOOK.docx
@@ -64,7 +64,7 @@
           <w:color w:val="667085"/>
           <w:sz w:val="20"/>
         </w:rPr>
-        <w:t>Version 3.1  •  25 August 2026  •  oculusrex14/GODFIN</w:t>
+        <w:t>Version 3.2  •  25 August 2026  •  oculusrex14/GODFIN</w:t>
         <w:br/>
         <w:t>Production branch: codex/godfin-production-v6</w:t>
       </w:r>
@@ -222,7 +222,7 @@
           <w:color w:val="172033"/>
           <w:sz w:val="21"/>
         </w:rPr>
-        <w:t>Production code candidate b2dcaeccd237f5ae4e2076ca4959e5e329df72fe is pushed on codex/godfin-production-v6. GitHub Actions run 32800966419 completed successfully against that exact commit on 25 August 2026. Its seven green jobs include the complete 1,008-test Python 3.12 backend suite, dependency and full-history secret audits, frontend and website production gates, desktop privacy/update audits, production smoke tests, Chromium/Firefox/WebKit accessibility and website matrices, and a clean 11-migration Supabase database with 107 passing pgTAP assertions. All 182 API operations publish an explicit success or intentional terminal status, a non-empty media-specific success schema, and the shared error contract.</w:t>
+        <w:t>Application code candidate 5ee71fabfe8c7f28726bf625b75801cb254b23a1 is merged to main and pushed on codex/godfin-production-v6. GitHub Actions run 32827447450 completed successfully against that exact commit on 25 August 2026. Its seven green jobs include the complete 1,011-test Python 3.12 backend suite, dependency and full-history secret audits, frontend and website production gates, desktop privacy/update audits, production smoke tests, Chromium/Firefox/WebKit accessibility and website matrices, and a clean 11-migration Supabase database with 107 passing pgTAP assertions. All 182 API operations publish an explicit success or intentional terminal status, a non-empty media-specific success schema, and the shared error contract.</w:t>
       </w:r>
     </w:p>
     <w:p>
@@ -294,7 +294,7 @@
         </w:numPr>
       </w:pPr>
       <w:r>
-        <w:t>The website product tour uses real React application captures generated only from synthetic data, muted WebM/MP4 media with reduced-motion fallbacks, and build-time checks that prevent unreleased features from being advertised. godfin.dev is the final canonical domain and godfin.vercel.app is the fallback. The older source commit 3a44f00 is still the deployed production website; checkout remains deliberately disabled. Candidate b2dcaec is not deployed and must not be promoted until the provider, recovery, and legal gates pass.</w:t>
+        <w:t>The website product tour uses real React application captures generated only from synthetic data, muted WebM/MP4 media with reduced-motion fallbacks, and build-time checks that prevent unreleased features from being advertised. godfin.dev is the final canonical domain and godfin.vercel.app is the fallback. The older source commit 3a44f00 is still the deployed production website; checkout remains deliberately disabled. Candidate 5ee71fa is not deployed and must not be promoted until the provider, recovery, and legal gates pass.</w:t>
       </w:r>
     </w:p>
     <w:p>
@@ -378,7 +378,7 @@
         </w:numPr>
       </w:pPr>
       <w:r>
-        <w:t>A fresh local macOS arm64 package was built, verified, installed, and relaunched from repository commit 3a44f001fed2b3bc72e9aae7c98d8e0564568d31 using the locked toolchain. It starts in 2.997 seconds on first launch and 1.033 seconds on restart, preserves its database, auto-starts the bundled local backend, enforces the local trust and maintenance boundaries, and remains below the 700 MB idle-memory budget at 602.9 MB across five processes. The private DMG SHA-256 is f960c103a8c584a9d45e31d39258a7149ae509dac35a6cb02914c52e6057b36b and the ZIP SHA-256 is 00b91ea7ce3ed5fbad5dc62bff03deae312a95ea962956fe9dc18651b57e4e0a. This is an ad-hoc local test signature, not an Apple-notarized customer release.</w:t>
+        <w:t>Native GitHub Actions run 32823401864 built and launched unpacked packages from exact application candidate 5ee71fa on macOS arm64, Windows x64, and Linux x64. First starts were 2.098, 3.886, and 3.224 seconds; restarts were 2.440, 2.390, and 2.360 seconds; idle memory was 529.2, 488.1, and 498.5 MB. A separate isolated run on the owner's Apple Silicon Mac passed at 0.991 seconds first start, 0.822 seconds restart, and 598.8 MB. Every required run preserved its isolated synthetic database, enforced local trust and maintenance boundaries, and loaded request-only integrations after startup. Executable and log hashes are retained under docs/production-remediation/evidence. These packages were unsigned, not uploaded as installers, and not published. macOS x64/Intel is explicitly owner-deferred for this pass.</w:t>
       </w:r>
     </w:p>
     <w:p>
@@ -402,7 +402,7 @@
         </w:numPr>
       </w:pPr>
       <w:r>
-        <w:t>Application-code evidence is current through immutable commit b2dcaeccd237f5ae4e2076ca4959e5e329df72fe on codex/godfin-production-v6. GitHub Actions run 32800966419 passed all seven jobs on that exact SHA, including all 1,008 backend tests, the three-engine browser matrices, and the clean Supabase database matrix. The repository was then returned to PRIVATE and verified through the GitHub API. This closes source-level hosted CI, clean-database RLS, and repository-privacy gates; it does not authorize a tag, installer, deployment, payment acceptance, update promotion, or public launch.</w:t>
+        <w:t>Application-code evidence is current through immutable commit 5ee71fabfe8c7f28726bf625b75801cb254b23a1 on main and codex/godfin-production-v6. GitHub Actions run 32827447450 passed all seven jobs on that exact SHA, including all 1,011 backend tests, the three-engine browser matrices, and the clean Supabase database matrix. The repository was then returned to PRIVATE and verified through the GitHub API. This closes source-level hosted CI, clean-database RLS, repository-privacy, and required-platform unpacked-smoke gates; it does not authorize a tag, installer, deployment, payment acceptance, update promotion, or public launch.</w:t>
       </w:r>
     </w:p>
     <w:p>
@@ -414,7 +414,7 @@
         </w:numPr>
       </w:pPr>
       <w:r>
-        <w:t>Desktop Gmail recovery is implemented in candidate source b2dcaec but is not yet installed as a candidate package. Its exact external-browser callback uses a short-lived signed handoff bound to the active desktop launch; ordinary routes still require the launch secret. After packaging, the owner must start a completely fresh Connect Gmail attempt; an old callback tab or stale OAuth state cannot be reused. oculusrexai@gmail.com and naraharikripa14@gmail.com are the intended Google test users. Connected status, first sync, restart, reauthorization, and the seven-day soak must be evidenced before this gate is complete.</w:t>
+        <w:t>Desktop Gmail recovery is implemented and included in the exact-candidate native smoke packages. Its external-browser callback uses a short-lived signed handoff bound to the active desktop launch; ordinary routes still require the launch secret. The owner must start a completely fresh Connect Gmail attempt from an installed candidate; an old callback tab or stale OAuth state cannot be reused. oculusrexai@gmail.com and naraharikripa14@gmail.com are the intended Google test users. Connected status, first sync, restart, reauthorization, and the seven-day soak must be evidenced before this gate is complete.</w:t>
       </w:r>
     </w:p>
     <w:p>
@@ -438,7 +438,7 @@
         </w:numPr>
       </w:pPr>
       <w:r>
-        <w:t>Public Gmail consent-screen review, the fresh Gmail recovery/soak, Cashfree KYC/sandbox/live tests, Supabase backup/PITR/restore and Auth leaked-password protection, Resend/DNS, the real second-account Google isolation flow, Apple/Windows certificates, R2, cross-platform clean-system evidence, dependency-license approval, independent parser/full pentesting, native assistive-technology checks, and public-launch authorization are not yet complete.</w:t>
+        <w:t>Public Gmail consent-screen review, the fresh Gmail recovery/soak, Cashfree KYC/sandbox/live tests, Supabase backup/PITR/restore and Auth leaked-password protection, Resend/DNS, the real second-account Google isolation flow, Apple/Windows certificates, R2, signed-installer and clean-system lifecycle evidence, dependency-license approval, independent parser/full pentesting, native assistive-technology checks, and public-launch authorization are not yet complete. macOS x64/Intel is owner-deferred and must be reopened before any Intel support claim.</w:t>
       </w:r>
     </w:p>
     <w:p>
@@ -639,7 +639,7 @@
                 <w:color w:val="172033"/>
                 <w:sz w:val="18"/>
               </w:rPr>
-              <w:t>Closed on 25 August 2026 for source candidate b2dcaec.</w:t>
+              <w:t>Closed on 25 August 2026 for application candidate 5ee71fa.</w:t>
             </w:r>
           </w:p>
         </w:tc>
@@ -664,7 +664,7 @@
                 <w:color w:val="172033"/>
                 <w:sz w:val="18"/>
               </w:rPr>
-              <w:t>Keep the repository private and rerun CI after any later code or workflow change.</w:t>
+              <w:t>Keep the repository private and rerun CI after any later application or workflow change.</w:t>
             </w:r>
           </w:p>
         </w:tc>
@@ -689,7 +689,7 @@
                 <w:color w:val="172033"/>
                 <w:sz w:val="18"/>
               </w:rPr>
-              <w:t>Actions run 32800966419 is green on exact SHA b2dcaec; GitHub API reports PRIVATE.</w:t>
+              <w:t>Actions run 32827447450 is green on exact SHA 5ee71fa; GitHub API reports PRIVATE.</w:t>
             </w:r>
           </w:p>
         </w:tc>
@@ -1374,7 +1374,7 @@
                 <w:color w:val="172033"/>
                 <w:sz w:val="18"/>
               </w:rPr>
-              <w:t>Only local macOS arm64 packaging is evidenced.</w:t>
+              <w:t>Exact-SHA unpacked smoke passes on macOS arm64, Windows x64, and Linux x64; signed installer lifecycle acceptance remains. The owner Mac passed locally, narahari-strix timed out, and the offered Oracle host is arm64 rather than x64.</w:t>
             </w:r>
           </w:p>
         </w:tc>
@@ -1399,7 +1399,7 @@
                 <w:color w:val="172033"/>
                 <w:sz w:val="18"/>
               </w:rPr>
-              <w:t>Provide clean supported VMs/hardware.</w:t>
+              <w:t>Bring narahari-strix online and provide an Ubuntu 22.04+ x64 host for the final isolated signed-installer checks. Intel macOS is deferred.</w:t>
             </w:r>
           </w:p>
         </w:tc>
@@ -1424,7 +1424,7 @@
                 <w:color w:val="172033"/>
                 <w:sz w:val="18"/>
               </w:rPr>
-              <w:t>Install/upgrade/recovery matrix is signed.</w:t>
+              <w:t>Install/upgrade/recovery evidence is retained for the three required platforms.</w:t>
             </w:r>
           </w:p>
         </w:tc>
@@ -2087,7 +2087,7 @@
           <w:color w:val="172033"/>
           <w:sz w:val="21"/>
         </w:rPr>
-        <w:t>Fully quit GODFIN, reopen /Applications/GODFIN.app, and begin a fresh Connect Gmail attempt from Settings. Do not reuse or refresh an old Google callback tab. Candidate b2dcaec uses a short-lived signed, nonce-bearing OAuth handoff bound to the active desktop launch; every ordinary backend route still requires the active launch secret. Because b2dcaec is not yet packaged, complete this check only on a new package built from that exact candidate or a later documentation-only descendant.</w:t>
+        <w:t>Fully quit GODFIN, reopen /Applications/GODFIN.app, and begin a fresh Connect Gmail attempt from Settings. Do not reuse or refresh an old Google callback tab. Candidate 5ee71fa uses a short-lived signed, nonce-bearing OAuth handoff bound to the active desktop launch; every ordinary backend route still requires the active launch secret. Complete this check only on an installed package built from that exact application candidate or a later documentation-only descendant; the hosted unpacked smoke does not authorize Gmail access on the owner installation.</w:t>
       </w:r>
     </w:p>
     <w:p>
@@ -2480,7 +2480,7 @@
         </w:numPr>
       </w:pPr>
       <w:r>
-        <w:t>Repository evidence already retained: GitHub Actions run 32800966419 applied all 11 migrations to a clean temporary database and passed all 107 pgTAP assertions. Do not replace this with source inspection.</w:t>
+        <w:t>Repository evidence already retained: GitHub Actions run 32827447450 applied all 11 migrations to a clean temporary database and passed all 107 pgTAP assertions on exact application candidate 5ee71fa. Do not replace this with source inspection.</w:t>
       </w:r>
     </w:p>
     <w:p>
@@ -3978,7 +3978,7 @@
           <w:color w:val="172033"/>
           <w:sz w:val="21"/>
         </w:rPr>
-        <w:t>On 24 August 2026, older source commit 3a44f00 was deployed to Vercel production as deployment dpl_HjwgU9aBfaBvdcFH8aiR981mgVDY. https://godfin.dev and https://godfin.vercel.app return HTTP 200; https://www.godfin.dev permanently redirects to the apex; HSTS and the Cashfree-only CSP are present; hello@godfin.dev is the only public contact; and checkout fails closed with HTTP 503. This verifies the domain and safe-disable posture only—not candidate b2dcaec, Cashfree credentials, recovery readiness, or payment acceptance.</w:t>
+        <w:t>On 24 August 2026, older source commit 3a44f00 was deployed to Vercel production as deployment dpl_HjwgU9aBfaBvdcFH8aiR981mgVDY. https://godfin.dev and https://godfin.vercel.app return HTTP 200; https://www.godfin.dev permanently redirects to the apex; HSTS and the Cashfree-only CSP are present; hello@godfin.dev is the only public contact; and checkout fails closed with HTTP 503. This verifies the domain and safe-disable posture only—not candidate 5ee71fa, Cashfree credentials, recovery readiness, or payment acceptance.</w:t>
       </w:r>
     </w:p>
     <w:p>
@@ -4074,7 +4074,7 @@
         </w:numPr>
       </w:pPr>
       <w:r>
-        <w:t>The 3a44f00 production deployment is intentionally fail-closed and predates candidate b2dcaec. After any provider-variable change, keep CHECKOUT_ENABLED=false, deploy a preview from the exact candidate, and test account sign-in, pricing, disabled checkout behavior, waitlist, privacy, terms, and license verification.</w:t>
+        <w:t>The 3a44f00 production deployment is intentionally fail-closed and predates candidate 5ee71fa. After any provider-variable change, keep CHECKOUT_ENABLED=false, deploy a preview from the exact candidate, and test account sign-in, pricing, disabled checkout behavior, waitlist, privacy, terms, and license verification.</w:t>
       </w:r>
     </w:p>
     <w:p>
@@ -6122,7 +6122,7 @@
                 <w:color w:val="172033"/>
                 <w:sz w:val="18"/>
               </w:rPr>
-              <w:t>macOS 13+ x64</w:t>
+              <w:t>macOS 13+ x64 (owner-deferred)</w:t>
             </w:r>
           </w:p>
         </w:tc>
@@ -6147,7 +6147,7 @@
                 <w:color w:val="172033"/>
                 <w:sz w:val="18"/>
               </w:rPr>
-              <w:t>☐</w:t>
+              <w:t>—</w:t>
             </w:r>
           </w:p>
         </w:tc>
@@ -6172,7 +6172,7 @@
                 <w:color w:val="172033"/>
                 <w:sz w:val="18"/>
               </w:rPr>
-              <w:t>☐</w:t>
+              <w:t>—</w:t>
             </w:r>
           </w:p>
         </w:tc>
@@ -6197,7 +6197,7 @@
                 <w:color w:val="172033"/>
                 <w:sz w:val="18"/>
               </w:rPr>
-              <w:t>☐</w:t>
+              <w:t>—</w:t>
             </w:r>
           </w:p>
         </w:tc>
@@ -6222,7 +6222,7 @@
                 <w:color w:val="172033"/>
                 <w:sz w:val="18"/>
               </w:rPr>
-              <w:t>☐</w:t>
+              <w:t>—</w:t>
             </w:r>
           </w:p>
         </w:tc>
@@ -6247,7 +6247,7 @@
                 <w:color w:val="172033"/>
                 <w:sz w:val="18"/>
               </w:rPr>
-              <w:t>☐</w:t>
+              <w:t>—</w:t>
             </w:r>
           </w:p>
         </w:tc>
@@ -6272,6 +6272,7 @@
                 <w:color w:val="172033"/>
                 <w:sz w:val="18"/>
               </w:rPr>
+              <w:t>Reopen before any Intel support claim</w:t>
             </w:r>
           </w:p>
         </w:tc>
@@ -6981,7 +6982,7 @@
         </w:numPr>
       </w:pPr>
       <w:r>
-        <w:t>Backend: all 1,008 tests passed in GitHub Actions run 32800966419 under clean Python 3.12 on exact candidate b2dcaec, including auth/PIN, encryption, migrations, backups, merchant upsert, licenses, local trust, Gmail coverage/restart handling, exact response contracts for all 182 API operations, certified statement parsers, hostile-file preflight, goal/simulation/recurring behavior, CA tax pack, classification memory, performance, net worth, behavior insights, reward-pilot redaction, and UTC finance-fetch regressions.</w:t>
+        <w:t>Backend: all 1,011 tests passed in GitHub Actions run 32827447450 under clean Python 3.12 on exact application candidate 5ee71fa, including auth/PIN, encryption, migrations, backups, merchant upsert, licenses, local trust, Gmail coverage/restart handling, startup dependency boundaries, exact response contracts for all 182 API operations, certified statement parsers, hostile-file preflight, goal/simulation/recurring behavior, CA tax pack, classification memory, performance, net worth, behavior insights, reward-pilot redaction, and UTC finance-fetch regressions.</w:t>
       </w:r>
     </w:p>
     <w:p>
@@ -7017,7 +7018,7 @@
         </w:numPr>
       </w:pPr>
       <w:r>
-        <w:t>Frontend: lint, static accessibility/contrast, memory-only authentication, build-identity, secure-password, tier-navigation, and production-build gates pass. The deterministic inventory records 422 controls across 19 route scopes. GitHub Actions run 32800966419 also passed the production smoke and accessibility suites in Chromium, Firefox, and WebKit; native screen-reader and signed-package interaction remain separate gates.</w:t>
+        <w:t>Frontend: lint, static accessibility/contrast, memory-only authentication, build-identity, secure-password, tier-navigation, and production-build gates pass. The deterministic inventory records 422 controls across 19 route scopes. GitHub Actions run 32827447450 also passed the production smoke and accessibility suites in Chromium, Firefox, and WebKit; native screen-reader and signed-package interaction remain separate gates.</w:t>
       </w:r>
     </w:p>
     <w:p>
@@ -7077,7 +7078,7 @@
         </w:numPr>
       </w:pPr>
       <w:r>
-        <w:t>Local packaging: the older 3a44f00 macOS arm64 build passed package verification with first start 2.997 seconds, restart 1.033 seconds, idle memory 602.9 MB across five processes, database preservation, local trust boundary, maintenance boundary, bundled-backend auto-start, and Gmail callback-path checks. DMG SHA-256: f960c103a8c584a9d45e31d39258a7149ae509dac35a6cb02914c52e6057b36b. ZIP SHA-256: 00b91ea7ce3ed5fbad5dc62bff03deae312a95ea962956fe9dc18651b57e4e0a. This evidence does not cover b2dcaec; a new signed/notarized package is required.</w:t>
+        <w:t>Native package smoke: run 32823401864 built and launched exact candidate 5ee71fa on macOS arm64, Windows x64, and Linux x64. First starts were 2.098, 3.886, and 3.224 seconds; restarts were 2.440, 2.390, and 2.360 seconds; idle memory was 529.2, 488.1, and 498.5 MB. An additional isolated owner-Mac run passed at 0.991 seconds first start, 0.822 seconds restart, and 598.8 MB. All preserved their isolated synthetic database and enforced trust/maintenance boundaries. Retained evidence binds desktop/backend/log hashes. The packages were unsigned, unpublished, and not retained as installers; signing and lifecycle acceptance remain required. macOS x64/Intel is owner-deferred.</w:t>
       </w:r>
     </w:p>
     <w:p>
@@ -7089,7 +7090,7 @@
         </w:numPr>
       </w:pPr>
       <w:r>
-        <w:t>Secrets: Gitleaks scanned the complete cleaned 166-commit history and the staged remediation diff with no leaks. No real statements, databases, tokens, keys, or customer screenshots are tracked.</w:t>
+        <w:t>Secrets: Gitleaks scanned the complete cleaned Git history and the staged remediation diff with no leaks. No real statements, databases, tokens, keys, or customer screenshots are tracked.</w:t>
       </w:r>
     </w:p>
     <w:p>
@@ -7153,7 +7154,7 @@
           <w:color w:val="172033"/>
           <w:sz w:val="21"/>
         </w:rPr>
-        <w:t>Source candidate b2dcaec passed all seven jobs in GitHub Actions run 32800966419, including the full backend suite, supply-chain and secret checks, desktop audits, website/browser matrices, Chromium/Firefox/WebKit app accessibility, and the clean Supabase database matrix. The repository API then confirmed PRIVATE. Any later application, workflow, lockfile, generated-asset, or verification-contract change requires a new exact-SHA green run before tagging; source CI does not replace signed-package, provider, legal, or launch authorization gates.</w:t>
+        <w:t>Application candidate 5ee71fa passed all seven jobs in GitHub Actions run 32827447450, including the full backend suite, supply-chain and secret checks, desktop audits, website/browser matrices, Chromium/Firefox/WebKit app accessibility, and the clean Supabase database matrix. The repository API then confirmed PRIVATE. Any later application, workflow, lockfile, generated-asset, or verification-contract change requires a new exact-SHA green run before tagging; source CI does not replace signed-package, provider, legal, or launch authorization gates.</w:t>
       </w:r>
     </w:p>
     <w:p>
@@ -7173,7 +7174,7 @@
         </w:numPr>
       </w:pPr>
       <w:r>
-        <w:t>Retain https://github.com/oculusrex14/GODFIN/actions/runs/32800966419 as exact-source evidence for commit b2dcaeccd237f5ae4e2076ca4959e5e329df72fe. All seven jobs completed successfully on 25 August 2026.</w:t>
+        <w:t>Retain https://github.com/oculusrex14/GODFIN/actions/runs/32827447450 as exact-source evidence for commit 5ee71fabfe8c7f28726bf625b75801cb254b23a1. All seven jobs completed successfully on 25 August 2026.</w:t>
       </w:r>
     </w:p>
     <w:p>
@@ -7367,7 +7368,7 @@
         </w:numPr>
       </w:pPr>
       <w:r>
-        <w:t>Create and push the annotated tag. The release workflow verifies exact tag/commit/version agreement, refuses an existing release for that tag, builds native macOS arm64/x64, Windows x64, and Linux x64 artifacts, verifies packages, generates SHA-256 checksums, SBOM, notices, and provenance, and creates a private draft GitHub Release.</w:t>
+        <w:t>Create and push the annotated tag. The release workflow verifies exact tag/commit/version agreement, refuses an existing release for that tag, builds the currently approved macOS arm64, Windows x64, and Linux x64 artifacts, verifies packages, generates SHA-256 checksums, SBOM, notices, and provenance, and creates a private draft GitHub Release. Keep macOS x64/Intel out of release claims until its deferred acceptance is reopened and passes.</w:t>
       </w:r>
     </w:p>
     <w:p>
@@ -8203,7 +8204,7 @@
                 <w:color w:val="172033"/>
                 <w:sz w:val="18"/>
               </w:rPr>
-              <w:t>Build/install b2dcaec or a documentation-only descendant, then complete fresh read-only authorization, sync, restart, disconnect, reconnect, and seven-day soak.</w:t>
+              <w:t>Install 5ee71fa or a documentation-only descendant, then complete fresh read-only authorization, sync, restart, disconnect, reconnect, and seven-day soak.</w:t>
             </w:r>
           </w:p>
         </w:tc>
@@ -9062,7 +9063,112 @@
                 <w:color w:val="172033"/>
                 <w:sz w:val="18"/>
               </w:rPr>
-              <w:t>Exact-candidate macOS arm64 package proof</w:t>
+              <w:t>Exact-candidate required-platform smoke</w:t>
+            </w:r>
+          </w:p>
+        </w:tc>
+        <w:tc>
+          <w:tcPr>
+            <w:tcW w:type="dxa" w:w="1300"/>
+            <w:tcMar>
+              <w:top w:w="80" w:type="dxa"/>
+              <w:start w:w="120" w:type="dxa"/>
+              <w:bottom w:w="80" w:type="dxa"/>
+              <w:end w:w="120" w:type="dxa"/>
+            </w:tcMar>
+            <w:vAlign w:val="center"/>
+          </w:tcPr>
+          <w:p>
+            <w:pPr>
+              <w:spacing w:after="0"/>
+            </w:pPr>
+            <w:r>
+              <w:rPr>
+                <w:rFonts w:ascii="Calibri" w:hAnsi="Calibri"/>
+                <w:color w:val="172033"/>
+                <w:sz w:val="18"/>
+              </w:rPr>
+              <w:t>Codex</w:t>
+            </w:r>
+          </w:p>
+        </w:tc>
+        <w:tc>
+          <w:tcPr>
+            <w:tcW w:type="dxa" w:w="1100"/>
+            <w:tcMar>
+              <w:top w:w="80" w:type="dxa"/>
+              <w:start w:w="120" w:type="dxa"/>
+              <w:bottom w:w="80" w:type="dxa"/>
+              <w:end w:w="120" w:type="dxa"/>
+            </w:tcMar>
+            <w:vAlign w:val="center"/>
+          </w:tcPr>
+          <w:p>
+            <w:pPr>
+              <w:spacing w:after="0"/>
+            </w:pPr>
+            <w:r>
+              <w:rPr>
+                <w:rFonts w:ascii="Calibri" w:hAnsi="Calibri"/>
+                <w:color w:val="172033"/>
+                <w:sz w:val="18"/>
+              </w:rPr>
+              <w:t>☒</w:t>
+            </w:r>
+          </w:p>
+        </w:tc>
+        <w:tc>
+          <w:tcPr>
+            <w:tcW w:type="dxa" w:w="3660"/>
+            <w:tcMar>
+              <w:top w:w="80" w:type="dxa"/>
+              <w:start w:w="120" w:type="dxa"/>
+              <w:bottom w:w="80" w:type="dxa"/>
+              <w:end w:w="120" w:type="dxa"/>
+            </w:tcMar>
+            <w:vAlign w:val="center"/>
+          </w:tcPr>
+          <w:p>
+            <w:pPr>
+              <w:spacing w:after="0"/>
+            </w:pPr>
+            <w:r>
+              <w:rPr>
+                <w:rFonts w:ascii="Calibri" w:hAnsi="Calibri"/>
+                <w:color w:val="172033"/>
+                <w:sz w:val="18"/>
+              </w:rPr>
+              <w:t>Run 32823401864 passed on macOS arm64, Windows x64, and Linux x64 with retained exact-SHA evidence. Packages are unsigned/unpublished smoke artifacts.</w:t>
+            </w:r>
+          </w:p>
+        </w:tc>
+      </w:tr>
+      <w:tr>
+        <w:trPr>
+          <w:cantSplit/>
+        </w:trPr>
+        <w:tc>
+          <w:tcPr>
+            <w:tcW w:type="dxa" w:w="3300"/>
+            <w:tcMar>
+              <w:top w:w="80" w:type="dxa"/>
+              <w:start w:w="120" w:type="dxa"/>
+              <w:bottom w:w="80" w:type="dxa"/>
+              <w:end w:w="120" w:type="dxa"/>
+            </w:tcMar>
+            <w:vAlign w:val="center"/>
+          </w:tcPr>
+          <w:p>
+            <w:pPr>
+              <w:spacing w:after="0"/>
+            </w:pPr>
+            <w:r>
+              <w:rPr>
+                <w:rFonts w:ascii="Calibri" w:hAnsi="Calibri"/>
+                <w:color w:val="172033"/>
+                <w:sz w:val="18"/>
+              </w:rPr>
+              <w:t>Signed clean-system lifecycle matrix</w:t>
             </w:r>
           </w:p>
         </w:tc>
@@ -9136,111 +9242,7 @@
                 <w:color w:val="172033"/>
                 <w:sz w:val="18"/>
               </w:rPr>
-              <w:t>Older 3a44f00 evidence exists, but b2dcaec or a documentation-only descendant must be rebuilt, privacy-verified, and notarized.</w:t>
-            </w:r>
-          </w:p>
-        </w:tc>
-      </w:tr>
-      <w:tr>
-        <w:trPr>
-          <w:cantSplit/>
-        </w:trPr>
-        <w:tc>
-          <w:tcPr>
-            <w:tcW w:type="dxa" w:w="3300"/>
-            <w:tcMar>
-              <w:top w:w="80" w:type="dxa"/>
-              <w:start w:w="120" w:type="dxa"/>
-              <w:bottom w:w="80" w:type="dxa"/>
-              <w:end w:w="120" w:type="dxa"/>
-            </w:tcMar>
-            <w:vAlign w:val="center"/>
-          </w:tcPr>
-          <w:p>
-            <w:pPr>
-              <w:spacing w:after="0"/>
-            </w:pPr>
-            <w:r>
-              <w:rPr>
-                <w:rFonts w:ascii="Calibri" w:hAnsi="Calibri"/>
-                <w:color w:val="172033"/>
-                <w:sz w:val="18"/>
-              </w:rPr>
-              <w:t>Cross-platform clean-system matrix</w:t>
-            </w:r>
-          </w:p>
-        </w:tc>
-        <w:tc>
-          <w:tcPr>
-            <w:tcW w:type="dxa" w:w="1300"/>
-            <w:tcMar>
-              <w:top w:w="80" w:type="dxa"/>
-              <w:start w:w="120" w:type="dxa"/>
-              <w:bottom w:w="80" w:type="dxa"/>
-              <w:end w:w="120" w:type="dxa"/>
-            </w:tcMar>
-            <w:vAlign w:val="center"/>
-          </w:tcPr>
-          <w:p>
-            <w:pPr>
-              <w:spacing w:after="0"/>
-            </w:pPr>
-            <w:r>
-              <w:rPr>
-                <w:rFonts w:ascii="Calibri" w:hAnsi="Calibri"/>
-                <w:color w:val="172033"/>
-                <w:sz w:val="18"/>
-              </w:rPr>
-            </w:r>
-          </w:p>
-        </w:tc>
-        <w:tc>
-          <w:tcPr>
-            <w:tcW w:type="dxa" w:w="1100"/>
-            <w:tcMar>
-              <w:top w:w="80" w:type="dxa"/>
-              <w:start w:w="120" w:type="dxa"/>
-              <w:bottom w:w="80" w:type="dxa"/>
-              <w:end w:w="120" w:type="dxa"/>
-            </w:tcMar>
-            <w:vAlign w:val="center"/>
-          </w:tcPr>
-          <w:p>
-            <w:pPr>
-              <w:spacing w:after="0"/>
-            </w:pPr>
-            <w:r>
-              <w:rPr>
-                <w:rFonts w:ascii="Calibri" w:hAnsi="Calibri"/>
-                <w:color w:val="172033"/>
-                <w:sz w:val="18"/>
-              </w:rPr>
-              <w:t>☐</w:t>
-            </w:r>
-          </w:p>
-        </w:tc>
-        <w:tc>
-          <w:tcPr>
-            <w:tcW w:type="dxa" w:w="3660"/>
-            <w:tcMar>
-              <w:top w:w="80" w:type="dxa"/>
-              <w:start w:w="120" w:type="dxa"/>
-              <w:bottom w:w="80" w:type="dxa"/>
-              <w:end w:w="120" w:type="dxa"/>
-            </w:tcMar>
-            <w:vAlign w:val="center"/>
-          </w:tcPr>
-          <w:p>
-            <w:pPr>
-              <w:spacing w:after="0"/>
-            </w:pPr>
-            <w:r>
-              <w:rPr>
-                <w:rFonts w:ascii="Calibri" w:hAnsi="Calibri"/>
-                <w:color w:val="172033"/>
-                <w:sz w:val="18"/>
-              </w:rPr>
-              <w:t>macOS x64, Windows 10/11 x64, and Ubuntu 22.04 x64 remain external gates.</w:t>
+              <w:t>Apple Silicon, Windows 10/11 x64, and Ubuntu 22.04+ remain external signed-installer gates. macOS x64/Intel is owner-deferred.</w:t>
             </w:r>
           </w:p>
         </w:tc>
@@ -9449,7 +9451,7 @@
                 <w:color w:val="172033"/>
                 <w:sz w:val="18"/>
               </w:rPr>
-              <w:t>Run 32800966419 passed on exact SHA b2dcaec; GitHub API verified oculusrex14/GODFIN is PRIVATE on 25 Aug 2026.</w:t>
+              <w:t>Run 32827447450 passed on exact SHA 5ee71fa; GitHub API verified oculusrex14/GODFIN is PRIVATE on 25 Aug 2026.</w:t>
             </w:r>
           </w:p>
         </w:tc>

</xml_diff>

<commit_message>
docs(owner): record beta website production evidence
</commit_message>
<xml_diff>
--- a/docs/GODFIN_OWNER_COMPLETION_RUNBOOK.docx
+++ b/docs/GODFIN_OWNER_COMPLETION_RUNBOOK.docx
@@ -64,9 +64,9 @@
           <w:color w:val="667085"/>
           <w:sz w:val="20"/>
         </w:rPr>
-        <w:t>Version 3.2  •  25 August 2026  •  oculusrex14/GODFIN</w:t>
+        <w:t>Version 3.3  •  31 August 2026  •  oculusrex14/GODFIN</w:t>
         <w:br/>
-        <w:t>Production branch: codex/godfin-production-v6</w:t>
+        <w:t>Beta website branch: codex/godfin-beta-website-v1</w:t>
       </w:r>
     </w:p>
     <w:p>
@@ -222,7 +222,7 @@
           <w:color w:val="172033"/>
           <w:sz w:val="21"/>
         </w:rPr>
-        <w:t>Application code candidate 5ee71fabfe8c7f28726bf625b75801cb254b23a1 is merged to main and pushed on codex/godfin-production-v6. GitHub Actions run 32827447450 completed successfully against that exact commit on 25 August 2026. Its seven green jobs include the complete 1,011-test Python 3.12 backend suite, dependency and full-history secret audits, frontend and website production gates, desktop privacy/update audits, production smoke tests, Chromium/Firefox/WebKit accessibility and website matrices, and a clean 11-migration Supabase database with 107 passing pgTAP assertions. All 182 API operations publish an explicit success or intentional terminal status, a non-empty media-specific success schema, and the shared error contract.</w:t>
+        <w:t>Beta website engineering candidate 493d20a8b0f75602dd7891578494b7e5cfc98760 is pushed on codex/godfin-beta-website-v1. GitHub Actions run 33345967709 completed successfully against that exact commit on 31 August 2026. Its seven green jobs include the complete 1,011-test Python 3.12 backend suite, dependency and full-history secret audits, frontend and website production gates, deterministic Remotion media verification, desktop privacy/update audits, production smoke tests, Chromium/Firefox/WebKit accessibility and website matrices, and a clean 12-migration Supabase database with 146 passing pgTAP assertions. All 182 API operations retain the previously verified response contracts.</w:t>
       </w:r>
     </w:p>
     <w:p>
@@ -234,7 +234,7 @@
         </w:numPr>
       </w:pPr>
       <w:r>
-        <w:t>Production repository URL: https://github.com/oculusrex14/GODFIN. The GitHub API reports PRIVATE as of 25 August 2026; no public repository or release was created.</w:t>
+        <w:t>Production repository URL: https://github.com/oculusrex14/GODFIN. It was made public only for the owner-requested CI window. Return it to PRIVATE immediately after the final documentation-only CI run; no public release or installer is authorized.</w:t>
       </w:r>
     </w:p>
     <w:p>
@@ -258,7 +258,7 @@
         </w:numPr>
       </w:pPr>
       <w:r>
-        <w:t>Supabase project: GODFIN (ap-south-1). All 11 ordered migration hashes through 20260825021500_grant_authenticated_rls_reads.sql align on the linked project. Clean CI and the linked project each pass all 107 pgTAP assertions for least-privilege grants, own-row RLS, two-user isolation, abuse controls, Cashfree state, upgrades, device caps, and email leasing. Managed backup/PITR, a restore drill, Auth leaked-password protection, and the real second-account browser flow remain required.</w:t>
+        <w:t>Supabase project: GODFIN (ap-south-1). All 12 ordered migrations through 20260830044445_beta_waitlist_access_entitlements_feedback.sql align on the linked project. Clean CI passes all 146 pgTAP assertions for least-privilege grants, own-row RLS, two-user isolation, abuse controls, Cashfree state, upgrades, device caps, email leasing, beta invitations, phased entitlements, Gmail-test selection, checkout allowlisting, expiry, and feedback isolation. Managed backup/PITR, a restore drill, Auth leaked-password protection, and the real second-account browser flow remain required.</w:t>
       </w:r>
     </w:p>
     <w:p>
@@ -294,7 +294,7 @@
         </w:numPr>
       </w:pPr>
       <w:r>
-        <w:t>The website product tour uses real React application captures generated only from synthetic data, muted WebM/MP4 media with reduced-motion fallbacks, and build-time checks that prevent unreleased features from being advertised. godfin.dev is the final canonical domain and godfin.vercel.app is the fallback. The older source commit 3a44f00 is still the deployed production website; checkout remains deliberately disabled. Candidate 5ee71fa is not deployed and must not be promoted until the provider, recovery, and legal gates pass.</w:t>
+        <w:t>The beta website is deployed to production as Vercel deployment dpl_4oXjaiVBh3k9q9cBff2WY9gCRzyA. godfin.dev is canonical and godfin.vercel.app remains the fallback. Public /demo and /how-it-works use one deterministic, fictional household; the static demo makes no finance-service requests and never presents upload or bank-connect controls. Public checkout remains closed. The waitlist fails closed until the owner verifies Resend/DNS and supplies RESEND_API_KEY plus RESEND_FROM_EMAIL through Vercel's encrypted environment settings.</w:t>
       </w:r>
     </w:p>
     <w:p>
@@ -402,7 +402,7 @@
         </w:numPr>
       </w:pPr>
       <w:r>
-        <w:t>Application-code evidence is current through immutable commit 5ee71fabfe8c7f28726bf625b75801cb254b23a1 on main and codex/godfin-production-v6. GitHub Actions run 32827447450 passed all seven jobs on that exact SHA, including all 1,011 backend tests, the three-engine browser matrices, and the clean Supabase database matrix. The repository was then returned to PRIVATE and verified through the GitHub API. This closes source-level hosted CI, clean-database RLS, repository-privacy, and required-platform unpacked-smoke gates; it does not authorize a tag, installer, deployment, payment acceptance, update promotion, or public launch.</w:t>
+        <w:t>Beta website evidence is current through immutable commit 493d20a8b0f75602dd7891578494b7e5cfc98760 on codex/godfin-beta-website-v1. GitHub Actions run 33345967709 passed all seven jobs on that exact SHA, including all 1,011 backend tests, both three-engine browser matrices, deterministic media checks, and the clean 12-migration Supabase database matrix. Production Chromium acceptance then passed 7/7 on godfin.dev with no Vercel runtime errors. This authorizes the tested beta website content only; it does not authorize an installer, payment acceptance, updater promotion, or public desktop launch.</w:t>
       </w:r>
     </w:p>
     <w:p>
@@ -451,6 +451,267 @@
       </w:pPr>
       <w:r>
         <w:t>Reward pilot, sponsor card, PPP checkout, and OpenDataLoader shipping remain safely feature-gated where applicable.</w:t>
+      </w:r>
+    </w:p>
+    <w:p>
+      <w:r>
+        <w:br w:type="page"/>
+      </w:r>
+    </w:p>
+    <w:p>
+      <w:pPr>
+        <w:pStyle w:val="Heading1"/>
+      </w:pPr>
+      <w:r>
+        <w:t>Beta website, tester operations, and demo</w:t>
+      </w:r>
+    </w:p>
+    <w:p>
+      <w:pPr>
+        <w:keepLines/>
+        <w:spacing w:before="100" w:after="160" w:line="288" w:lineRule="auto"/>
+        <w:ind w:left="115" w:right="115"/>
+        <w:shd w:fill="EAF7EF"/>
+        <w:pBdr>
+          <w:left w:val="single" w:sz="18" w:space="8" w:color="17663A"/>
+        </w:pBdr>
+      </w:pPr>
+      <w:r>
+        <w:rPr>
+          <w:rFonts w:ascii="Calibri" w:hAnsi="Calibri"/>
+          <w:b/>
+          <w:color w:val="17663A"/>
+          <w:sz w:val="21"/>
+        </w:rPr>
+        <w:t xml:space="preserve">PRODUCTION BETA WEBSITE  </w:t>
+      </w:r>
+      <w:r>
+        <w:rPr>
+          <w:rFonts w:ascii="Calibri" w:hAnsi="Calibri"/>
+          <w:color w:val="172033"/>
+          <w:sz w:val="21"/>
+        </w:rPr>
+        <w:t>Vercel deployment dpl_4oXjaiVBh3k9q9cBff2WY9gCRzyA is Ready on godfin.dev. Public /demo requires no account, uses only static synthetic data, and makes no finance-service requests. Pricing is explicitly planned and public checkout is closed. The waitlist is visibly and safely disabled until Resend email confirmation can work.</w:t>
+      </w:r>
+    </w:p>
+    <w:p>
+      <w:pPr>
+        <w:keepLines/>
+        <w:numPr>
+          <w:ilvl w:val="0"/>
+          <w:numId w:val="10"/>
+        </w:numPr>
+      </w:pPr>
+      <w:r>
+        <w:t>Public routes verified with HTTP 200: /, /demo, /how-it-works, /pricing, /account, /privacy, /terms, and /docs. HSTS, CSP, frame denial, MIME protection, referrer policy, and permissions policy remain present.</w:t>
+      </w:r>
+    </w:p>
+    <w:p>
+      <w:pPr>
+        <w:keepLines/>
+        <w:numPr>
+          <w:ilvl w:val="0"/>
+          <w:numId w:val="10"/>
+        </w:numPr>
+      </w:pPr>
+      <w:r>
+        <w:t>Production Chromium acceptance passed 7/7: honest beta path, accessible video, reduced-motion fallback, auth-free static demo, narrow viewport, current support/non-goals, lifetime-only planned pricing, no public checkout, and representative accessibility checks.</w:t>
+      </w:r>
+    </w:p>
+    <w:p>
+      <w:pPr>
+        <w:keepLines/>
+        <w:numPr>
+          <w:ilvl w:val="0"/>
+          <w:numId w:val="10"/>
+        </w:numPr>
+      </w:pPr>
+      <w:r>
+        <w:t>The additive migration 20260830044445_beta_waitlist_access_entitlements_feedback.sql is applied remotely. It adds selected-tester invitations, account-bound beta access, Core/Pro/Max phases, expiry, Gmail-test selection, controlled INR 1 checkout allowlisting, and isolated feedback without weakening the existing Cashfree verification path.</w:t>
+      </w:r>
+    </w:p>
+    <w:p>
+      <w:pPr>
+        <w:keepLines/>
+        <w:numPr>
+          <w:ilvl w:val="0"/>
+          <w:numId w:val="10"/>
+        </w:numPr>
+      </w:pPr>
+      <w:r>
+        <w:t>The owner command surface is website/scripts/beta-ops.mjs. Run it from website with npm run beta:ops -- help. It can list confirmed/active candidates; shortlist, invite, activate, phase, pause, revoke, or complete access; manage Gmail-test and checkout allowlists; and inspect feedback. It never prints invite tokens, license keys, OAuth data, or service credentials.</w:t>
+      </w:r>
+    </w:p>
+    <w:p>
+      <w:pPr>
+        <w:keepLines/>
+        <w:numPr>
+          <w:ilvl w:val="0"/>
+          <w:numId w:val="10"/>
+        </w:numPr>
+      </w:pPr>
+      <w:r>
+        <w:t>Normal progression is confirmed waitlist -&gt; owner shortlist -&gt; email invite -&gt; matching Google account acceptance -&gt; Core -&gt; Pro -&gt; Max. Waitlist membership alone grants nothing. INR 1 validation is a separate, private, owner-allowlisted checkout test for eligible active Max testers and is never public pricing or a normal purchase license.</w:t>
+      </w:r>
+    </w:p>
+    <w:p>
+      <w:pPr>
+        <w:keepLines/>
+        <w:numPr>
+          <w:ilvl w:val="0"/>
+          <w:numId w:val="10"/>
+        </w:numPr>
+      </w:pPr>
+      <w:r>
+        <w:t>Generated media is reproducible from the isolated website/remotion project using Remotion 4.0.518 and React 19.1.9. It produces a 24-second 1920x1080 hero, a 54-second 1920x1080 walkthrough, an 18-second 1080x1920 social cut, WebM fallbacks, posters, captions, provenance hashes, decoded-frame checks, and privacy scans. Remotion is build tooling only and is not in the Next.js runtime bundle.</w:t>
+      </w:r>
+    </w:p>
+    <w:p>
+      <w:pPr>
+        <w:keepLines/>
+        <w:numPr>
+          <w:ilvl w:val="0"/>
+          <w:numId w:val="10"/>
+        </w:numPr>
+      </w:pPr>
+      <w:r>
+        <w:t>Remotion's current Free License states that individuals and for-profit organizations with three or fewer people may create and automate videos. A team of four or more, or another covered collaboration, needs the applicable Company terms. The owner must confirm the correct tier with Remotion and counsel before ongoing production use. Codec patent obligations are separate and are not covered by Remotion's license. This is an engineering note, not legal advice.</w:t>
+      </w:r>
+    </w:p>
+    <w:p>
+      <w:pPr>
+        <w:keepLines/>
+        <w:numPr>
+          <w:ilvl w:val="0"/>
+          <w:numId w:val="10"/>
+        </w:numPr>
+      </w:pPr>
+      <w:r>
+        <w:t>Required Vercel variables still missing for the public waitlist are RESEND_API_KEY and RESEND_FROM_EMAIL. Cashfree validation also remains off until CASHFREE_CLIENT_ID and CASHFREE_CLIENT_SECRET are supplied and the provider/KYC gates pass. Beta download URLs remain unset until signed installers exist.</w:t>
+      </w:r>
+    </w:p>
+    <w:p>
+      <w:pPr>
+        <w:pStyle w:val="RunbookCaption"/>
+      </w:pPr>
+      <w:r>
+        <w:t xml:space="preserve">Official reference: </w:t>
+      </w:r>
+      <w:hyperlink r:id="rId11">
+        <w:r>
+          <w:rPr>
+            <w:color w:val="2E74B5"/>
+            <w:u w:val="single"/>
+          </w:rPr>
+          <w:t>Remotion pricing and license overview</w:t>
+        </w:r>
+      </w:hyperlink>
+    </w:p>
+    <w:p>
+      <w:pPr>
+        <w:pStyle w:val="RunbookCaption"/>
+      </w:pPr>
+      <w:r>
+        <w:t xml:space="preserve">Official reference: </w:t>
+      </w:r>
+      <w:hyperlink r:id="rId12">
+        <w:r>
+          <w:rPr>
+            <w:color w:val="2E74B5"/>
+            <w:u w:val="single"/>
+          </w:rPr>
+          <w:t>Remotion license text</w:t>
+        </w:r>
+      </w:hyperlink>
+    </w:p>
+    <w:p>
+      <w:pPr>
+        <w:pStyle w:val="RunbookCaption"/>
+      </w:pPr>
+      <w:r>
+        <w:t xml:space="preserve">Official reference: </w:t>
+      </w:r>
+      <w:hyperlink r:id="rId13">
+        <w:r>
+          <w:rPr>
+            <w:color w:val="2E74B5"/>
+            <w:u w:val="single"/>
+          </w:rPr>
+          <w:t>Remotion license FAQ</w:t>
+        </w:r>
+      </w:hyperlink>
+    </w:p>
+    <w:p>
+      <w:pPr>
+        <w:pStyle w:val="RunbookCaption"/>
+      </w:pPr>
+      <w:r>
+        <w:t xml:space="preserve">Official reference: </w:t>
+      </w:r>
+      <w:hyperlink r:id="rId14">
+        <w:r>
+          <w:rPr>
+            <w:color w:val="2E74B5"/>
+            <w:u w:val="single"/>
+          </w:rPr>
+          <w:t>Remotion current terms</w:t>
+        </w:r>
+      </w:hyperlink>
+    </w:p>
+    <w:p>
+      <w:pPr>
+        <w:spacing w:after="80"/>
+      </w:pPr>
+      <w:r>
+        <w:rPr>
+          <w:b/>
+        </w:rPr>
+        <w:t xml:space="preserve">Beta cohort owner: </w:t>
+      </w:r>
+      <w:r>
+        <w:t>__________________________________________________________________________</w:t>
+      </w:r>
+    </w:p>
+    <w:p>
+      <w:pPr>
+        <w:spacing w:after="80"/>
+      </w:pPr>
+      <w:r>
+        <w:rPr>
+          <w:b/>
+        </w:rPr>
+        <w:t xml:space="preserve">Resend verification date: </w:t>
+      </w:r>
+      <w:r>
+        <w:t>__________________________________________________________________________</w:t>
+      </w:r>
+    </w:p>
+    <w:p>
+      <w:pPr>
+        <w:spacing w:after="80"/>
+      </w:pPr>
+      <w:r>
+        <w:rPr>
+          <w:b/>
+        </w:rPr>
+        <w:t xml:space="preserve">Cashfree sandbox approval: </w:t>
+      </w:r>
+      <w:r>
+        <w:t>__________________________________________________________________________</w:t>
+      </w:r>
+    </w:p>
+    <w:p>
+      <w:pPr>
+        <w:spacing w:after="80"/>
+      </w:pPr>
+      <w:r>
+        <w:rPr>
+          <w:b/>
+        </w:rPr>
+        <w:t xml:space="preserve">Completed by / date: </w:t>
+      </w:r>
+      <w:r>
+        <w:t>__________________________________________________________________________</w:t>
       </w:r>
     </w:p>
     <w:p>
@@ -639,7 +900,7 @@
                 <w:color w:val="172033"/>
                 <w:sz w:val="18"/>
               </w:rPr>
-              <w:t>Closed on 25 August 2026 for application candidate 5ee71fa.</w:t>
+              <w:t>Run 33345967709 is green on exact beta SHA 493d20a; the repository is public only for the owner-requested CI window.</w:t>
             </w:r>
           </w:p>
         </w:tc>
@@ -664,7 +925,7 @@
                 <w:color w:val="172033"/>
                 <w:sz w:val="18"/>
               </w:rPr>
-              <w:t>Keep the repository private and rerun CI after any later application or workflow change.</w:t>
+              <w:t>After the documentation-only final CI run is green, return the repository to private and verify with the GitHub API.</w:t>
             </w:r>
           </w:p>
         </w:tc>
@@ -689,7 +950,7 @@
                 <w:color w:val="172033"/>
                 <w:sz w:val="18"/>
               </w:rPr>
-              <w:t>Actions run 32827447450 is green on exact SHA 5ee71fa; GitHub API reports PRIVATE.</w:t>
+              <w:t>All seven required jobs are green and repository visibility is PRIVATE.</w:t>
             </w:r>
           </w:p>
         </w:tc>
@@ -849,7 +1110,7 @@
                 <w:color w:val="172033"/>
                 <w:sz w:val="18"/>
               </w:rPr>
-              <w:t>Repository integration, all 11 hosted migrations, and database state-machine tests pass; KYC, credentials, webhook, and provider sandbox evidence are absent.</w:t>
+              <w:t>Repository integration, all 12 hosted migrations, database state-machine tests, and private beta allowlisting pass; KYC, credentials, webhook, and provider sandbox evidence are absent.</w:t>
             </w:r>
           </w:p>
         </w:tc>
@@ -874,7 +1135,7 @@
                 <w:color w:val="172033"/>
                 <w:sz w:val="18"/>
               </w:rPr>
-              <w:t>Complete KYC; configure sandbox keys and required webhook events; keep checkout disabled until the full sandbox matrix passes.</w:t>
+              <w:t>Complete KYC; add CASHFREE_CLIENT_ID and CASHFREE_CLIENT_SECRET through Vercel; configure sandbox webhooks; keep public checkout disabled until the full sandbox matrix passes.</w:t>
             </w:r>
           </w:p>
         </w:tc>
@@ -899,7 +1160,7 @@
                 <w:color w:val="172033"/>
                 <w:sz w:val="18"/>
               </w:rPr>
-              <w:t>Replay-safe purchase, upgrade, refund, dispute, rate-limit, and one-email flows pass.</w:t>
+              <w:t>Replay-safe private INR 1 validation, purchase, upgrade, refund, dispute, rate-limit, and one-email flows pass.</w:t>
             </w:r>
           </w:p>
         </w:tc>
@@ -954,7 +1215,7 @@
                 <w:color w:val="172033"/>
                 <w:sz w:val="18"/>
               </w:rPr>
-              <w:t>No sending key/domain verification.</w:t>
+              <w:t>RESEND_API_KEY and RESEND_FROM_EMAIL are absent, so double opt-in cannot be delivered and the production waitlist correctly stays disabled.</w:t>
             </w:r>
           </w:p>
         </w:tc>
@@ -979,7 +1240,7 @@
                 <w:color w:val="172033"/>
                 <w:sz w:val="18"/>
               </w:rPr>
-              <w:t>Verify godfin.dev and add the production key.</w:t>
+              <w:t>Verify godfin.dev in Resend, configure SPF/DKIM/DMARC, create hello@godfin.dev, then add both variables through encrypted Vercel settings and redeploy.</w:t>
             </w:r>
           </w:p>
         </w:tc>
@@ -1004,7 +1265,7 @@
                 <w:color w:val="172033"/>
                 <w:sz w:val="18"/>
               </w:rPr>
-              <w:t>SPF, DKIM, DMARC and two inbox tests pass.</w:t>
+              <w:t>The waitlist enables, confirmation works once, SPF/DKIM/DMARC pass, and two inbox tests pass.</w:t>
             </w:r>
           </w:p>
         </w:tc>
@@ -1893,7 +2154,7 @@
       <w:r>
         <w:t xml:space="preserve">Official reference: </w:t>
       </w:r>
-      <w:hyperlink r:id="rId11">
+      <w:hyperlink r:id="rId15">
         <w:r>
           <w:rPr>
             <w:color w:val="2E74B5"/>
@@ -2277,7 +2538,7 @@
       <w:r>
         <w:t xml:space="preserve">Official reference: </w:t>
       </w:r>
-      <w:hyperlink r:id="rId12">
+      <w:hyperlink r:id="rId16">
         <w:r>
           <w:rPr>
             <w:color w:val="2E74B5"/>
@@ -2440,7 +2701,7 @@
         <w:pStyle w:val="Heading2"/>
       </w:pPr>
       <w:r>
-        <w:t>2.2 Verify all 11 Supabase migrations and recovery</w:t>
+        <w:t>2.2 Verify all 12 Supabase migrations and recovery</w:t>
       </w:r>
     </w:p>
     <w:p>
@@ -2468,7 +2729,7 @@
           <w:color w:val="172033"/>
           <w:sz w:val="21"/>
         </w:rPr>
-        <w:t>All 11 migrations now align remotely and both clean CI and linked-project database suites pass 107 assertions. Keep CHECKOUT_ENABLED=false throughout this section. Backup/PITR, a restore drill, leaked-password protection, and provider sandbox evidence still block checkout.</w:t>
+        <w:t>All 12 migrations now align remotely and clean CI passes 146 assertions. Keep CHECKOUT_ENABLED=false throughout this section. Backup/PITR, a restore drill, leaked-password protection, and provider sandbox evidence still block checkout.</w:t>
       </w:r>
     </w:p>
     <w:p>
@@ -2480,7 +2741,7 @@
         </w:numPr>
       </w:pPr>
       <w:r>
-        <w:t>Repository evidence already retained: GitHub Actions run 32827447450 applied all 11 migrations to a clean temporary database and passed all 107 pgTAP assertions on exact application candidate 5ee71fa. Do not replace this with source inspection.</w:t>
+        <w:t>Repository evidence already retained: GitHub Actions run 33345967709 applied all 12 migrations to a clean temporary database and passed all 146 pgTAP assertions on exact beta website candidate 493d20a. Do not replace this with source inspection.</w:t>
       </w:r>
     </w:p>
     <w:p>
@@ -2492,7 +2753,7 @@
         </w:numPr>
       </w:pPr>
       <w:r>
-        <w:t>Linked-project evidence already retained: all 11 local/remote migration versions align and all five live pgTAP files passed 107 assertions. See docs/production-remediation/SUPABASE_REMOTE_EVIDENCE_2026-08-25.md.</w:t>
+        <w:t>Linked-project evidence: all 12 local/remote migration versions align through 20260830044445_beta_waitlist_access_entitlements_feedback.sql. The previous 11-migration evidence remains under docs/production-remediation; retain the new CLI alignment output with the beta tranche evidence.</w:t>
       </w:r>
     </w:p>
     <w:p>
@@ -2564,7 +2825,7 @@
         </w:numPr>
       </w:pPr>
       <w:r>
-        <w:t>Run: supabase migration list --linked. Confirm all 11 names appear in both local and remote columns, ending with 20260825021500_grant_authenticated_rls_reads.sql.</w:t>
+        <w:t>Run: supabase migration list --linked. Confirm all 12 names appear in both local and remote columns, ending with 20260830044445_beta_waitlist_access_entitlements_feedback.sql.</w:t>
       </w:r>
     </w:p>
     <w:p>
@@ -2610,7 +2871,7 @@
       <w:r>
         <w:t xml:space="preserve">Official reference: </w:t>
       </w:r>
-      <w:hyperlink r:id="rId13">
+      <w:hyperlink r:id="rId17">
         <w:r>
           <w:rPr>
             <w:color w:val="2E74B5"/>
@@ -3448,7 +3709,7 @@
         </w:numPr>
       </w:pPr>
       <w:r>
-        <w:t>All 11 ordered Supabase migrations are applied. Keep CHECKOUT_ENABLED=false until recovery/Auth and the complete Cashfree sandbox matrix below pass.</w:t>
+        <w:t>All 12 ordered Supabase migrations are applied. Keep CHECKOUT_ENABLED=false until recovery/Auth and the complete Cashfree sandbox matrix below pass.</w:t>
       </w:r>
     </w:p>
     <w:p>
@@ -3642,7 +3903,7 @@
       <w:r>
         <w:t xml:space="preserve">Official reference: </w:t>
       </w:r>
-      <w:hyperlink r:id="rId14">
+      <w:hyperlink r:id="rId18">
         <w:r>
           <w:rPr>
             <w:color w:val="2E74B5"/>
@@ -3879,7 +4140,7 @@
       <w:r>
         <w:t xml:space="preserve">Official reference: </w:t>
       </w:r>
-      <w:hyperlink r:id="rId15">
+      <w:hyperlink r:id="rId19">
         <w:r>
           <w:rPr>
             <w:color w:val="2E74B5"/>
@@ -3978,7 +4239,7 @@
           <w:color w:val="172033"/>
           <w:sz w:val="21"/>
         </w:rPr>
-        <w:t>On 24 August 2026, older source commit 3a44f00 was deployed to Vercel production as deployment dpl_HjwgU9aBfaBvdcFH8aiR981mgVDY. https://godfin.dev and https://godfin.vercel.app return HTTP 200; https://www.godfin.dev permanently redirects to the apex; HSTS and the Cashfree-only CSP are present; hello@godfin.dev is the only public contact; and checkout fails closed with HTTP 503. This verifies the domain and safe-disable posture only—not candidate 5ee71fa, Cashfree credentials, recovery readiness, or payment acceptance.</w:t>
+        <w:t>On 31 August 2026, tested preview dpl_H5Zxbiw6ar7naiioG6HfCtrUDQ6p was promoted as production deployment dpl_4oXjaiVBh3k9q9cBff2WY9gCRzyA. https://godfin.dev and https://godfin.vercel.app return HTTP 200; https://www.godfin.dev uses the production alias; HSTS and the Cashfree-only CSP are present; all seven public Chromium acceptance tests pass; media byte ranges return 206; and no runtime errors were reported. Public checkout is closed and the waitlist is disabled until Resend is configured.</w:t>
       </w:r>
     </w:p>
     <w:p>
@@ -4062,7 +4323,7 @@
         </w:numPr>
       </w:pPr>
       <w:r>
-        <w:t>Run: vercel env ls. The public domain/email variables, Supabase variables, LICENSE_SIGNING_SECRET, CASHFREE_ENVIRONMENT=sandbox, CHECKOUT_ENABLED=false, PPP_CHECKOUT_ENABLED=false, and CASHFREE_GLOBAL_PAYMENTS_APPROVED=false are already present. Add the still-missing ABUSE_HASH_SECRET, CASHFREE_CLIENT_ID, CASHFREE_CLIENT_SECRET, LICENSE_ENTITLEMENT_ACTIVE_KEY_VERSION, LICENSE_ENTITLEMENT_PRIVATE_KEYS_JSON, RESEND_API_KEY, and RESEND_FROM_EMAIL only through Vercel's encrypted environment UI or prompt; never print or commit their values.</w:t>
+        <w:t>Run: vercel env ls. The public domain/email variables, Supabase variables, abuse secret, license-signing and entitlement keys, CASHFREE_ENVIRONMENT=sandbox, CHECKOUT_ENABLED=false, PPP_CHECKOUT_ENABLED=false, and CASHFREE_GLOBAL_PAYMENTS_APPROVED=false are already present. Add the still-missing CASHFREE_CLIENT_ID, CASHFREE_CLIENT_SECRET, RESEND_API_KEY, and RESEND_FROM_EMAIL only through Vercel's encrypted environment UI or prompt; never print or commit their values. Add beta download URLs only after signed installers exist.</w:t>
       </w:r>
     </w:p>
     <w:p>
@@ -4074,7 +4335,7 @@
         </w:numPr>
       </w:pPr>
       <w:r>
-        <w:t>The 3a44f00 production deployment is intentionally fail-closed and predates candidate 5ee71fa. After any provider-variable change, keep CHECKOUT_ENABLED=false, deploy a preview from the exact candidate, and test account sign-in, pricing, disabled checkout behavior, waitlist, privacy, terms, and license verification.</w:t>
+        <w:t>Production deployment dpl_4oXjaiVBh3k9q9cBff2WY9gCRzyA is intentionally fail-closed for public checkout and unconfirmed email collection. After any provider-variable change, keep CHECKOUT_ENABLED=false, deploy a preview from the exact candidate, and retest account sign-in, pricing, disabled checkout behavior, waitlist confirmation, privacy, terms, and license verification.</w:t>
       </w:r>
     </w:p>
     <w:p>
@@ -4086,7 +4347,7 @@
         </w:numPr>
       </w:pPr>
       <w:r>
-        <w:t>All 11 Supabase migrations are applied and database-tested. After recovery/Auth and the Cashfree sandbox matrix pass, run the repository website checks again and deploy the exact tested SHA to production. A production deployment does not authorize public marketing or customer checkout.</w:t>
+        <w:t>All 12 Supabase migrations are applied and database-tested. After recovery/Auth and the Cashfree sandbox matrix pass, run the repository website checks again and deploy the exact tested SHA to production. A production deployment does not authorize customer checkout or the public desktop launch.</w:t>
       </w:r>
     </w:p>
     <w:p>
@@ -5193,7 +5454,7 @@
       <w:r>
         <w:t xml:space="preserve">Official reference: </w:t>
       </w:r>
-      <w:hyperlink r:id="rId16">
+      <w:hyperlink r:id="rId20">
         <w:r>
           <w:rPr>
             <w:color w:val="2E74B5"/>
@@ -6982,7 +7243,7 @@
         </w:numPr>
       </w:pPr>
       <w:r>
-        <w:t>Backend: all 1,011 tests passed in GitHub Actions run 32827447450 under clean Python 3.12 on exact application candidate 5ee71fa, including auth/PIN, encryption, migrations, backups, merchant upsert, licenses, local trust, Gmail coverage/restart handling, startup dependency boundaries, exact response contracts for all 182 API operations, certified statement parsers, hostile-file preflight, goal/simulation/recurring behavior, CA tax pack, classification memory, performance, net worth, behavior insights, reward-pilot redaction, and UTC finance-fetch regressions.</w:t>
+        <w:t>Backend: all 1,011 tests passed in GitHub Actions run 33345967709 under clean Python 3.12 on exact beta website candidate 493d20a, including auth/PIN, encryption, migrations, backups, merchant upsert, licenses, local trust, Gmail coverage/restart handling, startup dependency boundaries, exact response contracts for all 182 API operations, certified statement parsers, hostile-file preflight, goal/simulation/recurring behavior, CA tax pack, classification memory, performance, net worth, behavior insights, reward-pilot redaction, and UTC finance-fetch regressions.</w:t>
       </w:r>
     </w:p>
     <w:p>
@@ -7018,7 +7279,7 @@
         </w:numPr>
       </w:pPr>
       <w:r>
-        <w:t>Frontend: lint, static accessibility/contrast, memory-only authentication, build-identity, secure-password, tier-navigation, and production-build gates pass. The deterministic inventory records 422 controls across 19 route scopes. GitHub Actions run 32827447450 also passed the production smoke and accessibility suites in Chromium, Firefox, and WebKit; native screen-reader and signed-package interaction remain separate gates.</w:t>
+        <w:t>Frontend: lint, static accessibility/contrast, memory-only authentication, build-identity, secure-password, tier-navigation, and production-build gates pass. The deterministic inventory records 422 controls across 19 route scopes. GitHub Actions run 33345967709 also passed the production smoke and accessibility suites in Chromium, Firefox, and WebKit, including focus restoration during idle upload progress ticks; native screen-reader and signed-package interaction remain separate gates.</w:t>
       </w:r>
     </w:p>
     <w:p>
@@ -7030,7 +7291,7 @@
         </w:numPr>
       </w:pPr>
       <w:r>
-        <w:t>Website: entitlement/payment contract verification, five Cashfree tests, three strict webhook-body tests, three lifetime-upgrade tests, 11 ordered migration hashes, production build, real-app product chapters, reduced-motion fallbacks, lifetime/no-bundled-credit pricing, security headers, checkout safe-disable behavior, and dependency audit pass. A clean Supabase stack and the linked project each pass all 107 pgTAP assertions. The previously measured production URL scored Lighthouse performance 99, accessibility 100, and SEO 100, with LCP 1.73 seconds and CLS 0; repeat this measurement after deploying the exact final SHA.</w:t>
+        <w:t>Website: beta access, invitation identity binding, private INR 1 allowlisting, entitlement/payment contracts, Cashfree signature/idempotency, 12 ordered migration hashes, deterministic Remotion rendering and media verification, production build, auth-free static demo, reduced-motion fallbacks, planned lifetime/no-bundled-credit pricing, security headers, no public checkout, and dependency audit pass. A clean Supabase stack passes all 146 pgTAP assertions. CI website acceptance passed 21/21 across Chromium, Firefox, and WebKit; production Chromium passed 7/7 on godfin.dev. Repeat Lighthouse after Resend configuration without weakening the fail-closed waitlist.</w:t>
       </w:r>
     </w:p>
     <w:p>
@@ -7154,7 +7415,7 @@
           <w:color w:val="172033"/>
           <w:sz w:val="21"/>
         </w:rPr>
-        <w:t>Application candidate 5ee71fa passed all seven jobs in GitHub Actions run 32827447450, including the full backend suite, supply-chain and secret checks, desktop audits, website/browser matrices, Chromium/Firefox/WebKit app accessibility, and the clean Supabase database matrix. The repository API then confirmed PRIVATE. Any later application, workflow, lockfile, generated-asset, or verification-contract change requires a new exact-SHA green run before tagging; source CI does not replace signed-package, provider, legal, or launch authorization gates.</w:t>
+        <w:t>Beta website candidate 493d20a passed all seven jobs in GitHub Actions run 33345967709, including the full backend suite, supply-chain and full-history secret checks, desktop audits, deterministic media checks, website/browser matrices, Chromium/Firefox/WebKit app accessibility, and the clean 12-migration Supabase database matrix. Return the repository to PRIVATE after the final documentation-only CI run. Any later application, workflow, lockfile, generated-asset, or verification-contract change requires a new exact-SHA green run before tagging; source CI does not replace signed-package, provider, legal, or launch authorization gates.</w:t>
       </w:r>
     </w:p>
     <w:p>
@@ -7174,7 +7435,7 @@
         </w:numPr>
       </w:pPr>
       <w:r>
-        <w:t>Retain https://github.com/oculusrex14/GODFIN/actions/runs/32827447450 as exact-source evidence for commit 5ee71fabfe8c7f28726bf625b75801cb254b23a1. All seven jobs completed successfully on 25 August 2026.</w:t>
+        <w:t>Retain https://github.com/oculusrex14/GODFIN/actions/runs/33345967709 as exact-source evidence for commit 493d20a8b0f75602dd7891578494b7e5cfc98760. All seven jobs completed successfully on 31 August 2026.</w:t>
       </w:r>
     </w:p>
     <w:p>
@@ -7232,13 +7493,13 @@
       <w:r>
         <w:t xml:space="preserve">Official reference: </w:t>
       </w:r>
-      <w:hyperlink r:id="rId17">
+      <w:hyperlink r:id="rId21">
         <w:r>
           <w:rPr>
             <w:color w:val="2E74B5"/>
             <w:u w:val="single"/>
           </w:rPr>
-          <w:t>Exact candidate CI run</w:t>
+          <w:t>Exact beta website CI run</w:t>
         </w:r>
       </w:hyperlink>
     </w:p>
@@ -7249,7 +7510,7 @@
       <w:r>
         <w:t xml:space="preserve">Official reference: </w:t>
       </w:r>
-      <w:hyperlink r:id="rId18">
+      <w:hyperlink r:id="rId22">
         <w:r>
           <w:rPr>
             <w:color w:val="2E74B5"/>
@@ -8724,7 +8985,7 @@
                 <w:color w:val="172033"/>
                 <w:sz w:val="18"/>
               </w:rPr>
-              <w:t>Production deployment dpl_HjwgU9aBfaBvdcFH8aiR981mgVDY serves godfin.dev; www redirects to apex; HSTS and Cashfree-only CSP verified; checkout remains disabled.</w:t>
+              <w:t>Production deployment dpl_4oXjaiVBh3k9q9cBff2WY9gCRzyA serves godfin.dev; HSTS/CSP and media ranges verified; production Chromium passed 7/7; public checkout remains disabled.</w:t>
             </w:r>
           </w:p>
         </w:tc>
@@ -9451,7 +9712,7 @@
                 <w:color w:val="172033"/>
                 <w:sz w:val="18"/>
               </w:rPr>
-              <w:t>Run 32827447450 passed on exact SHA 5ee71fa; GitHub API verified oculusrex14/GODFIN is PRIVATE on 25 Aug 2026.</w:t>
+              <w:t>Run 33345967709 passed on exact SHA 493d20a; final documentation CI must pass before the GitHub API is used to return oculusrex14/GODFIN to PRIVATE.</w:t>
             </w:r>
           </w:p>
         </w:tc>

</xml_diff>

<commit_message>
docs(runbook): record beta deployment and email verification
</commit_message>
<xml_diff>
--- a/docs/GODFIN_OWNER_COMPLETION_RUNBOOK.docx
+++ b/docs/GODFIN_OWNER_COMPLETION_RUNBOOK.docx
@@ -64,7 +64,7 @@
           <w:color w:val="667085"/>
           <w:sz w:val="20"/>
         </w:rPr>
-        <w:t>Version 3.3  •  31 August 2026  •  oculusrex14/GODFIN</w:t>
+        <w:t>Version 3.4  •  31 August 2026  •  oculusrex14/GODFIN</w:t>
         <w:br/>
         <w:t>Beta website branch: codex/godfin-beta-website-v1</w:t>
       </w:r>
@@ -222,7 +222,7 @@
           <w:color w:val="172033"/>
           <w:sz w:val="21"/>
         </w:rPr>
-        <w:t>Beta website engineering candidate 493d20a8b0f75602dd7891578494b7e5cfc98760 is pushed on codex/godfin-beta-website-v1. GitHub Actions run 33345967709 completed successfully against that exact commit on 31 August 2026. Its seven green jobs include the complete 1,011-test Python 3.12 backend suite, dependency and full-history secret audits, frontend and website production gates, deterministic Remotion media verification, desktop privacy/update audits, production smoke tests, Chromium/Firefox/WebKit accessibility and website matrices, and a clean 12-migration Supabase database with 146 passing pgTAP assertions. All 182 API operations retain the previously verified response contracts.</w:t>
+        <w:t>Beta website engineering candidate c93c7fcd1f520f017e4f8e6b1241f49eff9fbbcc is pushed on codex/godfin-beta-website-v1. GitHub Actions run 33382231788 completed successfully against that exact commit on 31 August 2026. Its seven green jobs include the complete 1,011-test Python 3.12 backend suite, dependency and full-history secret audits, frontend and website production gates, deterministic Remotion media verification, desktop privacy/update audits, production smoke tests, Chromium/Firefox/WebKit accessibility and website matrices, and a clean 12-migration Supabase database with 146 passing pgTAP assertions. All 182 API operations retain the previously verified response contracts.</w:t>
       </w:r>
     </w:p>
     <w:p>
@@ -294,7 +294,7 @@
         </w:numPr>
       </w:pPr>
       <w:r>
-        <w:t>The beta website is deployed to production as Vercel deployment dpl_4oXjaiVBh3k9q9cBff2WY9gCRzyA. godfin.dev is canonical and godfin.vercel.app remains the fallback. Public /demo and /how-it-works use one deterministic, fictional household; the static demo makes no finance-service requests and never presents upload or bank-connect controls. Public checkout remains closed. The waitlist fails closed until the owner verifies Resend/DNS and supplies RESEND_API_KEY plus RESEND_FROM_EMAIL through Vercel's encrypted environment settings.</w:t>
+        <w:t>The beta website is deployed to production as Vercel deployment dpl_D7W9Gk172WWmM4zyxz7vJhkgK9do. godfin.dev is canonical and godfin.vercel.app remains the fallback. Public /demo and /how-it-works use one deterministic, fictional household; the static demo makes no finance-service requests and never presents upload or bank-connect controls. Public checkout remains closed. The double-opt-in early-tester form is enabled through verified Resend/DNS configuration and stores no desktop financial data.</w:t>
       </w:r>
     </w:p>
     <w:p>
@@ -402,7 +402,7 @@
         </w:numPr>
       </w:pPr>
       <w:r>
-        <w:t>Beta website evidence is current through immutable commit 493d20a8b0f75602dd7891578494b7e5cfc98760 on codex/godfin-beta-website-v1. GitHub Actions run 33345967709 passed all seven jobs on that exact SHA, including all 1,011 backend tests, both three-engine browser matrices, deterministic media checks, and the clean 12-migration Supabase database matrix. Production Chromium acceptance then passed 7/7 on godfin.dev with no Vercel runtime errors. This authorizes the tested beta website content only; it does not authorize an installer, payment acceptance, updater promotion, or public desktop launch.</w:t>
+        <w:t>Beta website evidence is current through immutable commit c93c7fcd1f520f017e4f8e6b1241f49eff9fbbcc on codex/godfin-beta-website-v1. GitHub Actions run 33382231788 passed all seven jobs on that exact SHA, including all 1,011 backend tests, both three-engine browser matrices, deterministic media checks, and the clean 12-migration Supabase database matrix. Production acceptance then passed 24/24 checks across Chromium, Firefox, and WebKit on godfin.dev. This authorizes the tested beta website content only; it does not authorize an installer, payment acceptance, updater promotion, or public desktop launch.</w:t>
       </w:r>
     </w:p>
     <w:p>
@@ -438,7 +438,7 @@
         </w:numPr>
       </w:pPr>
       <w:r>
-        <w:t>Public Gmail consent-screen review, the fresh Gmail recovery/soak, Cashfree KYC/sandbox/live tests, Supabase backup/PITR/restore and Auth leaked-password protection, Resend/DNS, the real second-account Google isolation flow, Apple/Windows certificates, R2, signed-installer and clean-system lifecycle evidence, dependency-license approval, independent parser/full pentesting, native assistive-technology checks, and public-launch authorization are not yet complete. macOS x64/Intel is owner-deferred and must be reopened before any Intel support claim.</w:t>
+        <w:t>Public Gmail consent-screen review, the fresh Gmail recovery/soak, Cashfree credentials plus sandbox/live webhook and refund tests, Supabase backup/PITR/restore and Auth leaked-password protection, the real second-account Google isolation flow, Apple/Windows certificates, R2, signed-installer and clean-system lifecycle evidence, dependency-license approval, independent parser/full pentesting, native assistive-technology checks, operational inbox testing, and public-launch authorization are not yet complete. Cashfree KYC and whitelisting are owner-confirmed complete. macOS x64/Intel is owner-deferred and must be reopened before any Intel support claim.</w:t>
       </w:r>
     </w:p>
     <w:p>
@@ -491,7 +491,7 @@
           <w:color w:val="172033"/>
           <w:sz w:val="21"/>
         </w:rPr>
-        <w:t>Vercel deployment dpl_4oXjaiVBh3k9q9cBff2WY9gCRzyA is Ready on godfin.dev. Public /demo requires no account, uses only static synthetic data, and makes no finance-service requests. Pricing is explicitly planned and public checkout is closed. The waitlist is visibly and safely disabled until Resend email confirmation can work.</w:t>
+        <w:t>Vercel deployment dpl_D7W9Gk172WWmM4zyxz7vJhkgK9do is Ready on godfin.dev. Public /demo requires no account, uses only static synthetic data, and makes no finance-service requests. Pricing is explicitly planned and public checkout is closed. The early-tester form is enabled with double opt-in through the verified godfin.dev Resend sending domain.</w:t>
       </w:r>
     </w:p>
     <w:p>
@@ -515,7 +515,7 @@
         </w:numPr>
       </w:pPr>
       <w:r>
-        <w:t>Production Chromium acceptance passed 7/7: honest beta path, accessible video, reduced-motion fallback, auth-free static demo, narrow viewport, current support/non-goals, lifetime-only planned pricing, no public checkout, and representative accessibility checks.</w:t>
+        <w:t>Production acceptance passed 24/24 across Chromium, Firefox, and WebKit: honest beta path, accessible video, reduced-motion fallback, auth-free static demo, narrow viewport, current support/non-goals, lifetime-only planned pricing, no public checkout, and representative accessibility checks.</w:t>
       </w:r>
     </w:p>
     <w:p>
@@ -587,7 +587,7 @@
         </w:numPr>
       </w:pPr>
       <w:r>
-        <w:t>Required Vercel variables still missing for the public waitlist are RESEND_API_KEY and RESEND_FROM_EMAIL. Cashfree validation also remains off until CASHFREE_CLIENT_ID and CASHFREE_CLIENT_SECRET are supplied and the provider/KYC gates pass. Beta download URLs remain unset until signed installers exist.</w:t>
+        <w:t>Resend is provisioned through the Vercel Marketplace, RESEND_API_KEY is encrypted, RESEND_FROM_EMAIL is GODFIN &lt;hello@godfin.dev&gt;, and the godfin.dev sending domain is verified. A production test completed form submission, confirmation redirect, and welcome-email queueing without exposing the token. Cashfree validation remains off until CASHFREE_CLIENT_ID and CASHFREE_CLIENT_SECRET are supplied and sandbox/live webhook gates pass. Beta download URLs remain unset until signed installers exist.</w:t>
       </w:r>
     </w:p>
     <w:p>
@@ -900,7 +900,7 @@
                 <w:color w:val="172033"/>
                 <w:sz w:val="18"/>
               </w:rPr>
-              <w:t>Run 33345967709 is green on exact beta SHA 493d20a; the repository is public only for the owner-requested CI window.</w:t>
+              <w:t>Run 33382231788 is green on exact beta SHA c93c7fc; the repository is public only for the owner-requested CI window.</w:t>
             </w:r>
           </w:p>
         </w:tc>
@@ -1110,7 +1110,7 @@
                 <w:color w:val="172033"/>
                 <w:sz w:val="18"/>
               </w:rPr>
-              <w:t>Repository integration, all 12 hosted migrations, database state-machine tests, and private beta allowlisting pass; KYC, credentials, webhook, and provider sandbox evidence are absent.</w:t>
+              <w:t>Repository integration, all 12 hosted migrations, database state-machine tests, private beta allowlisting, owner KYC, and provider whitelisting are complete; credentials, webhook, and sandbox/live transaction evidence are absent.</w:t>
             </w:r>
           </w:p>
         </w:tc>
@@ -1135,7 +1135,7 @@
                 <w:color w:val="172033"/>
                 <w:sz w:val="18"/>
               </w:rPr>
-              <w:t>Complete KYC; add CASHFREE_CLIENT_ID and CASHFREE_CLIENT_SECRET through Vercel; configure sandbox webhooks; keep public checkout disabled until the full sandbox matrix passes.</w:t>
+              <w:t>Add CASHFREE_CLIENT_ID and CASHFREE_CLIENT_SECRET through Vercel; configure sandbox webhooks; keep public checkout disabled until the full sandbox and refund matrix passes.</w:t>
             </w:r>
           </w:p>
         </w:tc>
@@ -1190,7 +1190,7 @@
                 <w:color w:val="172033"/>
                 <w:sz w:val="18"/>
               </w:rPr>
-              <w:t>Resend + DNS</w:t>
+              <w:t>Operational email completion</w:t>
             </w:r>
           </w:p>
         </w:tc>
@@ -1215,7 +1215,7 @@
                 <w:color w:val="172033"/>
                 <w:sz w:val="18"/>
               </w:rPr>
-              <w:t>RESEND_API_KEY and RESEND_FROM_EMAIL are absent, so double opt-in cannot be delivered and the production waitlist correctly stays disabled.</w:t>
+              <w:t>Resend domain verification, DKIM/SPF sending records, encrypted Vercel variables, production double opt-in, and welcome-email queueing pass. DMARC policy, inbound hello@godfin.dev reply testing, a second mailbox provider, and ongoing monitoring remain owner operations.</w:t>
             </w:r>
           </w:p>
         </w:tc>
@@ -1240,7 +1240,7 @@
                 <w:color w:val="172033"/>
                 <w:sz w:val="18"/>
               </w:rPr>
-              <w:t>Verify godfin.dev in Resend, configure SPF/DKIM/DMARC, create hello@godfin.dev, then add both variables through encrypted Vercel settings and redeploy.</w:t>
+              <w:t>Send to and reply from hello@godfin.dev, add or verify DMARC, test a second provider, enable Resend account 2FA, and assign the monitored inbox owner.</w:t>
             </w:r>
           </w:p>
         </w:tc>
@@ -1265,7 +1265,7 @@
                 <w:color w:val="172033"/>
                 <w:sz w:val="18"/>
               </w:rPr>
-              <w:t>The waitlist enables, confirmation works once, SPF/DKIM/DMARC pass, and two inbox tests pass.</w:t>
+              <w:t>DMARC and inbox tests pass in two providers, replies work, and the support/privacy/security routing owner is recorded.</w:t>
             </w:r>
           </w:p>
         </w:tc>
@@ -1635,7 +1635,7 @@
                 <w:color w:val="172033"/>
                 <w:sz w:val="18"/>
               </w:rPr>
-              <w:t>Exact-SHA unpacked smoke passes on macOS arm64, Windows x64, and Linux x64; signed installer lifecycle acceptance remains. The owner Mac passed locally, narahari-strix timed out, and the offered Oracle host is arm64 rather than x64.</w:t>
+              <w:t>Exact-SHA unpacked smoke passes on macOS arm64, Windows x64, and Linux x64. Signed installer lifecycle acceptance remains on clean Apple Silicon, Windows x64, and Ubuntu x64 systems; Intel macOS is deferred.</w:t>
             </w:r>
           </w:p>
         </w:tc>
@@ -1660,7 +1660,7 @@
                 <w:color w:val="172033"/>
                 <w:sz w:val="18"/>
               </w:rPr>
-              <w:t>Bring narahari-strix online and provide an Ubuntu 22.04+ x64 host for the final isolated signed-installer checks. Intel macOS is deferred.</w:t>
+              <w:t>After signing credentials, release storage, and private signed builds are ready, run the install, upgrade, rollback, and data-recovery checks on clean systems for the three required platforms.</w:t>
             </w:r>
           </w:p>
         </w:tc>
@@ -2651,6 +2651,34 @@
     <w:p>
       <w:pPr>
         <w:keepLines/>
+        <w:spacing w:before="100" w:after="160" w:line="288" w:lineRule="auto"/>
+        <w:ind w:left="115" w:right="115"/>
+        <w:shd w:fill="FFF4D8"/>
+        <w:pBdr>
+          <w:left w:val="single" w:sz="18" w:space="8" w:color="7A5A00"/>
+        </w:pBdr>
+      </w:pPr>
+      <w:r>
+        <w:rPr>
+          <w:rFonts w:ascii="Calibri" w:hAnsi="Calibri"/>
+          <w:b/>
+          <w:color w:val="7A5A00"/>
+          <w:sz w:val="21"/>
+        </w:rPr>
+        <w:t xml:space="preserve">OWNER-CONFIRMED PROVIDER STATE  </w:t>
+      </w:r>
+      <w:r>
+        <w:rPr>
+          <w:rFonts w:ascii="Calibri" w:hAnsi="Calibri"/>
+          <w:color w:val="172033"/>
+          <w:sz w:val="21"/>
+        </w:rPr>
+        <w:t>Cashfree KYC and merchant whitelisting are complete as confirmed by the owner on 31 August 2026. GODFIN still keeps checkout disabled because CASHFREE_CLIENT_ID and CASHFREE_CLIENT_SECRET are not present in Vercel and the sandbox/live webhook, refund, dispute, invoice, and tax evidence below has not been executed.</w:t>
+      </w:r>
+    </w:p>
+    <w:p>
+      <w:pPr>
+        <w:keepLines/>
         <w:numPr>
           <w:ilvl w:val="0"/>
           <w:numId w:val="10"/>
@@ -2741,7 +2769,7 @@
         </w:numPr>
       </w:pPr>
       <w:r>
-        <w:t>Repository evidence already retained: GitHub Actions run 33345967709 applied all 12 migrations to a clean temporary database and passed all 146 pgTAP assertions on exact beta website candidate 493d20a. Do not replace this with source inspection.</w:t>
+        <w:t>Repository evidence already retained: GitHub Actions run 33382231788 applied all 12 migrations to a clean temporary database and passed all 146 pgTAP assertions on exact beta website candidate c93c7fc. Do not replace this with source inspection.</w:t>
       </w:r>
     </w:p>
     <w:p>
@@ -3980,13 +4008,29 @@
     <w:p>
       <w:pPr>
         <w:keepLines/>
-        <w:numPr>
-          <w:ilvl w:val="0"/>
-          <w:numId w:val="10"/>
-        </w:numPr>
-      </w:pPr>
-      <w:r>
-        <w:t>First make hello@godfin.dev a real receiving mailbox or forwarding address with your chosen email provider. Resend sends application email; it is not the support inbox. Send a message to hello@godfin.dev from an unrelated account and reply from it before continuing.</w:t>
+        <w:spacing w:before="100" w:after="160" w:line="288" w:lineRule="auto"/>
+        <w:ind w:left="115" w:right="115"/>
+        <w:shd w:fill="EAF7EF"/>
+        <w:pBdr>
+          <w:left w:val="single" w:sz="18" w:space="8" w:color="17663A"/>
+        </w:pBdr>
+      </w:pPr>
+      <w:r>
+        <w:rPr>
+          <w:rFonts w:ascii="Calibri" w:hAnsi="Calibri"/>
+          <w:b/>
+          <w:color w:val="17663A"/>
+          <w:sz w:val="21"/>
+        </w:rPr>
+        <w:t xml:space="preserve">CURRENT VERIFIED EMAIL STATE  </w:t>
+      </w:r>
+      <w:r>
+        <w:rPr>
+          <w:rFonts w:ascii="Calibri" w:hAnsi="Calibri"/>
+          <w:color w:val="172033"/>
+          <w:sz w:val="21"/>
+        </w:rPr>
+        <w:t>Vercel Marketplace resource resend-email-citron-mountain is active. Resend domain godfin.dev is Verified; its DKIM and SPF sending records resolve publicly; Hostinger retained automatic DNS snapshot 176973183; and Vercel stores RESEND_API_KEY plus RESEND_FROM_EMAIL=GODFIN &lt;hello@godfin.dev&gt; as encrypted variables. Production form submission, single-use confirmation redirect, and welcome-email queueing pass. No secret or confirmation token is reproduced here.</w:t>
       </w:r>
     </w:p>
     <w:p>
@@ -3998,7 +4042,7 @@
         </w:numPr>
       </w:pPr>
       <w:r>
-        <w:t>Create the Resend account under the business owner, enable two-factor authentication, and add godfin.dev as the sending domain.</w:t>
+        <w:t>Confirm hello@godfin.dev is a real receiving mailbox or forwarding address. Resend sends application email; it is not the support inbox. Send a message to hello@godfin.dev from an unrelated account and reply from it before continuing.</w:t>
       </w:r>
     </w:p>
     <w:p>
@@ -4010,7 +4054,7 @@
         </w:numPr>
       </w:pPr>
       <w:r>
-        <w:t>In the authoritative DNS provider, add exactly the SPF and DKIM records supplied by Resend. Do not invent or duplicate SPF records.</w:t>
+        <w:t>Confirm the Resend account remains under the business owner and enable two-factor authentication if it is not already active.</w:t>
       </w:r>
     </w:p>
     <w:p>
@@ -4022,7 +4066,7 @@
         </w:numPr>
       </w:pPr>
       <w:r>
-        <w:t>Add a DMARC record. Start with monitoring if necessary, review reports, then tighten with counsel/operations guidance.</w:t>
+        <w:t>Preserve the verified SPF and DKIM records. Do not invent a second SPF policy or replace the existing Hostinger mailbox MX records.</w:t>
       </w:r>
     </w:p>
     <w:p>
@@ -4034,7 +4078,7 @@
         </w:numPr>
       </w:pPr>
       <w:r>
-        <w:t>Create and monitor hello@godfin.dev as the single general-purpose address for license delivery, customer support, privacy/legal requests, and security reports. Use inbox labels or filters so each request type remains easy to track.</w:t>
+        <w:t>Add a DMARC record. Start with monitoring if necessary, review reports, then tighten with counsel/operations guidance.</w:t>
       </w:r>
     </w:p>
     <w:p>
@@ -4046,7 +4090,7 @@
         </w:numPr>
       </w:pPr>
       <w:r>
-        <w:t>Create a least-privilege production Resend API key. Store it directly as RESEND_API_KEY in Vercel Production and Preview; set RESEND_FROM_EMAIL to GODFIN &lt;hello@godfin.dev&gt;, NEXT_PUBLIC_SUPPORT_EMAIL to hello@godfin.dev, and NEXT_PUBLIC_PRIVACY_EMAIL to hello@godfin.dev.</w:t>
+        <w:t>Create and monitor hello@godfin.dev as the single general-purpose address for license delivery, customer support, privacy/legal requests, and security reports. Use inbox labels or filters so each request type remains easy to track.</w:t>
       </w:r>
     </w:p>
     <w:p>
@@ -4058,7 +4102,19 @@
         </w:numPr>
       </w:pPr>
       <w:r>
-        <w:t>Redeploy. Submit the waitlist form, receive the confirmation email, confirm once, and verify a repeated confirmation does not duplicate the record.</w:t>
+        <w:t>Keep the least-privilege production Resend key only in the Vercel Marketplace integration. Keep RESEND_FROM_EMAIL as GODFIN &lt;hello@godfin.dev&gt;, NEXT_PUBLIC_SUPPORT_EMAIL as hello@godfin.dev, and NEXT_PUBLIC_PRIVACY_EMAIL as hello@godfin.dev; never export or print the key.</w:t>
+      </w:r>
+    </w:p>
+    <w:p>
+      <w:pPr>
+        <w:keepLines/>
+        <w:numPr>
+          <w:ilvl w:val="0"/>
+          <w:numId w:val="10"/>
+        </w:numPr>
+      </w:pPr>
+      <w:r>
+        <w:t>Repeat the production waitlist test after any email or database change. Confirm once and verify a repeated confirmation does not duplicate the record.</w:t>
       </w:r>
     </w:p>
     <w:p>
@@ -4239,7 +4295,7 @@
           <w:color w:val="172033"/>
           <w:sz w:val="21"/>
         </w:rPr>
-        <w:t>On 31 August 2026, tested preview dpl_H5Zxbiw6ar7naiioG6HfCtrUDQ6p was promoted as production deployment dpl_4oXjaiVBh3k9q9cBff2WY9gCRzyA. https://godfin.dev and https://godfin.vercel.app return HTTP 200; https://www.godfin.dev uses the production alias; HSTS and the Cashfree-only CSP are present; all seven public Chromium acceptance tests pass; media byte ranges return 206; and no runtime errors were reported. Public checkout is closed and the waitlist is disabled until Resend is configured.</w:t>
+        <w:t>On 31 August 2026, exact candidate c93c7fc was deployed as production deployment dpl_D7W9Gk172WWmM4zyxz7vJhkgK9do. https://godfin.dev and https://godfin.vercel.app return HTTP 200; https://www.godfin.dev uses the production alias; HSTS and the Cashfree-only CSP are present; 24/24 public checks pass across Chromium, Firefox, and WebKit; media byte ranges return 206; and no runtime errors were reported. Public checkout is closed and the double-opt-in early-tester form is enabled.</w:t>
       </w:r>
     </w:p>
     <w:p>
@@ -4299,7 +4355,7 @@
         </w:numPr>
       </w:pPr>
       <w:r>
-        <w:t>Open Terminal and run: cd /Users/oculus/Projects/GODFIN/GODFIN_PRODUCTION/website. Then run: vercel whoami. If it asks you to sign in, run vercel login, complete the browser approval yourself, and return to Terminal.</w:t>
+        <w:t>Open Terminal and run: cd /Users/oculus/Projects/GODFIN/.codex-godfin-v6/website. Then run: vercel whoami. If it asks you to sign in, run vercel login, complete the browser approval yourself, and return to Terminal.</w:t>
       </w:r>
     </w:p>
     <w:p>
@@ -4323,7 +4379,7 @@
         </w:numPr>
       </w:pPr>
       <w:r>
-        <w:t>Run: vercel env ls. The public domain/email variables, Supabase variables, abuse secret, license-signing and entitlement keys, CASHFREE_ENVIRONMENT=sandbox, CHECKOUT_ENABLED=false, PPP_CHECKOUT_ENABLED=false, and CASHFREE_GLOBAL_PAYMENTS_APPROVED=false are already present. Add the still-missing CASHFREE_CLIENT_ID, CASHFREE_CLIENT_SECRET, RESEND_API_KEY, and RESEND_FROM_EMAIL only through Vercel's encrypted environment UI or prompt; never print or commit their values. Add beta download URLs only after signed installers exist.</w:t>
+        <w:t>Run: vercel env ls. The public domain/email variables, Supabase variables, Resend integration variables, abuse secret, license-signing and entitlement keys, CASHFREE_ENVIRONMENT=sandbox, CHECKOUT_ENABLED=false, PPP_CHECKOUT_ENABLED=false, and CASHFREE_GLOBAL_PAYMENTS_APPROVED=false are already present. Add the still-missing CASHFREE_CLIENT_ID and CASHFREE_CLIENT_SECRET only through Vercel's encrypted environment UI or prompt; never print or commit their values. Add beta download URLs only after signed installers exist.</w:t>
       </w:r>
     </w:p>
     <w:p>
@@ -4335,7 +4391,7 @@
         </w:numPr>
       </w:pPr>
       <w:r>
-        <w:t>Production deployment dpl_4oXjaiVBh3k9q9cBff2WY9gCRzyA is intentionally fail-closed for public checkout and unconfirmed email collection. After any provider-variable change, keep CHECKOUT_ENABLED=false, deploy a preview from the exact candidate, and retest account sign-in, pricing, disabled checkout behavior, waitlist confirmation, privacy, terms, and license verification.</w:t>
+        <w:t>Production deployment dpl_D7W9Gk172WWmM4zyxz7vJhkgK9do is intentionally fail-closed for public checkout. After any provider-variable change, keep CHECKOUT_ENABLED=false, deploy a preview from the exact candidate, and retest account sign-in, pricing, disabled checkout behavior, waitlist confirmation, privacy, terms, and license verification.</w:t>
       </w:r>
     </w:p>
     <w:p>
@@ -7243,7 +7299,7 @@
         </w:numPr>
       </w:pPr>
       <w:r>
-        <w:t>Backend: all 1,011 tests passed in GitHub Actions run 33345967709 under clean Python 3.12 on exact beta website candidate 493d20a, including auth/PIN, encryption, migrations, backups, merchant upsert, licenses, local trust, Gmail coverage/restart handling, startup dependency boundaries, exact response contracts for all 182 API operations, certified statement parsers, hostile-file preflight, goal/simulation/recurring behavior, CA tax pack, classification memory, performance, net worth, behavior insights, reward-pilot redaction, and UTC finance-fetch regressions.</w:t>
+        <w:t>Backend: all 1,011 tests passed in GitHub Actions run 33382231788 under clean Python 3.12 on exact beta website candidate c93c7fc, including auth/PIN, encryption, migrations, backups, merchant upsert, licenses, local trust, Gmail coverage/restart handling, startup dependency boundaries, exact response contracts for all 182 API operations, certified statement parsers, hostile-file preflight, goal/simulation/recurring behavior, CA tax pack, classification memory, performance, net worth, behavior insights, reward-pilot redaction, and UTC finance-fetch regressions.</w:t>
       </w:r>
     </w:p>
     <w:p>
@@ -7279,7 +7335,7 @@
         </w:numPr>
       </w:pPr>
       <w:r>
-        <w:t>Frontend: lint, static accessibility/contrast, memory-only authentication, build-identity, secure-password, tier-navigation, and production-build gates pass. The deterministic inventory records 422 controls across 19 route scopes. GitHub Actions run 33345967709 also passed the production smoke and accessibility suites in Chromium, Firefox, and WebKit, including focus restoration during idle upload progress ticks; native screen-reader and signed-package interaction remain separate gates.</w:t>
+        <w:t>Frontend: lint, static accessibility/contrast, memory-only authentication, build-identity, secure-password, tier-navigation, and production-build gates pass. The deterministic inventory records 422 controls across 19 route scopes. GitHub Actions run 33382231788 also passed the production smoke and accessibility suites in Chromium, Firefox, and WebKit, including focus restoration during idle upload progress ticks; native screen-reader and signed-package interaction remain separate gates.</w:t>
       </w:r>
     </w:p>
     <w:p>
@@ -7291,7 +7347,7 @@
         </w:numPr>
       </w:pPr>
       <w:r>
-        <w:t>Website: beta access, invitation identity binding, private INR 1 allowlisting, entitlement/payment contracts, Cashfree signature/idempotency, 12 ordered migration hashes, deterministic Remotion rendering and media verification, production build, auth-free static demo, reduced-motion fallbacks, planned lifetime/no-bundled-credit pricing, security headers, no public checkout, and dependency audit pass. A clean Supabase stack passes all 146 pgTAP assertions. CI website acceptance passed 21/21 across Chromium, Firefox, and WebKit; production Chromium passed 7/7 on godfin.dev. Repeat Lighthouse after Resend configuration without weakening the fail-closed waitlist.</w:t>
+        <w:t>Website: beta access, invitation identity binding, private INR 1 allowlisting, entitlement/payment contracts, Cashfree signature/idempotency, 12 ordered migration hashes, deterministic Remotion rendering and media verification, production build, auth-free static demo, reduced-motion fallbacks, planned lifetime/no-bundled-credit pricing, security headers, no public checkout, double-opt-in waitlist, and dependency audit pass. A clean Supabase stack passes all 146 pgTAP assertions. Production acceptance passed 24/24 across Chromium, Firefox, and WebKit on godfin.dev. A controlled signup returned HTTP 200, its single-use confirmation returned HTTP 307 to /waitlist/confirmed, and both confirmation and welcome messages entered Resend's delivery queue.</w:t>
       </w:r>
     </w:p>
     <w:p>
@@ -7415,7 +7471,7 @@
           <w:color w:val="172033"/>
           <w:sz w:val="21"/>
         </w:rPr>
-        <w:t>Beta website candidate 493d20a passed all seven jobs in GitHub Actions run 33345967709, including the full backend suite, supply-chain and full-history secret checks, desktop audits, deterministic media checks, website/browser matrices, Chromium/Firefox/WebKit app accessibility, and the clean 12-migration Supabase database matrix. Return the repository to PRIVATE after the final documentation-only CI run. Any later application, workflow, lockfile, generated-asset, or verification-contract change requires a new exact-SHA green run before tagging; source CI does not replace signed-package, provider, legal, or launch authorization gates.</w:t>
+        <w:t>Beta website candidate c93c7fc passed all seven jobs in GitHub Actions run 33382231788, including the full backend suite, supply-chain and full-history secret checks, desktop audits, deterministic media checks, website/browser matrices, Chromium/Firefox/WebKit app accessibility, and the clean 12-migration Supabase database matrix. Return the repository to PRIVATE after the final documentation-only CI run. Any later application, workflow, lockfile, generated-asset, or verification-contract change requires a new exact-SHA green run before tagging; source CI does not replace signed-package, provider, legal, or launch authorization gates.</w:t>
       </w:r>
     </w:p>
     <w:p>
@@ -7435,7 +7491,7 @@
         </w:numPr>
       </w:pPr>
       <w:r>
-        <w:t>Retain https://github.com/oculusrex14/GODFIN/actions/runs/33345967709 as exact-source evidence for commit 493d20a8b0f75602dd7891578494b7e5cfc98760. All seven jobs completed successfully on 31 August 2026.</w:t>
+        <w:t>Retain https://github.com/oculusrex14/GODFIN/actions/runs/33382231788 as exact-source evidence for commit c93c7fcd1f520f017e4f8e6b1241f49eff9fbbcc. All seven jobs completed successfully on 31 August 2026.</w:t>
       </w:r>
     </w:p>
     <w:p>
@@ -8729,6 +8785,7 @@
                 <w:color w:val="172033"/>
                 <w:sz w:val="18"/>
               </w:rPr>
+              <w:t>Owner</w:t>
             </w:r>
           </w:p>
         </w:tc>
@@ -8778,6 +8835,7 @@
                 <w:color w:val="172033"/>
                 <w:sz w:val="18"/>
               </w:rPr>
+              <w:t>KYC and whitelisting are owner-confirmed. Add credentials privately, then retain sandbox/live webhook, refund, dispute, invoice, and tax evidence.</w:t>
             </w:r>
           </w:p>
         </w:tc>
@@ -8832,6 +8890,7 @@
                 <w:color w:val="172033"/>
                 <w:sz w:val="18"/>
               </w:rPr>
+              <w:t>Owner</w:t>
             </w:r>
           </w:p>
         </w:tc>
@@ -8881,6 +8940,7 @@
                 <w:color w:val="172033"/>
                 <w:sz w:val="18"/>
               </w:rPr>
+              <w:t>Resend domain, DKIM/SPF, encrypted Vercel variables, production double opt-in, and welcome-email queueing pass. DMARC, inbound reply, second-provider delivery, inbox monitoring, and support ownership remain.</w:t>
             </w:r>
           </w:p>
         </w:tc>
@@ -8985,7 +9045,7 @@
                 <w:color w:val="172033"/>
                 <w:sz w:val="18"/>
               </w:rPr>
-              <w:t>Production deployment dpl_4oXjaiVBh3k9q9cBff2WY9gCRzyA serves godfin.dev; HSTS/CSP and media ranges verified; production Chromium passed 7/7; public checkout remains disabled.</w:t>
+              <w:t>Production deployment dpl_D7W9Gk172WWmM4zyxz7vJhkgK9do serves godfin.dev; HSTS/CSP and media ranges verified; production Playwright passed 24/24 across Chromium, Firefox, and WebKit; public checkout remains disabled.</w:t>
             </w:r>
           </w:p>
         </w:tc>
@@ -9687,7 +9747,7 @@
                 <w:color w:val="172033"/>
                 <w:sz w:val="18"/>
               </w:rPr>
-              <w:t>☒</w:t>
+              <w:t>☐</w:t>
             </w:r>
           </w:p>
         </w:tc>
@@ -9712,7 +9772,7 @@
                 <w:color w:val="172033"/>
                 <w:sz w:val="18"/>
               </w:rPr>
-              <w:t>Run 33345967709 passed on exact SHA 493d20a; final documentation CI must pass before the GitHub API is used to return oculusrex14/GODFIN to PRIVATE.</w:t>
+              <w:t>Run 33382231788 passed on exact SHA c93c7fc; final documentation CI must pass before the GitHub API is used to return oculusrex14/GODFIN to PRIVATE.</w:t>
             </w:r>
           </w:p>
         </w:tc>

</xml_diff>